<commit_message>
Desktop: modern look and dashboard breakdown
A backdrop with depth instead of a flat colour, the menu floating and
folding to icons, see-through cards, rain on glass behind the Dark theme's
menu (ui/backdrop.py, theme.build_modern_stylesheet). The dashboard's
figures show a breakdown; the database figure is for the SuperAdmin only.
Status pills readable in the Light theme.

Co-Authored-By: Claude Opus 5.5 <noreply@anthropic.com>
</commit_message>
<xml_diff>
--- a/documentation/00 Documentation Index.docx
+++ b/documentation/00 Documentation Index.docx
@@ -80,7 +80,7 @@
           <w:left w:w="10" w:type="dxa"/>
           <w:right w:w="10" w:type="dxa"/>
         </w:tblCellMar>
-        <w:tblLook w:val="04A0" w:firstRow="1" w:lastRow="0" w:firstColumn="1" w:lastColumn="0" w:noHBand="0" w:noVBand="1"/>
+        <w:tblLook w:val="0000" w:firstRow="0" w:lastRow="0" w:firstColumn="0" w:lastColumn="0" w:noHBand="0" w:noVBand="0"/>
       </w:tblPr>
       <w:tblGrid>
         <w:gridCol w:w="2600"/>
@@ -461,7 +461,7 @@
           <w:left w:w="10" w:type="dxa"/>
           <w:right w:w="10" w:type="dxa"/>
         </w:tblCellMar>
-        <w:tblLook w:val="04A0" w:firstRow="1" w:lastRow="0" w:firstColumn="1" w:lastColumn="0" w:noHBand="0" w:noVBand="1"/>
+        <w:tblLook w:val="0000" w:firstRow="0" w:lastRow="0" w:firstColumn="0" w:lastColumn="0" w:noHBand="0" w:noVBand="0"/>
       </w:tblPr>
       <w:tblGrid>
         <w:gridCol w:w="1300"/>
@@ -1499,7 +1499,7 @@
     <w:sdt>
       <w:sdtPr>
         <w:alias w:val="Contents"/>
-        <w:id w:val="1664748407"/>
+        <w:id w:val="1373878974"/>
       </w:sdtPr>
       <w:sdtEndPr/>
       <w:sdtContent>
@@ -1526,7 +1526,7 @@
           <w:r>
             <w:fldChar w:fldCharType="separate"/>
           </w:r>
-          <w:hyperlink w:anchor="_Toc243418292" w:history="1">
+          <w:hyperlink w:anchor="_Toc243478970" w:history="1">
             <w:r>
               <w:rPr>
                 <w:rStyle w:val="Hyperlink"/>
@@ -1550,7 +1550,7 @@
               <w:rPr>
                 <w:noProof/>
               </w:rPr>
-              <w:instrText xml:space="preserve"> PAGEREF _Toc243418292 \h </w:instrText>
+              <w:instrText xml:space="preserve"> PAGEREF _Toc243478970 \h </w:instrText>
             </w:r>
             <w:r>
               <w:rPr>
@@ -1591,7 +1591,7 @@
               <w:szCs w:val="22"/>
             </w:rPr>
           </w:pPr>
-          <w:hyperlink w:anchor="_Toc243418293" w:history="1">
+          <w:hyperlink w:anchor="_Toc243478971" w:history="1">
             <w:r>
               <w:rPr>
                 <w:rStyle w:val="Hyperlink"/>
@@ -1615,7 +1615,7 @@
               <w:rPr>
                 <w:noProof/>
               </w:rPr>
-              <w:instrText xml:space="preserve"> PAGEREF _Toc243418293 \h </w:instrText>
+              <w:instrText xml:space="preserve"> PAGEREF _Toc243478971 \h </w:instrText>
             </w:r>
             <w:r>
               <w:rPr>
@@ -1656,7 +1656,7 @@
               <w:szCs w:val="22"/>
             </w:rPr>
           </w:pPr>
-          <w:hyperlink w:anchor="_Toc243418294" w:history="1">
+          <w:hyperlink w:anchor="_Toc243478972" w:history="1">
             <w:r>
               <w:rPr>
                 <w:rStyle w:val="Hyperlink"/>
@@ -1680,7 +1680,7 @@
               <w:rPr>
                 <w:noProof/>
               </w:rPr>
-              <w:instrText xml:space="preserve"> PAGEREF _Toc243418294 \h </w:instrText>
+              <w:instrText xml:space="preserve"> PAGEREF _Toc243478972 \h </w:instrText>
             </w:r>
             <w:r>
               <w:rPr>
@@ -1721,7 +1721,7 @@
               <w:szCs w:val="22"/>
             </w:rPr>
           </w:pPr>
-          <w:hyperlink w:anchor="_Toc243418295" w:history="1">
+          <w:hyperlink w:anchor="_Toc243478973" w:history="1">
             <w:r>
               <w:rPr>
                 <w:rStyle w:val="Hyperlink"/>
@@ -1745,7 +1745,7 @@
               <w:rPr>
                 <w:noProof/>
               </w:rPr>
-              <w:instrText xml:space="preserve"> PAGEREF _Toc243418295 \h </w:instrText>
+              <w:instrText xml:space="preserve"> PAGEREF _Toc243478973 \h </w:instrText>
             </w:r>
             <w:r>
               <w:rPr>
@@ -1788,7 +1788,7 @@
       <w:pPr>
         <w:pStyle w:val="Heading1"/>
       </w:pPr>
-      <w:bookmarkStart w:id="1" w:name="_Toc243418292"/>
+      <w:bookmarkStart w:id="1" w:name="_Toc243478970"/>
       <w:r>
         <w:lastRenderedPageBreak/>
         <w:t>1  About this documentation</w:t>
@@ -1826,7 +1826,7 @@
       <w:pPr>
         <w:pStyle w:val="Heading1"/>
       </w:pPr>
-      <w:bookmarkStart w:id="2" w:name="_Toc243418293"/>
+      <w:bookmarkStart w:id="2" w:name="_Toc243478971"/>
       <w:r>
         <w:lastRenderedPageBreak/>
         <w:t>2  Where to start</w:t>
@@ -1849,7 +1849,7 @@
           <w:left w:w="10" w:type="dxa"/>
           <w:right w:w="10" w:type="dxa"/>
         </w:tblCellMar>
-        <w:tblLook w:val="04A0" w:firstRow="1" w:lastRow="0" w:firstColumn="1" w:lastColumn="0" w:noHBand="0" w:noVBand="1"/>
+        <w:tblLook w:val="0000" w:firstRow="0" w:lastRow="0" w:firstColumn="0" w:lastColumn="0" w:noHBand="0" w:noVBand="0"/>
       </w:tblPr>
       <w:tblGrid>
         <w:gridCol w:w="3125"/>
@@ -2296,7 +2296,7 @@
       <w:pPr>
         <w:pStyle w:val="Heading1"/>
       </w:pPr>
-      <w:bookmarkStart w:id="3" w:name="_Toc243418294"/>
+      <w:bookmarkStart w:id="3" w:name="_Toc243478972"/>
       <w:r>
         <w:lastRenderedPageBreak/>
         <w:t>3  The documents</w:t>
@@ -2319,7 +2319,7 @@
           <w:left w:w="10" w:type="dxa"/>
           <w:right w:w="10" w:type="dxa"/>
         </w:tblCellMar>
-        <w:tblLook w:val="04A0" w:firstRow="1" w:lastRow="0" w:firstColumn="1" w:lastColumn="0" w:noHBand="0" w:noVBand="1"/>
+        <w:tblLook w:val="0000" w:firstRow="0" w:lastRow="0" w:firstColumn="0" w:lastColumn="0" w:noHBand="0" w:noVBand="0"/>
       </w:tblPr>
       <w:tblGrid>
         <w:gridCol w:w="2289"/>
@@ -4352,7 +4352,7 @@
       <w:pPr>
         <w:pStyle w:val="Heading1"/>
       </w:pPr>
-      <w:bookmarkStart w:id="4" w:name="_Toc243418295"/>
+      <w:bookmarkStart w:id="4" w:name="_Toc243478973"/>
       <w:r>
         <w:lastRenderedPageBreak/>
         <w:t>4  Conventions used</w:t>
@@ -4732,10 +4732,10 @@
 <file path=word/numbering.xml><?xml version="1.0" encoding="utf-8"?>
 <w:numbering xmlns:wpc="http://schemas.microsoft.com/office/word/2010/wordprocessingCanvas" xmlns:cx="http://schemas.microsoft.com/office/drawing/2014/chartex" xmlns:cx1="http://schemas.microsoft.com/office/drawing/2015/9/8/chartex" xmlns:mc="http://schemas.openxmlformats.org/markup-compatibility/2006" xmlns:o="urn:schemas-microsoft-com:office:office" xmlns:r="http://schemas.openxmlformats.org/officeDocument/2006/relationships" xmlns:m="http://schemas.openxmlformats.org/officeDocument/2006/math" xmlns:v="urn:schemas-microsoft-com:vml" xmlns:wp14="http://schemas.microsoft.com/office/word/2010/wordprocessingDrawing" xmlns:wp="http://schemas.openxmlformats.org/drawingml/2006/wordprocessingDrawing" xmlns:w10="urn:schemas-microsoft-com:office:word" xmlns:w="http://schemas.openxmlformats.org/wordprocessingml/2006/main" xmlns:w14="http://schemas.microsoft.com/office/word/2010/wordml" xmlns:w15="http://schemas.microsoft.com/office/word/2012/wordml" xmlns:w16se="http://schemas.microsoft.com/office/word/2015/wordml/symex" xmlns:wpg="http://schemas.microsoft.com/office/word/2010/wordprocessingGroup" xmlns:wpi="http://schemas.microsoft.com/office/word/2010/wordprocessingInk" xmlns:wne="http://schemas.microsoft.com/office/word/2006/wordml" xmlns:wps="http://schemas.microsoft.com/office/word/2010/wordprocessingShape" mc:Ignorable="w14 w15 w16se wp14">
   <w:abstractNum w:abstractNumId="0" w15:restartNumberingAfterBreak="0">
-    <w:nsid w:val="05B9471E"/>
+    <w:nsid w:val="6180276C"/>
     <w:multiLevelType w:val="hybridMultilevel"/>
-    <w:tmpl w:val="31FABAAC"/>
-    <w:lvl w:ilvl="0" w:tplc="0728C768">
+    <w:tmpl w:val="26F85E6A"/>
+    <w:lvl w:ilvl="0" w:tplc="6D46A088">
       <w:start w:val="1"/>
       <w:numFmt w:val="bullet"/>
       <w:lvlText w:val="•"/>
@@ -4744,7 +4744,7 @@
         <w:ind w:left="540" w:hanging="300"/>
       </w:pPr>
     </w:lvl>
-    <w:lvl w:ilvl="1" w:tplc="65B06B74" w:tentative="1">
+    <w:lvl w:ilvl="1" w:tplc="F8F44760" w:tentative="1">
       <w:start w:val="1"/>
       <w:numFmt w:val="bullet"/>
       <w:lvlText w:val="–"/>
@@ -4753,7 +4753,7 @@
         <w:ind w:left="940" w:hanging="300"/>
       </w:pPr>
     </w:lvl>
-    <w:lvl w:ilvl="2" w:tplc="DB445596" w:tentative="1">
+    <w:lvl w:ilvl="2" w:tplc="A4E67CE2" w:tentative="1">
       <w:start w:val="1"/>
       <w:numFmt w:val="bullet"/>
       <w:lvlText w:val="◦"/>
@@ -4762,42 +4762,42 @@
         <w:ind w:left="1340" w:hanging="300"/>
       </w:pPr>
     </w:lvl>
-    <w:lvl w:ilvl="3" w:tplc="D7CA22FC">
+    <w:lvl w:ilvl="3" w:tplc="80D044F0">
       <w:numFmt w:val="decimal"/>
       <w:lvlText w:val=""/>
       <w:lvlJc w:val="left"/>
     </w:lvl>
-    <w:lvl w:ilvl="4" w:tplc="71207094">
+    <w:lvl w:ilvl="4" w:tplc="0576FEF8">
       <w:numFmt w:val="decimal"/>
       <w:lvlText w:val=""/>
       <w:lvlJc w:val="left"/>
     </w:lvl>
-    <w:lvl w:ilvl="5" w:tplc="4BF8BCB0">
+    <w:lvl w:ilvl="5" w:tplc="FB86CF8C">
       <w:numFmt w:val="decimal"/>
       <w:lvlText w:val=""/>
       <w:lvlJc w:val="left"/>
     </w:lvl>
-    <w:lvl w:ilvl="6" w:tplc="217CE900">
+    <w:lvl w:ilvl="6" w:tplc="E690B45C">
       <w:numFmt w:val="decimal"/>
       <w:lvlText w:val=""/>
       <w:lvlJc w:val="left"/>
     </w:lvl>
-    <w:lvl w:ilvl="7" w:tplc="2CDEA3DE">
+    <w:lvl w:ilvl="7" w:tplc="B66E2718">
       <w:numFmt w:val="decimal"/>
       <w:lvlText w:val=""/>
       <w:lvlJc w:val="left"/>
     </w:lvl>
-    <w:lvl w:ilvl="8" w:tplc="04B27374">
+    <w:lvl w:ilvl="8" w:tplc="3E4E9B30">
       <w:numFmt w:val="decimal"/>
       <w:lvlText w:val=""/>
       <w:lvlJc w:val="left"/>
     </w:lvl>
   </w:abstractNum>
   <w:abstractNum w:abstractNumId="1" w15:restartNumberingAfterBreak="0">
-    <w:nsid w:val="207D10A8"/>
+    <w:nsid w:val="75591926"/>
     <w:multiLevelType w:val="hybridMultilevel"/>
-    <w:tmpl w:val="53963112"/>
-    <w:lvl w:ilvl="0" w:tplc="FD880A4E" w:tentative="1">
+    <w:tmpl w:val="16D68650"/>
+    <w:lvl w:ilvl="0" w:tplc="0D140830" w:tentative="1">
       <w:start w:val="1"/>
       <w:numFmt w:val="bullet"/>
       <w:lvlText w:val="●"/>
@@ -4806,7 +4806,7 @@
         <w:ind w:left="720" w:hanging="360"/>
       </w:pPr>
     </w:lvl>
-    <w:lvl w:ilvl="1" w:tplc="BA9EAF50" w:tentative="1">
+    <w:lvl w:ilvl="1" w:tplc="995CDA88" w:tentative="1">
       <w:start w:val="1"/>
       <w:numFmt w:val="bullet"/>
       <w:lvlText w:val="○"/>
@@ -4815,7 +4815,7 @@
         <w:ind w:left="1440" w:hanging="360"/>
       </w:pPr>
     </w:lvl>
-    <w:lvl w:ilvl="2" w:tplc="FF445D44" w:tentative="1">
+    <w:lvl w:ilvl="2" w:tplc="44E2E0A0" w:tentative="1">
       <w:start w:val="1"/>
       <w:numFmt w:val="bullet"/>
       <w:lvlText w:val="■"/>
@@ -4824,7 +4824,7 @@
         <w:ind w:left="2160" w:hanging="360"/>
       </w:pPr>
     </w:lvl>
-    <w:lvl w:ilvl="3" w:tplc="6466F942" w:tentative="1">
+    <w:lvl w:ilvl="3" w:tplc="FB4AEE84" w:tentative="1">
       <w:start w:val="1"/>
       <w:numFmt w:val="bullet"/>
       <w:lvlText w:val="●"/>
@@ -4833,7 +4833,7 @@
         <w:ind w:left="2880" w:hanging="360"/>
       </w:pPr>
     </w:lvl>
-    <w:lvl w:ilvl="4" w:tplc="F70ACE52" w:tentative="1">
+    <w:lvl w:ilvl="4" w:tplc="DD442EC4" w:tentative="1">
       <w:start w:val="1"/>
       <w:numFmt w:val="bullet"/>
       <w:lvlText w:val="○"/>
@@ -4842,7 +4842,7 @@
         <w:ind w:left="3600" w:hanging="360"/>
       </w:pPr>
     </w:lvl>
-    <w:lvl w:ilvl="5" w:tplc="C43602DE" w:tentative="1">
+    <w:lvl w:ilvl="5" w:tplc="870070B0" w:tentative="1">
       <w:start w:val="1"/>
       <w:numFmt w:val="bullet"/>
       <w:lvlText w:val="■"/>
@@ -4851,7 +4851,7 @@
         <w:ind w:left="4320" w:hanging="360"/>
       </w:pPr>
     </w:lvl>
-    <w:lvl w:ilvl="6" w:tplc="68BC9504" w:tentative="1">
+    <w:lvl w:ilvl="6" w:tplc="A306A852" w:tentative="1">
       <w:start w:val="1"/>
       <w:numFmt w:val="bullet"/>
       <w:lvlText w:val="●"/>
@@ -4860,7 +4860,7 @@
         <w:ind w:left="5040" w:hanging="360"/>
       </w:pPr>
     </w:lvl>
-    <w:lvl w:ilvl="7" w:tplc="38CAF9D0" w:tentative="1">
+    <w:lvl w:ilvl="7" w:tplc="06BE10EC" w:tentative="1">
       <w:start w:val="1"/>
       <w:numFmt w:val="bullet"/>
       <w:lvlText w:val="●"/>
@@ -4869,7 +4869,7 @@
         <w:ind w:left="5760" w:hanging="360"/>
       </w:pPr>
     </w:lvl>
-    <w:lvl w:ilvl="8" w:tplc="5DB8EF46" w:tentative="1">
+    <w:lvl w:ilvl="8" w:tplc="AD9CA7B8" w:tentative="1">
       <w:start w:val="1"/>
       <w:numFmt w:val="bullet"/>
       <w:lvlText w:val="●"/>
@@ -4880,10 +4880,10 @@
     </w:lvl>
   </w:abstractNum>
   <w:abstractNum w:abstractNumId="2" w15:restartNumberingAfterBreak="0">
-    <w:nsid w:val="5411561F"/>
+    <w:nsid w:val="77817251"/>
     <w:multiLevelType w:val="hybridMultilevel"/>
-    <w:tmpl w:val="3EB86986"/>
-    <w:lvl w:ilvl="0" w:tplc="9D647E9C" w:tentative="1">
+    <w:tmpl w:val="96780C3C"/>
+    <w:lvl w:ilvl="0" w:tplc="997EF83E" w:tentative="1">
       <w:start w:val="1"/>
       <w:numFmt w:val="decimal"/>
       <w:lvlText w:val="%1."/>
@@ -4892,7 +4892,7 @@
         <w:ind w:left="540" w:hanging="300"/>
       </w:pPr>
     </w:lvl>
-    <w:lvl w:ilvl="1" w:tplc="A8CACBE8" w:tentative="1">
+    <w:lvl w:ilvl="1" w:tplc="E6E2E934" w:tentative="1">
       <w:start w:val="1"/>
       <w:numFmt w:val="lowerLetter"/>
       <w:lvlText w:val="%2."/>
@@ -4901,7 +4901,7 @@
         <w:ind w:left="940" w:hanging="300"/>
       </w:pPr>
     </w:lvl>
-    <w:lvl w:ilvl="2" w:tplc="09E02F0A" w:tentative="1">
+    <w:lvl w:ilvl="2" w:tplc="FA08A4A8" w:tentative="1">
       <w:start w:val="1"/>
       <w:numFmt w:val="lowerRoman"/>
       <w:lvlText w:val="%3."/>
@@ -4910,32 +4910,32 @@
         <w:ind w:left="1340" w:hanging="300"/>
       </w:pPr>
     </w:lvl>
-    <w:lvl w:ilvl="3" w:tplc="FB069C14">
+    <w:lvl w:ilvl="3" w:tplc="2D36BAD0">
       <w:numFmt w:val="decimal"/>
       <w:lvlText w:val=""/>
       <w:lvlJc w:val="left"/>
     </w:lvl>
-    <w:lvl w:ilvl="4" w:tplc="32F2D69E">
+    <w:lvl w:ilvl="4" w:tplc="32AA04DE">
       <w:numFmt w:val="decimal"/>
       <w:lvlText w:val=""/>
       <w:lvlJc w:val="left"/>
     </w:lvl>
-    <w:lvl w:ilvl="5" w:tplc="1EA854B2">
+    <w:lvl w:ilvl="5" w:tplc="3918BA60">
       <w:numFmt w:val="decimal"/>
       <w:lvlText w:val=""/>
       <w:lvlJc w:val="left"/>
     </w:lvl>
-    <w:lvl w:ilvl="6" w:tplc="993E75D8">
+    <w:lvl w:ilvl="6" w:tplc="8FCAB62C">
       <w:numFmt w:val="decimal"/>
       <w:lvlText w:val=""/>
       <w:lvlJc w:val="left"/>
     </w:lvl>
-    <w:lvl w:ilvl="7" w:tplc="48C8AB54">
+    <w:lvl w:ilvl="7" w:tplc="694043FC">
       <w:numFmt w:val="decimal"/>
       <w:lvlText w:val=""/>
       <w:lvlJc w:val="left"/>
     </w:lvl>
-    <w:lvl w:ilvl="8" w:tplc="59C8CF58">
+    <w:lvl w:ilvl="8" w:tplc="AF0AAD90">
       <w:numFmt w:val="decimal"/>
       <w:lvlText w:val=""/>
       <w:lvlJc w:val="left"/>
@@ -5577,7 +5577,7 @@
     <w:autoRedefine/>
     <w:uiPriority w:val="39"/>
     <w:unhideWhenUsed/>
-    <w:rsid w:val="00CF1FEB"/>
+    <w:rsid w:val="00E264C9"/>
     <w:pPr>
       <w:spacing w:after="100"/>
     </w:pPr>

</xml_diff>

<commit_message>
Releases: shared phone app and desktop copy rebuilt (21 October)
Documents record the 21 October rebuild of the shared copies.

Co-Authored-By: Claude Opus 5.5 <noreply@anthropic.com>
</commit_message>
<xml_diff>
--- a/documentation/00 Documentation Index.docx
+++ b/documentation/00 Documentation Index.docx
@@ -1499,7 +1499,7 @@
     <w:sdt>
       <w:sdtPr>
         <w:alias w:val="Contents"/>
-        <w:id w:val="1373878974"/>
+        <w:id w:val="-1552147698"/>
       </w:sdtPr>
       <w:sdtEndPr/>
       <w:sdtContent>
@@ -1526,7 +1526,7 @@
           <w:r>
             <w:fldChar w:fldCharType="separate"/>
           </w:r>
-          <w:hyperlink w:anchor="_Toc243478970" w:history="1">
+          <w:hyperlink w:anchor="_Toc243481651" w:history="1">
             <w:r>
               <w:rPr>
                 <w:rStyle w:val="Hyperlink"/>
@@ -1550,7 +1550,7 @@
               <w:rPr>
                 <w:noProof/>
               </w:rPr>
-              <w:instrText xml:space="preserve"> PAGEREF _Toc243478970 \h </w:instrText>
+              <w:instrText xml:space="preserve"> PAGEREF _Toc243481651 \h </w:instrText>
             </w:r>
             <w:r>
               <w:rPr>
@@ -1591,7 +1591,7 @@
               <w:szCs w:val="22"/>
             </w:rPr>
           </w:pPr>
-          <w:hyperlink w:anchor="_Toc243478971" w:history="1">
+          <w:hyperlink w:anchor="_Toc243481652" w:history="1">
             <w:r>
               <w:rPr>
                 <w:rStyle w:val="Hyperlink"/>
@@ -1615,7 +1615,7 @@
               <w:rPr>
                 <w:noProof/>
               </w:rPr>
-              <w:instrText xml:space="preserve"> PAGEREF _Toc243478971 \h </w:instrText>
+              <w:instrText xml:space="preserve"> PAGEREF _Toc243481652 \h </w:instrText>
             </w:r>
             <w:r>
               <w:rPr>
@@ -1656,7 +1656,7 @@
               <w:szCs w:val="22"/>
             </w:rPr>
           </w:pPr>
-          <w:hyperlink w:anchor="_Toc243478972" w:history="1">
+          <w:hyperlink w:anchor="_Toc243481653" w:history="1">
             <w:r>
               <w:rPr>
                 <w:rStyle w:val="Hyperlink"/>
@@ -1680,7 +1680,7 @@
               <w:rPr>
                 <w:noProof/>
               </w:rPr>
-              <w:instrText xml:space="preserve"> PAGEREF _Toc243478972 \h </w:instrText>
+              <w:instrText xml:space="preserve"> PAGEREF _Toc243481653 \h </w:instrText>
             </w:r>
             <w:r>
               <w:rPr>
@@ -1721,7 +1721,7 @@
               <w:szCs w:val="22"/>
             </w:rPr>
           </w:pPr>
-          <w:hyperlink w:anchor="_Toc243478973" w:history="1">
+          <w:hyperlink w:anchor="_Toc243481654" w:history="1">
             <w:r>
               <w:rPr>
                 <w:rStyle w:val="Hyperlink"/>
@@ -1745,7 +1745,7 @@
               <w:rPr>
                 <w:noProof/>
               </w:rPr>
-              <w:instrText xml:space="preserve"> PAGEREF _Toc243478973 \h </w:instrText>
+              <w:instrText xml:space="preserve"> PAGEREF _Toc243481654 \h </w:instrText>
             </w:r>
             <w:r>
               <w:rPr>
@@ -1788,7 +1788,7 @@
       <w:pPr>
         <w:pStyle w:val="Heading1"/>
       </w:pPr>
-      <w:bookmarkStart w:id="1" w:name="_Toc243478970"/>
+      <w:bookmarkStart w:id="1" w:name="_Toc243481651"/>
       <w:r>
         <w:lastRenderedPageBreak/>
         <w:t>1  About this documentation</w:t>
@@ -1826,7 +1826,7 @@
       <w:pPr>
         <w:pStyle w:val="Heading1"/>
       </w:pPr>
-      <w:bookmarkStart w:id="2" w:name="_Toc243478971"/>
+      <w:bookmarkStart w:id="2" w:name="_Toc243481652"/>
       <w:r>
         <w:lastRenderedPageBreak/>
         <w:t>2  Where to start</w:t>
@@ -2296,7 +2296,7 @@
       <w:pPr>
         <w:pStyle w:val="Heading1"/>
       </w:pPr>
-      <w:bookmarkStart w:id="3" w:name="_Toc243478972"/>
+      <w:bookmarkStart w:id="3" w:name="_Toc243481653"/>
       <w:r>
         <w:lastRenderedPageBreak/>
         <w:t>3  The documents</w:t>
@@ -4352,7 +4352,7 @@
       <w:pPr>
         <w:pStyle w:val="Heading1"/>
       </w:pPr>
-      <w:bookmarkStart w:id="4" w:name="_Toc243478973"/>
+      <w:bookmarkStart w:id="4" w:name="_Toc243481654"/>
       <w:r>
         <w:lastRenderedPageBreak/>
         <w:t>4  Conventions used</w:t>
@@ -4732,10 +4732,10 @@
 <file path=word/numbering.xml><?xml version="1.0" encoding="utf-8"?>
 <w:numbering xmlns:wpc="http://schemas.microsoft.com/office/word/2010/wordprocessingCanvas" xmlns:cx="http://schemas.microsoft.com/office/drawing/2014/chartex" xmlns:cx1="http://schemas.microsoft.com/office/drawing/2015/9/8/chartex" xmlns:mc="http://schemas.openxmlformats.org/markup-compatibility/2006" xmlns:o="urn:schemas-microsoft-com:office:office" xmlns:r="http://schemas.openxmlformats.org/officeDocument/2006/relationships" xmlns:m="http://schemas.openxmlformats.org/officeDocument/2006/math" xmlns:v="urn:schemas-microsoft-com:vml" xmlns:wp14="http://schemas.microsoft.com/office/word/2010/wordprocessingDrawing" xmlns:wp="http://schemas.openxmlformats.org/drawingml/2006/wordprocessingDrawing" xmlns:w10="urn:schemas-microsoft-com:office:word" xmlns:w="http://schemas.openxmlformats.org/wordprocessingml/2006/main" xmlns:w14="http://schemas.microsoft.com/office/word/2010/wordml" xmlns:w15="http://schemas.microsoft.com/office/word/2012/wordml" xmlns:w16se="http://schemas.microsoft.com/office/word/2015/wordml/symex" xmlns:wpg="http://schemas.microsoft.com/office/word/2010/wordprocessingGroup" xmlns:wpi="http://schemas.microsoft.com/office/word/2010/wordprocessingInk" xmlns:wne="http://schemas.microsoft.com/office/word/2006/wordml" xmlns:wps="http://schemas.microsoft.com/office/word/2010/wordprocessingShape" mc:Ignorable="w14 w15 w16se wp14">
   <w:abstractNum w:abstractNumId="0" w15:restartNumberingAfterBreak="0">
-    <w:nsid w:val="6180276C"/>
+    <w:nsid w:val="04EA383F"/>
     <w:multiLevelType w:val="hybridMultilevel"/>
-    <w:tmpl w:val="26F85E6A"/>
-    <w:lvl w:ilvl="0" w:tplc="6D46A088">
+    <w:tmpl w:val="15EA2136"/>
+    <w:lvl w:ilvl="0" w:tplc="5CD4AC98">
       <w:start w:val="1"/>
       <w:numFmt w:val="bullet"/>
       <w:lvlText w:val="•"/>
@@ -4744,7 +4744,7 @@
         <w:ind w:left="540" w:hanging="300"/>
       </w:pPr>
     </w:lvl>
-    <w:lvl w:ilvl="1" w:tplc="F8F44760" w:tentative="1">
+    <w:lvl w:ilvl="1" w:tplc="B80C5AFC" w:tentative="1">
       <w:start w:val="1"/>
       <w:numFmt w:val="bullet"/>
       <w:lvlText w:val="–"/>
@@ -4753,7 +4753,7 @@
         <w:ind w:left="940" w:hanging="300"/>
       </w:pPr>
     </w:lvl>
-    <w:lvl w:ilvl="2" w:tplc="A4E67CE2" w:tentative="1">
+    <w:lvl w:ilvl="2" w:tplc="FE828914" w:tentative="1">
       <w:start w:val="1"/>
       <w:numFmt w:val="bullet"/>
       <w:lvlText w:val="◦"/>
@@ -4762,42 +4762,42 @@
         <w:ind w:left="1340" w:hanging="300"/>
       </w:pPr>
     </w:lvl>
-    <w:lvl w:ilvl="3" w:tplc="80D044F0">
+    <w:lvl w:ilvl="3" w:tplc="24C62ED8">
       <w:numFmt w:val="decimal"/>
       <w:lvlText w:val=""/>
       <w:lvlJc w:val="left"/>
     </w:lvl>
-    <w:lvl w:ilvl="4" w:tplc="0576FEF8">
+    <w:lvl w:ilvl="4" w:tplc="67E4103A">
       <w:numFmt w:val="decimal"/>
       <w:lvlText w:val=""/>
       <w:lvlJc w:val="left"/>
     </w:lvl>
-    <w:lvl w:ilvl="5" w:tplc="FB86CF8C">
+    <w:lvl w:ilvl="5" w:tplc="FD705B54">
       <w:numFmt w:val="decimal"/>
       <w:lvlText w:val=""/>
       <w:lvlJc w:val="left"/>
     </w:lvl>
-    <w:lvl w:ilvl="6" w:tplc="E690B45C">
+    <w:lvl w:ilvl="6" w:tplc="0E647686">
       <w:numFmt w:val="decimal"/>
       <w:lvlText w:val=""/>
       <w:lvlJc w:val="left"/>
     </w:lvl>
-    <w:lvl w:ilvl="7" w:tplc="B66E2718">
+    <w:lvl w:ilvl="7" w:tplc="8EFE07D0">
       <w:numFmt w:val="decimal"/>
       <w:lvlText w:val=""/>
       <w:lvlJc w:val="left"/>
     </w:lvl>
-    <w:lvl w:ilvl="8" w:tplc="3E4E9B30">
+    <w:lvl w:ilvl="8" w:tplc="FB28BA26">
       <w:numFmt w:val="decimal"/>
       <w:lvlText w:val=""/>
       <w:lvlJc w:val="left"/>
     </w:lvl>
   </w:abstractNum>
   <w:abstractNum w:abstractNumId="1" w15:restartNumberingAfterBreak="0">
-    <w:nsid w:val="75591926"/>
+    <w:nsid w:val="379B6AB8"/>
     <w:multiLevelType w:val="hybridMultilevel"/>
-    <w:tmpl w:val="16D68650"/>
-    <w:lvl w:ilvl="0" w:tplc="0D140830" w:tentative="1">
+    <w:tmpl w:val="A6B6209A"/>
+    <w:lvl w:ilvl="0" w:tplc="03AE8CE2" w:tentative="1">
       <w:start w:val="1"/>
       <w:numFmt w:val="bullet"/>
       <w:lvlText w:val="●"/>
@@ -4806,7 +4806,7 @@
         <w:ind w:left="720" w:hanging="360"/>
       </w:pPr>
     </w:lvl>
-    <w:lvl w:ilvl="1" w:tplc="995CDA88" w:tentative="1">
+    <w:lvl w:ilvl="1" w:tplc="1FBCC16C" w:tentative="1">
       <w:start w:val="1"/>
       <w:numFmt w:val="bullet"/>
       <w:lvlText w:val="○"/>
@@ -4815,7 +4815,7 @@
         <w:ind w:left="1440" w:hanging="360"/>
       </w:pPr>
     </w:lvl>
-    <w:lvl w:ilvl="2" w:tplc="44E2E0A0" w:tentative="1">
+    <w:lvl w:ilvl="2" w:tplc="C4D479AC" w:tentative="1">
       <w:start w:val="1"/>
       <w:numFmt w:val="bullet"/>
       <w:lvlText w:val="■"/>
@@ -4824,7 +4824,7 @@
         <w:ind w:left="2160" w:hanging="360"/>
       </w:pPr>
     </w:lvl>
-    <w:lvl w:ilvl="3" w:tplc="FB4AEE84" w:tentative="1">
+    <w:lvl w:ilvl="3" w:tplc="20BC0C4A" w:tentative="1">
       <w:start w:val="1"/>
       <w:numFmt w:val="bullet"/>
       <w:lvlText w:val="●"/>
@@ -4833,7 +4833,7 @@
         <w:ind w:left="2880" w:hanging="360"/>
       </w:pPr>
     </w:lvl>
-    <w:lvl w:ilvl="4" w:tplc="DD442EC4" w:tentative="1">
+    <w:lvl w:ilvl="4" w:tplc="C66820C0" w:tentative="1">
       <w:start w:val="1"/>
       <w:numFmt w:val="bullet"/>
       <w:lvlText w:val="○"/>
@@ -4842,7 +4842,7 @@
         <w:ind w:left="3600" w:hanging="360"/>
       </w:pPr>
     </w:lvl>
-    <w:lvl w:ilvl="5" w:tplc="870070B0" w:tentative="1">
+    <w:lvl w:ilvl="5" w:tplc="B4D01BA8" w:tentative="1">
       <w:start w:val="1"/>
       <w:numFmt w:val="bullet"/>
       <w:lvlText w:val="■"/>
@@ -4851,7 +4851,7 @@
         <w:ind w:left="4320" w:hanging="360"/>
       </w:pPr>
     </w:lvl>
-    <w:lvl w:ilvl="6" w:tplc="A306A852" w:tentative="1">
+    <w:lvl w:ilvl="6" w:tplc="7EB8D0E2" w:tentative="1">
       <w:start w:val="1"/>
       <w:numFmt w:val="bullet"/>
       <w:lvlText w:val="●"/>
@@ -4860,7 +4860,7 @@
         <w:ind w:left="5040" w:hanging="360"/>
       </w:pPr>
     </w:lvl>
-    <w:lvl w:ilvl="7" w:tplc="06BE10EC" w:tentative="1">
+    <w:lvl w:ilvl="7" w:tplc="E34A3A5E" w:tentative="1">
       <w:start w:val="1"/>
       <w:numFmt w:val="bullet"/>
       <w:lvlText w:val="●"/>
@@ -4869,7 +4869,7 @@
         <w:ind w:left="5760" w:hanging="360"/>
       </w:pPr>
     </w:lvl>
-    <w:lvl w:ilvl="8" w:tplc="AD9CA7B8" w:tentative="1">
+    <w:lvl w:ilvl="8" w:tplc="A440D6D4" w:tentative="1">
       <w:start w:val="1"/>
       <w:numFmt w:val="bullet"/>
       <w:lvlText w:val="●"/>
@@ -4880,10 +4880,10 @@
     </w:lvl>
   </w:abstractNum>
   <w:abstractNum w:abstractNumId="2" w15:restartNumberingAfterBreak="0">
-    <w:nsid w:val="77817251"/>
+    <w:nsid w:val="74635152"/>
     <w:multiLevelType w:val="hybridMultilevel"/>
-    <w:tmpl w:val="96780C3C"/>
-    <w:lvl w:ilvl="0" w:tplc="997EF83E" w:tentative="1">
+    <w:tmpl w:val="076CF664"/>
+    <w:lvl w:ilvl="0" w:tplc="EC0E5A3A" w:tentative="1">
       <w:start w:val="1"/>
       <w:numFmt w:val="decimal"/>
       <w:lvlText w:val="%1."/>
@@ -4892,7 +4892,7 @@
         <w:ind w:left="540" w:hanging="300"/>
       </w:pPr>
     </w:lvl>
-    <w:lvl w:ilvl="1" w:tplc="E6E2E934" w:tentative="1">
+    <w:lvl w:ilvl="1" w:tplc="C81EC95A" w:tentative="1">
       <w:start w:val="1"/>
       <w:numFmt w:val="lowerLetter"/>
       <w:lvlText w:val="%2."/>
@@ -4901,7 +4901,7 @@
         <w:ind w:left="940" w:hanging="300"/>
       </w:pPr>
     </w:lvl>
-    <w:lvl w:ilvl="2" w:tplc="FA08A4A8" w:tentative="1">
+    <w:lvl w:ilvl="2" w:tplc="FE56B194" w:tentative="1">
       <w:start w:val="1"/>
       <w:numFmt w:val="lowerRoman"/>
       <w:lvlText w:val="%3."/>
@@ -4910,32 +4910,32 @@
         <w:ind w:left="1340" w:hanging="300"/>
       </w:pPr>
     </w:lvl>
-    <w:lvl w:ilvl="3" w:tplc="2D36BAD0">
+    <w:lvl w:ilvl="3" w:tplc="EA7E6F70">
       <w:numFmt w:val="decimal"/>
       <w:lvlText w:val=""/>
       <w:lvlJc w:val="left"/>
     </w:lvl>
-    <w:lvl w:ilvl="4" w:tplc="32AA04DE">
+    <w:lvl w:ilvl="4" w:tplc="B16AD7A6">
       <w:numFmt w:val="decimal"/>
       <w:lvlText w:val=""/>
       <w:lvlJc w:val="left"/>
     </w:lvl>
-    <w:lvl w:ilvl="5" w:tplc="3918BA60">
+    <w:lvl w:ilvl="5" w:tplc="73BEE0E6">
       <w:numFmt w:val="decimal"/>
       <w:lvlText w:val=""/>
       <w:lvlJc w:val="left"/>
     </w:lvl>
-    <w:lvl w:ilvl="6" w:tplc="8FCAB62C">
+    <w:lvl w:ilvl="6" w:tplc="8368B25A">
       <w:numFmt w:val="decimal"/>
       <w:lvlText w:val=""/>
       <w:lvlJc w:val="left"/>
     </w:lvl>
-    <w:lvl w:ilvl="7" w:tplc="694043FC">
+    <w:lvl w:ilvl="7" w:tplc="CFC42488">
       <w:numFmt w:val="decimal"/>
       <w:lvlText w:val=""/>
       <w:lvlJc w:val="left"/>
     </w:lvl>
-    <w:lvl w:ilvl="8" w:tplc="AF0AAD90">
+    <w:lvl w:ilvl="8" w:tplc="CB6C85C6">
       <w:numFmt w:val="decimal"/>
       <w:lvlText w:val=""/>
       <w:lvlJc w:val="left"/>
@@ -5577,7 +5577,7 @@
     <w:autoRedefine/>
     <w:uiPriority w:val="39"/>
     <w:unhideWhenUsed/>
-    <w:rsid w:val="00E264C9"/>
+    <w:rsid w:val="00146507"/>
     <w:pPr>
       <w:spacing w:after="100"/>
     </w:pPr>

</xml_diff>

<commit_message>
Order tickets, Track my order and sharing the driver
Every order gets a ticket like DW-7K3Q9P (migration 038, OrderTickets; older orders get one at start-up), shown on the payment screen, the order page and Ordered Goods, and used by staff (desktop and phone) and the assistant. The website's Track my order page needs no sign-in: the ticket and the last 3 digits of the account's phone, with five wrong tries locking a ticket for half an hour and at most 60 look-ups a minute. The driver and number plate reach customers only when staff switch on Share driver for a delivery (LIGHT_DELIVERIES.Share_Driver; PATCH /deliveries/light/{id}/share-driver on the desktop and phone servers); orders joining a delivery follow it, and orders sent back to the pool are hidden again. The About page map button uses the owner's pin. Twelve documents updated with 23 October rows.

Co-Authored-By: Claude Opus 5.5 <noreply@anthropic.com>
</commit_message>
<xml_diff>
--- a/documentation/00 Documentation Index.docx
+++ b/documentation/00 Documentation Index.docx
@@ -80,7 +80,7 @@
           <w:left w:w="10" w:type="dxa"/>
           <w:right w:w="10" w:type="dxa"/>
         </w:tblCellMar>
-        <w:tblLook w:val="0000" w:firstRow="0" w:lastRow="0" w:firstColumn="0" w:lastColumn="0" w:noHBand="0" w:noVBand="0"/>
+        <w:tblLook w:val="04A0" w:firstRow="1" w:lastRow="0" w:firstColumn="1" w:lastColumn="0" w:noHBand="0" w:noVBand="1"/>
       </w:tblPr>
       <w:tblGrid>
         <w:gridCol w:w="2600"/>
@@ -289,7 +289,7 @@
                 <w:sz w:val="20"/>
                 <w:szCs w:val="20"/>
               </w:rPr>
-              <w:t>18 October 2026</w:t>
+              <w:t>23 October 2026</w:t>
             </w:r>
           </w:p>
         </w:tc>
@@ -461,7 +461,7 @@
           <w:left w:w="10" w:type="dxa"/>
           <w:right w:w="10" w:type="dxa"/>
         </w:tblCellMar>
-        <w:tblLook w:val="0000" w:firstRow="0" w:lastRow="0" w:firstColumn="0" w:lastColumn="0" w:noHBand="0" w:noVBand="0"/>
+        <w:tblLook w:val="04A0" w:firstRow="1" w:lastRow="0" w:firstColumn="1" w:lastColumn="0" w:noHBand="0" w:noVBand="1"/>
       </w:tblPr>
       <w:tblGrid>
         <w:gridCol w:w="1300"/>
@@ -1463,6 +1463,74 @@
                 <w:szCs w:val="19"/>
               </w:rPr>
               <w:t>going live.</w:t>
+            </w:r>
+          </w:p>
+        </w:tc>
+      </w:tr>
+      <w:tr>
+        <w:tblPrEx>
+          <w:tblCellMar>
+            <w:top w:w="0" w:type="dxa"/>
+            <w:bottom w:w="0" w:type="dxa"/>
+          </w:tblCellMar>
+        </w:tblPrEx>
+        <w:tc>
+          <w:tcPr>
+            <w:tcW w:w="1300" w:type="dxa"/>
+            <w:tcMar>
+              <w:top w:w="50" w:type="dxa"/>
+              <w:left w:w="90" w:type="dxa"/>
+              <w:bottom w:w="50" w:type="dxa"/>
+              <w:right w:w="90" w:type="dxa"/>
+            </w:tcMar>
+          </w:tcPr>
+          <w:p>
+            <w:r>
+              <w:rPr>
+                <w:sz w:val="19"/>
+                <w:szCs w:val="19"/>
+              </w:rPr>
+              <w:t>1.1</w:t>
+            </w:r>
+          </w:p>
+        </w:tc>
+        <w:tc>
+          <w:tcPr>
+            <w:tcW w:w="1900" w:type="dxa"/>
+            <w:tcMar>
+              <w:top w:w="50" w:type="dxa"/>
+              <w:left w:w="90" w:type="dxa"/>
+              <w:bottom w:w="50" w:type="dxa"/>
+              <w:right w:w="90" w:type="dxa"/>
+            </w:tcMar>
+          </w:tcPr>
+          <w:p>
+            <w:r>
+              <w:rPr>
+                <w:sz w:val="19"/>
+                <w:szCs w:val="19"/>
+              </w:rPr>
+              <w:t>23 October 2026</w:t>
+            </w:r>
+          </w:p>
+        </w:tc>
+        <w:tc>
+          <w:tcPr>
+            <w:tcW w:w="6438" w:type="dxa"/>
+            <w:tcMar>
+              <w:top w:w="50" w:type="dxa"/>
+              <w:left w:w="90" w:type="dxa"/>
+              <w:bottom w:w="50" w:type="dxa"/>
+              <w:right w:w="90" w:type="dxa"/>
+            </w:tcMar>
+          </w:tcPr>
+          <w:p>
+            <w:r>
+              <w:rPr>
+                <w:sz w:val="19"/>
+                <w:szCs w:val="19"/>
+              </w:rPr>
+              <w:t>Order tickets, Track my order and sharing the driver; the backend endpoint count brought up to date.</w:t>
             </w:r>
           </w:p>
         </w:tc>
@@ -1499,7 +1567,7 @@
     <w:sdt>
       <w:sdtPr>
         <w:alias w:val="Contents"/>
-        <w:id w:val="-1552147698"/>
+        <w:id w:val="-231625421"/>
       </w:sdtPr>
       <w:sdtEndPr/>
       <w:sdtContent>
@@ -1526,7 +1594,7 @@
           <w:r>
             <w:fldChar w:fldCharType="separate"/>
           </w:r>
-          <w:hyperlink w:anchor="_Toc243481651" w:history="1">
+          <w:hyperlink w:anchor="_Toc243679810" w:history="1">
             <w:r>
               <w:rPr>
                 <w:rStyle w:val="Hyperlink"/>
@@ -1550,7 +1618,7 @@
               <w:rPr>
                 <w:noProof/>
               </w:rPr>
-              <w:instrText xml:space="preserve"> PAGEREF _Toc243481651 \h </w:instrText>
+              <w:instrText xml:space="preserve"> PAGEREF _Toc243679810 \h </w:instrText>
             </w:r>
             <w:r>
               <w:rPr>
@@ -1591,7 +1659,7 @@
               <w:szCs w:val="22"/>
             </w:rPr>
           </w:pPr>
-          <w:hyperlink w:anchor="_Toc243481652" w:history="1">
+          <w:hyperlink w:anchor="_Toc243679811" w:history="1">
             <w:r>
               <w:rPr>
                 <w:rStyle w:val="Hyperlink"/>
@@ -1615,7 +1683,7 @@
               <w:rPr>
                 <w:noProof/>
               </w:rPr>
-              <w:instrText xml:space="preserve"> PAGEREF _Toc243481652 \h </w:instrText>
+              <w:instrText xml:space="preserve"> PAGEREF _Toc243679811 \h </w:instrText>
             </w:r>
             <w:r>
               <w:rPr>
@@ -1656,7 +1724,7 @@
               <w:szCs w:val="22"/>
             </w:rPr>
           </w:pPr>
-          <w:hyperlink w:anchor="_Toc243481653" w:history="1">
+          <w:hyperlink w:anchor="_Toc243679812" w:history="1">
             <w:r>
               <w:rPr>
                 <w:rStyle w:val="Hyperlink"/>
@@ -1680,7 +1748,7 @@
               <w:rPr>
                 <w:noProof/>
               </w:rPr>
-              <w:instrText xml:space="preserve"> PAGEREF _Toc243481653 \h </w:instrText>
+              <w:instrText xml:space="preserve"> PAGEREF _Toc243679812 \h </w:instrText>
             </w:r>
             <w:r>
               <w:rPr>
@@ -1721,7 +1789,7 @@
               <w:szCs w:val="22"/>
             </w:rPr>
           </w:pPr>
-          <w:hyperlink w:anchor="_Toc243481654" w:history="1">
+          <w:hyperlink w:anchor="_Toc243679813" w:history="1">
             <w:r>
               <w:rPr>
                 <w:rStyle w:val="Hyperlink"/>
@@ -1745,7 +1813,7 @@
               <w:rPr>
                 <w:noProof/>
               </w:rPr>
-              <w:instrText xml:space="preserve"> PAGEREF _Toc243481654 \h </w:instrText>
+              <w:instrText xml:space="preserve"> PAGEREF _Toc243679813 \h </w:instrText>
             </w:r>
             <w:r>
               <w:rPr>
@@ -1788,7 +1856,7 @@
       <w:pPr>
         <w:pStyle w:val="Heading1"/>
       </w:pPr>
-      <w:bookmarkStart w:id="1" w:name="_Toc243481651"/>
+      <w:bookmarkStart w:id="1" w:name="_Toc243679810"/>
       <w:r>
         <w:lastRenderedPageBreak/>
         <w:t>1  About this documentation</w:t>
@@ -1826,7 +1894,7 @@
       <w:pPr>
         <w:pStyle w:val="Heading1"/>
       </w:pPr>
-      <w:bookmarkStart w:id="2" w:name="_Toc243481652"/>
+      <w:bookmarkStart w:id="2" w:name="_Toc243679811"/>
       <w:r>
         <w:lastRenderedPageBreak/>
         <w:t>2  Where to start</w:t>
@@ -1849,7 +1917,7 @@
           <w:left w:w="10" w:type="dxa"/>
           <w:right w:w="10" w:type="dxa"/>
         </w:tblCellMar>
-        <w:tblLook w:val="0000" w:firstRow="0" w:lastRow="0" w:firstColumn="0" w:lastColumn="0" w:noHBand="0" w:noVBand="0"/>
+        <w:tblLook w:val="04A0" w:firstRow="1" w:lastRow="0" w:firstColumn="1" w:lastColumn="0" w:noHBand="0" w:noVBand="1"/>
       </w:tblPr>
       <w:tblGrid>
         <w:gridCol w:w="3125"/>
@@ -2296,7 +2364,7 @@
       <w:pPr>
         <w:pStyle w:val="Heading1"/>
       </w:pPr>
-      <w:bookmarkStart w:id="3" w:name="_Toc243481653"/>
+      <w:bookmarkStart w:id="3" w:name="_Toc243679812"/>
       <w:r>
         <w:lastRenderedPageBreak/>
         <w:t>3  The documents</w:t>
@@ -2319,7 +2387,7 @@
           <w:left w:w="10" w:type="dxa"/>
           <w:right w:w="10" w:type="dxa"/>
         </w:tblCellMar>
-        <w:tblLook w:val="0000" w:firstRow="0" w:lastRow="0" w:firstColumn="0" w:lastColumn="0" w:noHBand="0" w:noVBand="0"/>
+        <w:tblLook w:val="04A0" w:firstRow="1" w:lastRow="0" w:firstColumn="1" w:lastColumn="0" w:noHBand="0" w:noVBand="1"/>
       </w:tblPr>
       <w:tblGrid>
         <w:gridCol w:w="2289"/>
@@ -3072,7 +3140,7 @@
                 <w:sz w:val="19"/>
                 <w:szCs w:val="19"/>
               </w:rPr>
-              <w:t>Java backend modules, security and approved phones, jobs, 169 endpoints</w:t>
+              <w:t>Java backend modules, security and approved phones, jobs, 172 endpoints</w:t>
             </w:r>
           </w:p>
         </w:tc>
@@ -4352,7 +4420,7 @@
       <w:pPr>
         <w:pStyle w:val="Heading1"/>
       </w:pPr>
-      <w:bookmarkStart w:id="4" w:name="_Toc243481654"/>
+      <w:bookmarkStart w:id="4" w:name="_Toc243679813"/>
       <w:r>
         <w:lastRenderedPageBreak/>
         <w:t>4  Conventions used</w:t>
@@ -4732,72 +4800,10 @@
 <file path=word/numbering.xml><?xml version="1.0" encoding="utf-8"?>
 <w:numbering xmlns:wpc="http://schemas.microsoft.com/office/word/2010/wordprocessingCanvas" xmlns:cx="http://schemas.microsoft.com/office/drawing/2014/chartex" xmlns:cx1="http://schemas.microsoft.com/office/drawing/2015/9/8/chartex" xmlns:mc="http://schemas.openxmlformats.org/markup-compatibility/2006" xmlns:o="urn:schemas-microsoft-com:office:office" xmlns:r="http://schemas.openxmlformats.org/officeDocument/2006/relationships" xmlns:m="http://schemas.openxmlformats.org/officeDocument/2006/math" xmlns:v="urn:schemas-microsoft-com:vml" xmlns:wp14="http://schemas.microsoft.com/office/word/2010/wordprocessingDrawing" xmlns:wp="http://schemas.openxmlformats.org/drawingml/2006/wordprocessingDrawing" xmlns:w10="urn:schemas-microsoft-com:office:word" xmlns:w="http://schemas.openxmlformats.org/wordprocessingml/2006/main" xmlns:w14="http://schemas.microsoft.com/office/word/2010/wordml" xmlns:w15="http://schemas.microsoft.com/office/word/2012/wordml" xmlns:w16se="http://schemas.microsoft.com/office/word/2015/wordml/symex" xmlns:wpg="http://schemas.microsoft.com/office/word/2010/wordprocessingGroup" xmlns:wpi="http://schemas.microsoft.com/office/word/2010/wordprocessingInk" xmlns:wne="http://schemas.microsoft.com/office/word/2006/wordml" xmlns:wps="http://schemas.microsoft.com/office/word/2010/wordprocessingShape" mc:Ignorable="w14 w15 w16se wp14">
   <w:abstractNum w:abstractNumId="0" w15:restartNumberingAfterBreak="0">
-    <w:nsid w:val="04EA383F"/>
+    <w:nsid w:val="37E51C43"/>
     <w:multiLevelType w:val="hybridMultilevel"/>
-    <w:tmpl w:val="15EA2136"/>
-    <w:lvl w:ilvl="0" w:tplc="5CD4AC98">
-      <w:start w:val="1"/>
-      <w:numFmt w:val="bullet"/>
-      <w:lvlText w:val="•"/>
-      <w:lvlJc w:val="left"/>
-      <w:pPr>
-        <w:ind w:left="540" w:hanging="300"/>
-      </w:pPr>
-    </w:lvl>
-    <w:lvl w:ilvl="1" w:tplc="B80C5AFC" w:tentative="1">
-      <w:start w:val="1"/>
-      <w:numFmt w:val="bullet"/>
-      <w:lvlText w:val="–"/>
-      <w:lvlJc w:val="left"/>
-      <w:pPr>
-        <w:ind w:left="940" w:hanging="300"/>
-      </w:pPr>
-    </w:lvl>
-    <w:lvl w:ilvl="2" w:tplc="FE828914" w:tentative="1">
-      <w:start w:val="1"/>
-      <w:numFmt w:val="bullet"/>
-      <w:lvlText w:val="◦"/>
-      <w:lvlJc w:val="left"/>
-      <w:pPr>
-        <w:ind w:left="1340" w:hanging="300"/>
-      </w:pPr>
-    </w:lvl>
-    <w:lvl w:ilvl="3" w:tplc="24C62ED8">
-      <w:numFmt w:val="decimal"/>
-      <w:lvlText w:val=""/>
-      <w:lvlJc w:val="left"/>
-    </w:lvl>
-    <w:lvl w:ilvl="4" w:tplc="67E4103A">
-      <w:numFmt w:val="decimal"/>
-      <w:lvlText w:val=""/>
-      <w:lvlJc w:val="left"/>
-    </w:lvl>
-    <w:lvl w:ilvl="5" w:tplc="FD705B54">
-      <w:numFmt w:val="decimal"/>
-      <w:lvlText w:val=""/>
-      <w:lvlJc w:val="left"/>
-    </w:lvl>
-    <w:lvl w:ilvl="6" w:tplc="0E647686">
-      <w:numFmt w:val="decimal"/>
-      <w:lvlText w:val=""/>
-      <w:lvlJc w:val="left"/>
-    </w:lvl>
-    <w:lvl w:ilvl="7" w:tplc="8EFE07D0">
-      <w:numFmt w:val="decimal"/>
-      <w:lvlText w:val=""/>
-      <w:lvlJc w:val="left"/>
-    </w:lvl>
-    <w:lvl w:ilvl="8" w:tplc="FB28BA26">
-      <w:numFmt w:val="decimal"/>
-      <w:lvlText w:val=""/>
-      <w:lvlJc w:val="left"/>
-    </w:lvl>
-  </w:abstractNum>
-  <w:abstractNum w:abstractNumId="1" w15:restartNumberingAfterBreak="0">
-    <w:nsid w:val="379B6AB8"/>
-    <w:multiLevelType w:val="hybridMultilevel"/>
-    <w:tmpl w:val="A6B6209A"/>
-    <w:lvl w:ilvl="0" w:tplc="03AE8CE2" w:tentative="1">
+    <w:tmpl w:val="BD1EBAE4"/>
+    <w:lvl w:ilvl="0" w:tplc="61A0B34A" w:tentative="1">
       <w:start w:val="1"/>
       <w:numFmt w:val="bullet"/>
       <w:lvlText w:val="●"/>
@@ -4806,7 +4812,7 @@
         <w:ind w:left="720" w:hanging="360"/>
       </w:pPr>
     </w:lvl>
-    <w:lvl w:ilvl="1" w:tplc="1FBCC16C" w:tentative="1">
+    <w:lvl w:ilvl="1" w:tplc="C014483C" w:tentative="1">
       <w:start w:val="1"/>
       <w:numFmt w:val="bullet"/>
       <w:lvlText w:val="○"/>
@@ -4815,7 +4821,7 @@
         <w:ind w:left="1440" w:hanging="360"/>
       </w:pPr>
     </w:lvl>
-    <w:lvl w:ilvl="2" w:tplc="C4D479AC" w:tentative="1">
+    <w:lvl w:ilvl="2" w:tplc="8C08A6A4" w:tentative="1">
       <w:start w:val="1"/>
       <w:numFmt w:val="bullet"/>
       <w:lvlText w:val="■"/>
@@ -4824,7 +4830,7 @@
         <w:ind w:left="2160" w:hanging="360"/>
       </w:pPr>
     </w:lvl>
-    <w:lvl w:ilvl="3" w:tplc="20BC0C4A" w:tentative="1">
+    <w:lvl w:ilvl="3" w:tplc="68F299F2" w:tentative="1">
       <w:start w:val="1"/>
       <w:numFmt w:val="bullet"/>
       <w:lvlText w:val="●"/>
@@ -4833,7 +4839,7 @@
         <w:ind w:left="2880" w:hanging="360"/>
       </w:pPr>
     </w:lvl>
-    <w:lvl w:ilvl="4" w:tplc="C66820C0" w:tentative="1">
+    <w:lvl w:ilvl="4" w:tplc="61FC6064" w:tentative="1">
       <w:start w:val="1"/>
       <w:numFmt w:val="bullet"/>
       <w:lvlText w:val="○"/>
@@ -4842,7 +4848,7 @@
         <w:ind w:left="3600" w:hanging="360"/>
       </w:pPr>
     </w:lvl>
-    <w:lvl w:ilvl="5" w:tplc="B4D01BA8" w:tentative="1">
+    <w:lvl w:ilvl="5" w:tplc="40BAB1FC" w:tentative="1">
       <w:start w:val="1"/>
       <w:numFmt w:val="bullet"/>
       <w:lvlText w:val="■"/>
@@ -4851,7 +4857,7 @@
         <w:ind w:left="4320" w:hanging="360"/>
       </w:pPr>
     </w:lvl>
-    <w:lvl w:ilvl="6" w:tplc="7EB8D0E2" w:tentative="1">
+    <w:lvl w:ilvl="6" w:tplc="964671A8" w:tentative="1">
       <w:start w:val="1"/>
       <w:numFmt w:val="bullet"/>
       <w:lvlText w:val="●"/>
@@ -4860,7 +4866,7 @@
         <w:ind w:left="5040" w:hanging="360"/>
       </w:pPr>
     </w:lvl>
-    <w:lvl w:ilvl="7" w:tplc="E34A3A5E" w:tentative="1">
+    <w:lvl w:ilvl="7" w:tplc="D5DAB3D6" w:tentative="1">
       <w:start w:val="1"/>
       <w:numFmt w:val="bullet"/>
       <w:lvlText w:val="●"/>
@@ -4869,7 +4875,7 @@
         <w:ind w:left="5760" w:hanging="360"/>
       </w:pPr>
     </w:lvl>
-    <w:lvl w:ilvl="8" w:tplc="A440D6D4" w:tentative="1">
+    <w:lvl w:ilvl="8" w:tplc="9006C316" w:tentative="1">
       <w:start w:val="1"/>
       <w:numFmt w:val="bullet"/>
       <w:lvlText w:val="●"/>
@@ -4879,11 +4885,73 @@
       </w:pPr>
     </w:lvl>
   </w:abstractNum>
+  <w:abstractNum w:abstractNumId="1" w15:restartNumberingAfterBreak="0">
+    <w:nsid w:val="6D0705BF"/>
+    <w:multiLevelType w:val="hybridMultilevel"/>
+    <w:tmpl w:val="29D2A7D6"/>
+    <w:lvl w:ilvl="0" w:tplc="4852EBCC">
+      <w:start w:val="1"/>
+      <w:numFmt w:val="bullet"/>
+      <w:lvlText w:val="•"/>
+      <w:lvlJc w:val="left"/>
+      <w:pPr>
+        <w:ind w:left="540" w:hanging="300"/>
+      </w:pPr>
+    </w:lvl>
+    <w:lvl w:ilvl="1" w:tplc="84D68AE2" w:tentative="1">
+      <w:start w:val="1"/>
+      <w:numFmt w:val="bullet"/>
+      <w:lvlText w:val="–"/>
+      <w:lvlJc w:val="left"/>
+      <w:pPr>
+        <w:ind w:left="940" w:hanging="300"/>
+      </w:pPr>
+    </w:lvl>
+    <w:lvl w:ilvl="2" w:tplc="A9D28F76" w:tentative="1">
+      <w:start w:val="1"/>
+      <w:numFmt w:val="bullet"/>
+      <w:lvlText w:val="◦"/>
+      <w:lvlJc w:val="left"/>
+      <w:pPr>
+        <w:ind w:left="1340" w:hanging="300"/>
+      </w:pPr>
+    </w:lvl>
+    <w:lvl w:ilvl="3" w:tplc="203E56BC">
+      <w:numFmt w:val="decimal"/>
+      <w:lvlText w:val=""/>
+      <w:lvlJc w:val="left"/>
+    </w:lvl>
+    <w:lvl w:ilvl="4" w:tplc="F3DA9ABE">
+      <w:numFmt w:val="decimal"/>
+      <w:lvlText w:val=""/>
+      <w:lvlJc w:val="left"/>
+    </w:lvl>
+    <w:lvl w:ilvl="5" w:tplc="1A70995A">
+      <w:numFmt w:val="decimal"/>
+      <w:lvlText w:val=""/>
+      <w:lvlJc w:val="left"/>
+    </w:lvl>
+    <w:lvl w:ilvl="6" w:tplc="7D1E64A0">
+      <w:numFmt w:val="decimal"/>
+      <w:lvlText w:val=""/>
+      <w:lvlJc w:val="left"/>
+    </w:lvl>
+    <w:lvl w:ilvl="7" w:tplc="D91223CA">
+      <w:numFmt w:val="decimal"/>
+      <w:lvlText w:val=""/>
+      <w:lvlJc w:val="left"/>
+    </w:lvl>
+    <w:lvl w:ilvl="8" w:tplc="6C76844C">
+      <w:numFmt w:val="decimal"/>
+      <w:lvlText w:val=""/>
+      <w:lvlJc w:val="left"/>
+    </w:lvl>
+  </w:abstractNum>
   <w:abstractNum w:abstractNumId="2" w15:restartNumberingAfterBreak="0">
-    <w:nsid w:val="74635152"/>
+    <w:nsid w:val="77750E60"/>
     <w:multiLevelType w:val="hybridMultilevel"/>
-    <w:tmpl w:val="076CF664"/>
-    <w:lvl w:ilvl="0" w:tplc="EC0E5A3A" w:tentative="1">
+    <w:tmpl w:val="6B2C13CA"/>
+    <w:lvl w:ilvl="0" w:tplc="813C3FD2" w:tentative="1">
       <w:start w:val="1"/>
       <w:numFmt w:val="decimal"/>
       <w:lvlText w:val="%1."/>
@@ -4892,7 +4960,7 @@
         <w:ind w:left="540" w:hanging="300"/>
       </w:pPr>
     </w:lvl>
-    <w:lvl w:ilvl="1" w:tplc="C81EC95A" w:tentative="1">
+    <w:lvl w:ilvl="1" w:tplc="CDF83CB6" w:tentative="1">
       <w:start w:val="1"/>
       <w:numFmt w:val="lowerLetter"/>
       <w:lvlText w:val="%2."/>
@@ -4901,7 +4969,7 @@
         <w:ind w:left="940" w:hanging="300"/>
       </w:pPr>
     </w:lvl>
-    <w:lvl w:ilvl="2" w:tplc="FE56B194" w:tentative="1">
+    <w:lvl w:ilvl="2" w:tplc="6F1292BE" w:tentative="1">
       <w:start w:val="1"/>
       <w:numFmt w:val="lowerRoman"/>
       <w:lvlText w:val="%3."/>
@@ -4910,45 +4978,45 @@
         <w:ind w:left="1340" w:hanging="300"/>
       </w:pPr>
     </w:lvl>
-    <w:lvl w:ilvl="3" w:tplc="EA7E6F70">
+    <w:lvl w:ilvl="3" w:tplc="2E666D00">
       <w:numFmt w:val="decimal"/>
       <w:lvlText w:val=""/>
       <w:lvlJc w:val="left"/>
     </w:lvl>
-    <w:lvl w:ilvl="4" w:tplc="B16AD7A6">
+    <w:lvl w:ilvl="4" w:tplc="F0EC1558">
       <w:numFmt w:val="decimal"/>
       <w:lvlText w:val=""/>
       <w:lvlJc w:val="left"/>
     </w:lvl>
-    <w:lvl w:ilvl="5" w:tplc="73BEE0E6">
+    <w:lvl w:ilvl="5" w:tplc="3C6EA2C2">
       <w:numFmt w:val="decimal"/>
       <w:lvlText w:val=""/>
       <w:lvlJc w:val="left"/>
     </w:lvl>
-    <w:lvl w:ilvl="6" w:tplc="8368B25A">
+    <w:lvl w:ilvl="6" w:tplc="5B4CCC24">
       <w:numFmt w:val="decimal"/>
       <w:lvlText w:val=""/>
       <w:lvlJc w:val="left"/>
     </w:lvl>
-    <w:lvl w:ilvl="7" w:tplc="CFC42488">
+    <w:lvl w:ilvl="7" w:tplc="1DF6D8D6">
       <w:numFmt w:val="decimal"/>
       <w:lvlText w:val=""/>
       <w:lvlJc w:val="left"/>
     </w:lvl>
-    <w:lvl w:ilvl="8" w:tplc="CB6C85C6">
+    <w:lvl w:ilvl="8" w:tplc="11321284">
       <w:numFmt w:val="decimal"/>
       <w:lvlText w:val=""/>
       <w:lvlJc w:val="left"/>
     </w:lvl>
   </w:abstractNum>
   <w:num w:numId="1">
-    <w:abstractNumId w:val="1"/>
+    <w:abstractNumId w:val="0"/>
     <w:lvlOverride w:ilvl="0">
       <w:startOverride w:val="1"/>
     </w:lvlOverride>
   </w:num>
   <w:num w:numId="2">
-    <w:abstractNumId w:val="0"/>
+    <w:abstractNumId w:val="1"/>
     <w:lvlOverride w:ilvl="0">
       <w:startOverride w:val="1"/>
     </w:lvlOverride>
@@ -5577,7 +5645,7 @@
     <w:autoRedefine/>
     <w:uiPriority w:val="39"/>
     <w:unhideWhenUsed/>
-    <w:rsid w:val="00146507"/>
+    <w:rsid w:val="001C0F55"/>
     <w:pPr>
       <w:spacing w:after="100"/>
     </w:pPr>

</xml_diff>

<commit_message>
Phone Home cards, one company card on the server, and orders near their promised date
Home on the phone shows Admins and the SuperAdmin the business at a glance (GET /api/insights/overview: users by role, products, campaigns, trips, orders waiting) and a trip's profit and expenses only to them. The company card is kept on the server (APP_SETTINGS company_name/motto/code) - the same on every phone, cached for offline, changed only by the SuperAdmin (phone Home or desktop Settings). Orders still waiting for a delivery are flagged DUE SOON (last quarter of the promised time, at least 5 days before) and LATE (after the promised date) - DeliveryDeadline on the backend, orange and red rows on the desktop, coloured marks on the phone, counts on Home. Desktop table row colours now really show in the modern look (TintedDelegate). Eleven documents updated with 24 October rows.

Co-Authored-By: Claude Opus 5.5 <noreply@anthropic.com>
</commit_message>
<xml_diff>
--- a/documentation/00 Documentation Index.docx
+++ b/documentation/00 Documentation Index.docx
@@ -80,7 +80,7 @@
           <w:left w:w="10" w:type="dxa"/>
           <w:right w:w="10" w:type="dxa"/>
         </w:tblCellMar>
-        <w:tblLook w:val="0000" w:firstRow="0" w:lastRow="0" w:firstColumn="0" w:lastColumn="0" w:noHBand="0" w:noVBand="0"/>
+        <w:tblLook w:val="04A0" w:firstRow="1" w:lastRow="0" w:firstColumn="1" w:lastColumn="0" w:noHBand="0" w:noVBand="1"/>
       </w:tblPr>
       <w:tblGrid>
         <w:gridCol w:w="2600"/>
@@ -461,7 +461,7 @@
           <w:left w:w="10" w:type="dxa"/>
           <w:right w:w="10" w:type="dxa"/>
         </w:tblCellMar>
-        <w:tblLook w:val="0000" w:firstRow="0" w:lastRow="0" w:firstColumn="0" w:lastColumn="0" w:noHBand="0" w:noVBand="0"/>
+        <w:tblLook w:val="04A0" w:firstRow="1" w:lastRow="0" w:firstColumn="1" w:lastColumn="0" w:noHBand="0" w:noVBand="1"/>
       </w:tblPr>
       <w:tblGrid>
         <w:gridCol w:w="1300"/>
@@ -1599,6 +1599,74 @@
                 <w:szCs w:val="19"/>
               </w:rPr>
               <w:t>Profiles, passwords and the idle lock; the backend endpoint count brought up to date.</w:t>
+            </w:r>
+          </w:p>
+        </w:tc>
+      </w:tr>
+      <w:tr>
+        <w:tblPrEx>
+          <w:tblCellMar>
+            <w:top w:w="0" w:type="dxa"/>
+            <w:bottom w:w="0" w:type="dxa"/>
+          </w:tblCellMar>
+        </w:tblPrEx>
+        <w:tc>
+          <w:tcPr>
+            <w:tcW w:w="1300" w:type="dxa"/>
+            <w:tcMar>
+              <w:top w:w="50" w:type="dxa"/>
+              <w:left w:w="90" w:type="dxa"/>
+              <w:bottom w:w="50" w:type="dxa"/>
+              <w:right w:w="90" w:type="dxa"/>
+            </w:tcMar>
+          </w:tcPr>
+          <w:p>
+            <w:r>
+              <w:rPr>
+                <w:sz w:val="19"/>
+                <w:szCs w:val="19"/>
+              </w:rPr>
+              <w:t>1.1</w:t>
+            </w:r>
+          </w:p>
+        </w:tc>
+        <w:tc>
+          <w:tcPr>
+            <w:tcW w:w="1900" w:type="dxa"/>
+            <w:tcMar>
+              <w:top w:w="50" w:type="dxa"/>
+              <w:left w:w="90" w:type="dxa"/>
+              <w:bottom w:w="50" w:type="dxa"/>
+              <w:right w:w="90" w:type="dxa"/>
+            </w:tcMar>
+          </w:tcPr>
+          <w:p>
+            <w:r>
+              <w:rPr>
+                <w:sz w:val="19"/>
+                <w:szCs w:val="19"/>
+              </w:rPr>
+              <w:t>24 October 2026</w:t>
+            </w:r>
+          </w:p>
+        </w:tc>
+        <w:tc>
+          <w:tcPr>
+            <w:tcW w:w="6438" w:type="dxa"/>
+            <w:tcMar>
+              <w:top w:w="50" w:type="dxa"/>
+              <w:left w:w="90" w:type="dxa"/>
+              <w:bottom w:w="50" w:type="dxa"/>
+              <w:right w:w="90" w:type="dxa"/>
+            </w:tcMar>
+          </w:tcPr>
+          <w:p>
+            <w:r>
+              <w:rPr>
+                <w:sz w:val="19"/>
+                <w:szCs w:val="19"/>
+              </w:rPr>
+              <w:t>Phone Home cards, the company card and deadline flags; endpoint count brought up to date.</w:t>
             </w:r>
           </w:p>
         </w:tc>
@@ -1635,7 +1703,7 @@
     <w:sdt>
       <w:sdtPr>
         <w:alias w:val="Contents"/>
-        <w:id w:val="-1622838969"/>
+        <w:id w:val="285244555"/>
       </w:sdtPr>
       <w:sdtEndPr/>
       <w:sdtContent>
@@ -1662,7 +1730,7 @@
           <w:r>
             <w:fldChar w:fldCharType="separate"/>
           </w:r>
-          <w:hyperlink w:anchor="_Toc243693317" w:history="1">
+          <w:hyperlink w:anchor="_Toc243694795" w:history="1">
             <w:r>
               <w:rPr>
                 <w:rStyle w:val="Hyperlink"/>
@@ -1686,7 +1754,7 @@
               <w:rPr>
                 <w:noProof/>
               </w:rPr>
-              <w:instrText xml:space="preserve"> PAGEREF _Toc243693317 \h </w:instrText>
+              <w:instrText xml:space="preserve"> PAGEREF _Toc243694795 \h </w:instrText>
             </w:r>
             <w:r>
               <w:rPr>
@@ -1703,7 +1771,7 @@
               <w:rPr>
                 <w:noProof/>
               </w:rPr>
-              <w:t>3</w:t>
+              <w:t>4</w:t>
             </w:r>
             <w:r>
               <w:rPr>
@@ -1727,7 +1795,7 @@
               <w:szCs w:val="22"/>
             </w:rPr>
           </w:pPr>
-          <w:hyperlink w:anchor="_Toc243693318" w:history="1">
+          <w:hyperlink w:anchor="_Toc243694796" w:history="1">
             <w:r>
               <w:rPr>
                 <w:rStyle w:val="Hyperlink"/>
@@ -1751,7 +1819,7 @@
               <w:rPr>
                 <w:noProof/>
               </w:rPr>
-              <w:instrText xml:space="preserve"> PAGEREF _Toc243693318 \h </w:instrText>
+              <w:instrText xml:space="preserve"> PAGEREF _Toc243694796 \h </w:instrText>
             </w:r>
             <w:r>
               <w:rPr>
@@ -1768,7 +1836,7 @@
               <w:rPr>
                 <w:noProof/>
               </w:rPr>
-              <w:t>4</w:t>
+              <w:t>5</w:t>
             </w:r>
             <w:r>
               <w:rPr>
@@ -1792,7 +1860,7 @@
               <w:szCs w:val="22"/>
             </w:rPr>
           </w:pPr>
-          <w:hyperlink w:anchor="_Toc243693319" w:history="1">
+          <w:hyperlink w:anchor="_Toc243694797" w:history="1">
             <w:r>
               <w:rPr>
                 <w:rStyle w:val="Hyperlink"/>
@@ -1816,7 +1884,7 @@
               <w:rPr>
                 <w:noProof/>
               </w:rPr>
-              <w:instrText xml:space="preserve"> PAGEREF _Toc243693319 \h </w:instrText>
+              <w:instrText xml:space="preserve"> PAGEREF _Toc243694797 \h </w:instrText>
             </w:r>
             <w:r>
               <w:rPr>
@@ -1833,7 +1901,7 @@
               <w:rPr>
                 <w:noProof/>
               </w:rPr>
-              <w:t>5</w:t>
+              <w:t>6</w:t>
             </w:r>
             <w:r>
               <w:rPr>
@@ -1857,7 +1925,7 @@
               <w:szCs w:val="22"/>
             </w:rPr>
           </w:pPr>
-          <w:hyperlink w:anchor="_Toc243693320" w:history="1">
+          <w:hyperlink w:anchor="_Toc243694798" w:history="1">
             <w:r>
               <w:rPr>
                 <w:rStyle w:val="Hyperlink"/>
@@ -1881,7 +1949,7 @@
               <w:rPr>
                 <w:noProof/>
               </w:rPr>
-              <w:instrText xml:space="preserve"> PAGEREF _Toc243693320 \h </w:instrText>
+              <w:instrText xml:space="preserve"> PAGEREF _Toc243694798 \h </w:instrText>
             </w:r>
             <w:r>
               <w:rPr>
@@ -1898,7 +1966,7 @@
               <w:rPr>
                 <w:noProof/>
               </w:rPr>
-              <w:t>6</w:t>
+              <w:t>7</w:t>
             </w:r>
             <w:r>
               <w:rPr>
@@ -1917,6 +1985,7 @@
     </w:sdt>
     <w:p>
       <w:r>
+        <w:lastRenderedPageBreak/>
         <w:br w:type="page"/>
       </w:r>
     </w:p>
@@ -1924,7 +1993,7 @@
       <w:pPr>
         <w:pStyle w:val="Heading1"/>
       </w:pPr>
-      <w:bookmarkStart w:id="1" w:name="_Toc243693317"/>
+      <w:bookmarkStart w:id="1" w:name="_Toc243694795"/>
       <w:r>
         <w:lastRenderedPageBreak/>
         <w:t>1  About this documentation</w:t>
@@ -1962,7 +2031,7 @@
       <w:pPr>
         <w:pStyle w:val="Heading1"/>
       </w:pPr>
-      <w:bookmarkStart w:id="2" w:name="_Toc243693318"/>
+      <w:bookmarkStart w:id="2" w:name="_Toc243694796"/>
       <w:r>
         <w:lastRenderedPageBreak/>
         <w:t>2  Where to start</w:t>
@@ -1985,7 +2054,7 @@
           <w:left w:w="10" w:type="dxa"/>
           <w:right w:w="10" w:type="dxa"/>
         </w:tblCellMar>
-        <w:tblLook w:val="0000" w:firstRow="0" w:lastRow="0" w:firstColumn="0" w:lastColumn="0" w:noHBand="0" w:noVBand="0"/>
+        <w:tblLook w:val="04A0" w:firstRow="1" w:lastRow="0" w:firstColumn="1" w:lastColumn="0" w:noHBand="0" w:noVBand="1"/>
       </w:tblPr>
       <w:tblGrid>
         <w:gridCol w:w="3125"/>
@@ -2111,7 +2180,14 @@
                 <w:sz w:val="19"/>
                 <w:szCs w:val="19"/>
               </w:rPr>
-              <w:t>System Overview and Architecture; Configuration and Secrets Reference; Production Go-Live Checklist; Hosting and Deployment Guide; Running and Operating the System</w:t>
+              <w:t>System Overview and Architecture; Configuration and Secrets Reference; Pr</w:t>
+            </w:r>
+            <w:r>
+              <w:rPr>
+                <w:sz w:val="19"/>
+                <w:szCs w:val="19"/>
+              </w:rPr>
+              <w:t>oduction Go-Live Checklist; Hosting and Deployment Guide; Running and Operating the System</w:t>
             </w:r>
           </w:p>
         </w:tc>
@@ -2432,7 +2508,7 @@
       <w:pPr>
         <w:pStyle w:val="Heading1"/>
       </w:pPr>
-      <w:bookmarkStart w:id="3" w:name="_Toc243693319"/>
+      <w:bookmarkStart w:id="3" w:name="_Toc243694797"/>
       <w:r>
         <w:lastRenderedPageBreak/>
         <w:t>3  The documents</w:t>
@@ -2455,7 +2531,7 @@
           <w:left w:w="10" w:type="dxa"/>
           <w:right w:w="10" w:type="dxa"/>
         </w:tblCellMar>
-        <w:tblLook w:val="0000" w:firstRow="0" w:lastRow="0" w:firstColumn="0" w:lastColumn="0" w:noHBand="0" w:noVBand="0"/>
+        <w:tblLook w:val="04A0" w:firstRow="1" w:lastRow="0" w:firstColumn="1" w:lastColumn="0" w:noHBand="0" w:noVBand="1"/>
       </w:tblPr>
       <w:tblGrid>
         <w:gridCol w:w="2289"/>
@@ -3208,7 +3284,7 @@
                 <w:sz w:val="19"/>
                 <w:szCs w:val="19"/>
               </w:rPr>
-              <w:t>Java backend modules, security and approved phones, jobs, 179 endpoints</w:t>
+              <w:t>Java backend modules, security and approved phones, jobs, 182 endpoints</w:t>
             </w:r>
           </w:p>
         </w:tc>
@@ -4488,7 +4564,7 @@
       <w:pPr>
         <w:pStyle w:val="Heading1"/>
       </w:pPr>
-      <w:bookmarkStart w:id="4" w:name="_Toc243693320"/>
+      <w:bookmarkStart w:id="4" w:name="_Toc243694798"/>
       <w:r>
         <w:lastRenderedPageBreak/>
         <w:t>4  Conventions used</w:t>
@@ -4735,7 +4811,7 @@
         <w:sz w:val="16"/>
         <w:szCs w:val="16"/>
       </w:rPr>
-      <w:t>6</w:t>
+      <w:t>7</w:t>
     </w:r>
     <w:r>
       <w:rPr>
@@ -4784,7 +4860,7 @@
         <w:sz w:val="16"/>
         <w:szCs w:val="16"/>
       </w:rPr>
-      <w:t>6</w:t>
+      <w:t>7</w:t>
     </w:r>
     <w:r>
       <w:rPr>
@@ -4868,10 +4944,10 @@
 <file path=word/numbering.xml><?xml version="1.0" encoding="utf-8"?>
 <w:numbering xmlns:wpc="http://schemas.microsoft.com/office/word/2010/wordprocessingCanvas" xmlns:cx="http://schemas.microsoft.com/office/drawing/2014/chartex" xmlns:cx1="http://schemas.microsoft.com/office/drawing/2015/9/8/chartex" xmlns:mc="http://schemas.openxmlformats.org/markup-compatibility/2006" xmlns:o="urn:schemas-microsoft-com:office:office" xmlns:r="http://schemas.openxmlformats.org/officeDocument/2006/relationships" xmlns:m="http://schemas.openxmlformats.org/officeDocument/2006/math" xmlns:v="urn:schemas-microsoft-com:vml" xmlns:wp14="http://schemas.microsoft.com/office/word/2010/wordprocessingDrawing" xmlns:wp="http://schemas.openxmlformats.org/drawingml/2006/wordprocessingDrawing" xmlns:w10="urn:schemas-microsoft-com:office:word" xmlns:w="http://schemas.openxmlformats.org/wordprocessingml/2006/main" xmlns:w14="http://schemas.microsoft.com/office/word/2010/wordml" xmlns:w15="http://schemas.microsoft.com/office/word/2012/wordml" xmlns:w16se="http://schemas.microsoft.com/office/word/2015/wordml/symex" xmlns:wpg="http://schemas.microsoft.com/office/word/2010/wordprocessingGroup" xmlns:wpi="http://schemas.microsoft.com/office/word/2010/wordprocessingInk" xmlns:wne="http://schemas.microsoft.com/office/word/2006/wordml" xmlns:wps="http://schemas.microsoft.com/office/word/2010/wordprocessingShape" mc:Ignorable="w14 w15 w16se wp14">
   <w:abstractNum w:abstractNumId="0" w15:restartNumberingAfterBreak="0">
-    <w:nsid w:val="33E16A43"/>
+    <w:nsid w:val="4251684B"/>
     <w:multiLevelType w:val="hybridMultilevel"/>
-    <w:tmpl w:val="8F5C403A"/>
-    <w:lvl w:ilvl="0" w:tplc="3D3C82A6" w:tentative="1">
+    <w:tmpl w:val="9E62A93E"/>
+    <w:lvl w:ilvl="0" w:tplc="1A2A16F4" w:tentative="1">
       <w:start w:val="1"/>
       <w:numFmt w:val="decimal"/>
       <w:lvlText w:val="%1."/>
@@ -4880,7 +4956,7 @@
         <w:ind w:left="540" w:hanging="300"/>
       </w:pPr>
     </w:lvl>
-    <w:lvl w:ilvl="1" w:tplc="8DFED338" w:tentative="1">
+    <w:lvl w:ilvl="1" w:tplc="10F84DFE" w:tentative="1">
       <w:start w:val="1"/>
       <w:numFmt w:val="lowerLetter"/>
       <w:lvlText w:val="%2."/>
@@ -4889,7 +4965,7 @@
         <w:ind w:left="940" w:hanging="300"/>
       </w:pPr>
     </w:lvl>
-    <w:lvl w:ilvl="2" w:tplc="C44AC700" w:tentative="1">
+    <w:lvl w:ilvl="2" w:tplc="71B6F554" w:tentative="1">
       <w:start w:val="1"/>
       <w:numFmt w:val="lowerRoman"/>
       <w:lvlText w:val="%3."/>
@@ -4898,42 +4974,104 @@
         <w:ind w:left="1340" w:hanging="300"/>
       </w:pPr>
     </w:lvl>
-    <w:lvl w:ilvl="3" w:tplc="BFDE3A42">
+    <w:lvl w:ilvl="3" w:tplc="47D2D2CE">
       <w:numFmt w:val="decimal"/>
       <w:lvlText w:val=""/>
       <w:lvlJc w:val="left"/>
     </w:lvl>
-    <w:lvl w:ilvl="4" w:tplc="49A6C686">
+    <w:lvl w:ilvl="4" w:tplc="C5306F28">
       <w:numFmt w:val="decimal"/>
       <w:lvlText w:val=""/>
       <w:lvlJc w:val="left"/>
     </w:lvl>
-    <w:lvl w:ilvl="5" w:tplc="858A8168">
+    <w:lvl w:ilvl="5" w:tplc="D3CA77D8">
       <w:numFmt w:val="decimal"/>
       <w:lvlText w:val=""/>
       <w:lvlJc w:val="left"/>
     </w:lvl>
-    <w:lvl w:ilvl="6" w:tplc="F53C86AA">
+    <w:lvl w:ilvl="6" w:tplc="3478584C">
       <w:numFmt w:val="decimal"/>
       <w:lvlText w:val=""/>
       <w:lvlJc w:val="left"/>
     </w:lvl>
-    <w:lvl w:ilvl="7" w:tplc="C70CB560">
+    <w:lvl w:ilvl="7" w:tplc="F25EC282">
       <w:numFmt w:val="decimal"/>
       <w:lvlText w:val=""/>
       <w:lvlJc w:val="left"/>
     </w:lvl>
-    <w:lvl w:ilvl="8" w:tplc="A4B68A6A">
+    <w:lvl w:ilvl="8" w:tplc="A3A802A6">
       <w:numFmt w:val="decimal"/>
       <w:lvlText w:val=""/>
       <w:lvlJc w:val="left"/>
     </w:lvl>
   </w:abstractNum>
   <w:abstractNum w:abstractNumId="1" w15:restartNumberingAfterBreak="0">
-    <w:nsid w:val="4A7F22FD"/>
+    <w:nsid w:val="649744D7"/>
     <w:multiLevelType w:val="hybridMultilevel"/>
-    <w:tmpl w:val="D93C5F98"/>
-    <w:lvl w:ilvl="0" w:tplc="C9CE6D8E" w:tentative="1">
+    <w:tmpl w:val="3C444556"/>
+    <w:lvl w:ilvl="0" w:tplc="5B8ECB94">
+      <w:start w:val="1"/>
+      <w:numFmt w:val="bullet"/>
+      <w:lvlText w:val="•"/>
+      <w:lvlJc w:val="left"/>
+      <w:pPr>
+        <w:ind w:left="540" w:hanging="300"/>
+      </w:pPr>
+    </w:lvl>
+    <w:lvl w:ilvl="1" w:tplc="A1B675A8" w:tentative="1">
+      <w:start w:val="1"/>
+      <w:numFmt w:val="bullet"/>
+      <w:lvlText w:val="–"/>
+      <w:lvlJc w:val="left"/>
+      <w:pPr>
+        <w:ind w:left="940" w:hanging="300"/>
+      </w:pPr>
+    </w:lvl>
+    <w:lvl w:ilvl="2" w:tplc="21C84E18" w:tentative="1">
+      <w:start w:val="1"/>
+      <w:numFmt w:val="bullet"/>
+      <w:lvlText w:val="◦"/>
+      <w:lvlJc w:val="left"/>
+      <w:pPr>
+        <w:ind w:left="1340" w:hanging="300"/>
+      </w:pPr>
+    </w:lvl>
+    <w:lvl w:ilvl="3" w:tplc="72686EE2">
+      <w:numFmt w:val="decimal"/>
+      <w:lvlText w:val=""/>
+      <w:lvlJc w:val="left"/>
+    </w:lvl>
+    <w:lvl w:ilvl="4" w:tplc="67E080A2">
+      <w:numFmt w:val="decimal"/>
+      <w:lvlText w:val=""/>
+      <w:lvlJc w:val="left"/>
+    </w:lvl>
+    <w:lvl w:ilvl="5" w:tplc="306AC012">
+      <w:numFmt w:val="decimal"/>
+      <w:lvlText w:val=""/>
+      <w:lvlJc w:val="left"/>
+    </w:lvl>
+    <w:lvl w:ilvl="6" w:tplc="1A7C9076">
+      <w:numFmt w:val="decimal"/>
+      <w:lvlText w:val=""/>
+      <w:lvlJc w:val="left"/>
+    </w:lvl>
+    <w:lvl w:ilvl="7" w:tplc="AAB6B70C">
+      <w:numFmt w:val="decimal"/>
+      <w:lvlText w:val=""/>
+      <w:lvlJc w:val="left"/>
+    </w:lvl>
+    <w:lvl w:ilvl="8" w:tplc="D728D414">
+      <w:numFmt w:val="decimal"/>
+      <w:lvlText w:val=""/>
+      <w:lvlJc w:val="left"/>
+    </w:lvl>
+  </w:abstractNum>
+  <w:abstractNum w:abstractNumId="2" w15:restartNumberingAfterBreak="0">
+    <w:nsid w:val="6F350A65"/>
+    <w:multiLevelType w:val="hybridMultilevel"/>
+    <w:tmpl w:val="D57CABCA"/>
+    <w:lvl w:ilvl="0" w:tplc="DAD22B80" w:tentative="1">
       <w:start w:val="1"/>
       <w:numFmt w:val="bullet"/>
       <w:lvlText w:val="●"/>
@@ -4942,7 +5080,7 @@
         <w:ind w:left="720" w:hanging="360"/>
       </w:pPr>
     </w:lvl>
-    <w:lvl w:ilvl="1" w:tplc="64EC4010" w:tentative="1">
+    <w:lvl w:ilvl="1" w:tplc="31C49A54" w:tentative="1">
       <w:start w:val="1"/>
       <w:numFmt w:val="bullet"/>
       <w:lvlText w:val="○"/>
@@ -4951,7 +5089,7 @@
         <w:ind w:left="1440" w:hanging="360"/>
       </w:pPr>
     </w:lvl>
-    <w:lvl w:ilvl="2" w:tplc="EFEE4334" w:tentative="1">
+    <w:lvl w:ilvl="2" w:tplc="2D9053B8" w:tentative="1">
       <w:start w:val="1"/>
       <w:numFmt w:val="bullet"/>
       <w:lvlText w:val="■"/>
@@ -4960,7 +5098,7 @@
         <w:ind w:left="2160" w:hanging="360"/>
       </w:pPr>
     </w:lvl>
-    <w:lvl w:ilvl="3" w:tplc="9B9E8460" w:tentative="1">
+    <w:lvl w:ilvl="3" w:tplc="0FEADBD4" w:tentative="1">
       <w:start w:val="1"/>
       <w:numFmt w:val="bullet"/>
       <w:lvlText w:val="●"/>
@@ -4969,7 +5107,7 @@
         <w:ind w:left="2880" w:hanging="360"/>
       </w:pPr>
     </w:lvl>
-    <w:lvl w:ilvl="4" w:tplc="B798B962" w:tentative="1">
+    <w:lvl w:ilvl="4" w:tplc="037044CE" w:tentative="1">
       <w:start w:val="1"/>
       <w:numFmt w:val="bullet"/>
       <w:lvlText w:val="○"/>
@@ -4978,7 +5116,7 @@
         <w:ind w:left="3600" w:hanging="360"/>
       </w:pPr>
     </w:lvl>
-    <w:lvl w:ilvl="5" w:tplc="950A2EB6" w:tentative="1">
+    <w:lvl w:ilvl="5" w:tplc="082AAE74" w:tentative="1">
       <w:start w:val="1"/>
       <w:numFmt w:val="bullet"/>
       <w:lvlText w:val="■"/>
@@ -4987,7 +5125,7 @@
         <w:ind w:left="4320" w:hanging="360"/>
       </w:pPr>
     </w:lvl>
-    <w:lvl w:ilvl="6" w:tplc="6D862E3A" w:tentative="1">
+    <w:lvl w:ilvl="6" w:tplc="1E48F842" w:tentative="1">
       <w:start w:val="1"/>
       <w:numFmt w:val="bullet"/>
       <w:lvlText w:val="●"/>
@@ -4996,7 +5134,7 @@
         <w:ind w:left="5040" w:hanging="360"/>
       </w:pPr>
     </w:lvl>
-    <w:lvl w:ilvl="7" w:tplc="F5FA1F84" w:tentative="1">
+    <w:lvl w:ilvl="7" w:tplc="AF92F4AC" w:tentative="1">
       <w:start w:val="1"/>
       <w:numFmt w:val="bullet"/>
       <w:lvlText w:val="●"/>
@@ -5005,7 +5143,7 @@
         <w:ind w:left="5760" w:hanging="360"/>
       </w:pPr>
     </w:lvl>
-    <w:lvl w:ilvl="8" w:tplc="745A2C26" w:tentative="1">
+    <w:lvl w:ilvl="8" w:tplc="024C9A3E" w:tentative="1">
       <w:start w:val="1"/>
       <w:numFmt w:val="bullet"/>
       <w:lvlText w:val="●"/>
@@ -5015,76 +5153,14 @@
       </w:pPr>
     </w:lvl>
   </w:abstractNum>
-  <w:abstractNum w:abstractNumId="2" w15:restartNumberingAfterBreak="0">
-    <w:nsid w:val="7DBF64F7"/>
-    <w:multiLevelType w:val="hybridMultilevel"/>
-    <w:tmpl w:val="3C9EF8FE"/>
-    <w:lvl w:ilvl="0" w:tplc="B9F4347E">
-      <w:start w:val="1"/>
-      <w:numFmt w:val="bullet"/>
-      <w:lvlText w:val="•"/>
-      <w:lvlJc w:val="left"/>
-      <w:pPr>
-        <w:ind w:left="540" w:hanging="300"/>
-      </w:pPr>
-    </w:lvl>
-    <w:lvl w:ilvl="1" w:tplc="463E1994" w:tentative="1">
-      <w:start w:val="1"/>
-      <w:numFmt w:val="bullet"/>
-      <w:lvlText w:val="–"/>
-      <w:lvlJc w:val="left"/>
-      <w:pPr>
-        <w:ind w:left="940" w:hanging="300"/>
-      </w:pPr>
-    </w:lvl>
-    <w:lvl w:ilvl="2" w:tplc="B41AB9B2" w:tentative="1">
-      <w:start w:val="1"/>
-      <w:numFmt w:val="bullet"/>
-      <w:lvlText w:val="◦"/>
-      <w:lvlJc w:val="left"/>
-      <w:pPr>
-        <w:ind w:left="1340" w:hanging="300"/>
-      </w:pPr>
-    </w:lvl>
-    <w:lvl w:ilvl="3" w:tplc="85B63170">
-      <w:numFmt w:val="decimal"/>
-      <w:lvlText w:val=""/>
-      <w:lvlJc w:val="left"/>
-    </w:lvl>
-    <w:lvl w:ilvl="4" w:tplc="094291DE">
-      <w:numFmt w:val="decimal"/>
-      <w:lvlText w:val=""/>
-      <w:lvlJc w:val="left"/>
-    </w:lvl>
-    <w:lvl w:ilvl="5" w:tplc="981251C8">
-      <w:numFmt w:val="decimal"/>
-      <w:lvlText w:val=""/>
-      <w:lvlJc w:val="left"/>
-    </w:lvl>
-    <w:lvl w:ilvl="6" w:tplc="D51C544A">
-      <w:numFmt w:val="decimal"/>
-      <w:lvlText w:val=""/>
-      <w:lvlJc w:val="left"/>
-    </w:lvl>
-    <w:lvl w:ilvl="7" w:tplc="FD66B51A">
-      <w:numFmt w:val="decimal"/>
-      <w:lvlText w:val=""/>
-      <w:lvlJc w:val="left"/>
-    </w:lvl>
-    <w:lvl w:ilvl="8" w:tplc="273A66F6">
-      <w:numFmt w:val="decimal"/>
-      <w:lvlText w:val=""/>
-      <w:lvlJc w:val="left"/>
-    </w:lvl>
-  </w:abstractNum>
   <w:num w:numId="1">
-    <w:abstractNumId w:val="1"/>
+    <w:abstractNumId w:val="2"/>
     <w:lvlOverride w:ilvl="0">
       <w:startOverride w:val="1"/>
     </w:lvlOverride>
   </w:num>
   <w:num w:numId="2">
-    <w:abstractNumId w:val="2"/>
+    <w:abstractNumId w:val="1"/>
     <w:lvlOverride w:ilvl="0">
       <w:startOverride w:val="1"/>
     </w:lvlOverride>
@@ -5713,7 +5789,7 @@
     <w:autoRedefine/>
     <w:uiPriority w:val="39"/>
     <w:unhideWhenUsed/>
-    <w:rsid w:val="0063194F"/>
+    <w:rsid w:val="000101DE"/>
     <w:pPr>
       <w:spacing w:after="100"/>
     </w:pPr>

</xml_diff>

<commit_message>
Phone: error messages in a box that scrolls instead of spilling over
"some errors are kind of long ... some go over other thins so ... the space can e.g be scrollable": every error the phone app shows (66 places in 49 screens - forms, load failures, sign-in, payments, the assistant) is now an ErrorBox (ui/common/ErrorBox.kt): tinted, at most about four lines tall, scrolling inside itself with a thin bar when longer, so it never pushes the screen around or slides under the floating assistant button. Static titles and red Delete buttons are unchanged. Four documents updated (and why the USB test copy can't reach the server unplugged).

Co-Authored-By: Claude Opus 5.5 <noreply@anthropic.com>
</commit_message>
<xml_diff>
--- a/documentation/00 Documentation Index.docx
+++ b/documentation/00 Documentation Index.docx
@@ -1814,6 +1814,74 @@
           </w:p>
         </w:tc>
       </w:tr>
+      <w:tr>
+        <w:tblPrEx>
+          <w:tblCellMar>
+            <w:top w:w="0" w:type="dxa"/>
+            <w:bottom w:w="0" w:type="dxa"/>
+          </w:tblCellMar>
+        </w:tblPrEx>
+        <w:tc>
+          <w:tcPr>
+            <w:tcW w:w="1300" w:type="dxa"/>
+            <w:tcMar>
+              <w:top w:w="50" w:type="dxa"/>
+              <w:left w:w="90" w:type="dxa"/>
+              <w:bottom w:w="50" w:type="dxa"/>
+              <w:right w:w="90" w:type="dxa"/>
+            </w:tcMar>
+          </w:tcPr>
+          <w:p>
+            <w:r>
+              <w:rPr>
+                <w:sz w:val="19"/>
+                <w:szCs w:val="19"/>
+              </w:rPr>
+              <w:t>1.1</w:t>
+            </w:r>
+          </w:p>
+        </w:tc>
+        <w:tc>
+          <w:tcPr>
+            <w:tcW w:w="1900" w:type="dxa"/>
+            <w:tcMar>
+              <w:top w:w="50" w:type="dxa"/>
+              <w:left w:w="90" w:type="dxa"/>
+              <w:bottom w:w="50" w:type="dxa"/>
+              <w:right w:w="90" w:type="dxa"/>
+            </w:tcMar>
+          </w:tcPr>
+          <w:p>
+            <w:r>
+              <w:rPr>
+                <w:sz w:val="19"/>
+                <w:szCs w:val="19"/>
+              </w:rPr>
+              <w:t>24 October 2026</w:t>
+            </w:r>
+          </w:p>
+        </w:tc>
+        <w:tc>
+          <w:tcPr>
+            <w:tcW w:w="6438" w:type="dxa"/>
+            <w:tcMar>
+              <w:top w:w="50" w:type="dxa"/>
+              <w:left w:w="90" w:type="dxa"/>
+              <w:bottom w:w="50" w:type="dxa"/>
+              <w:right w:w="90" w:type="dxa"/>
+            </w:tcMar>
+          </w:tcPr>
+          <w:p>
+            <w:r>
+              <w:rPr>
+                <w:sz w:val="19"/>
+                <w:szCs w:val="19"/>
+              </w:rPr>
+              <w:t>Phone error messages in a scrolling box.</w:t>
+            </w:r>
+          </w:p>
+        </w:tc>
+      </w:tr>
     </w:tbl>
     <w:p>
       <w:pPr>
@@ -1846,7 +1914,7 @@
     <w:sdt>
       <w:sdtPr>
         <w:alias w:val="Contents"/>
-        <w:id w:val="-845245457"/>
+        <w:id w:val="659433312"/>
       </w:sdtPr>
       <w:sdtEndPr/>
       <w:sdtContent>
@@ -1873,7 +1941,7 @@
           <w:r>
             <w:fldChar w:fldCharType="separate"/>
           </w:r>
-          <w:hyperlink w:anchor="_Toc243700217" w:history="1">
+          <w:hyperlink w:anchor="_Toc243722779" w:history="1">
             <w:r>
               <w:rPr>
                 <w:rStyle w:val="Hyperlink"/>
@@ -1897,7 +1965,7 @@
               <w:rPr>
                 <w:noProof/>
               </w:rPr>
-              <w:instrText xml:space="preserve"> PAGEREF _Toc243700217 \h </w:instrText>
+              <w:instrText xml:space="preserve"> PAGEREF _Toc243722779 \h </w:instrText>
             </w:r>
             <w:r>
               <w:rPr>
@@ -1938,7 +2006,7 @@
               <w:szCs w:val="22"/>
             </w:rPr>
           </w:pPr>
-          <w:hyperlink w:anchor="_Toc243700218" w:history="1">
+          <w:hyperlink w:anchor="_Toc243722780" w:history="1">
             <w:r>
               <w:rPr>
                 <w:rStyle w:val="Hyperlink"/>
@@ -1962,7 +2030,7 @@
               <w:rPr>
                 <w:noProof/>
               </w:rPr>
-              <w:instrText xml:space="preserve"> PAGEREF _Toc243700218 \h </w:instrText>
+              <w:instrText xml:space="preserve"> PAGEREF _Toc243722780 \h </w:instrText>
             </w:r>
             <w:r>
               <w:rPr>
@@ -2003,7 +2071,7 @@
               <w:szCs w:val="22"/>
             </w:rPr>
           </w:pPr>
-          <w:hyperlink w:anchor="_Toc243700219" w:history="1">
+          <w:hyperlink w:anchor="_Toc243722781" w:history="1">
             <w:r>
               <w:rPr>
                 <w:rStyle w:val="Hyperlink"/>
@@ -2027,7 +2095,7 @@
               <w:rPr>
                 <w:noProof/>
               </w:rPr>
-              <w:instrText xml:space="preserve"> PAGEREF _Toc243700219 \h </w:instrText>
+              <w:instrText xml:space="preserve"> PAGEREF _Toc243722781 \h </w:instrText>
             </w:r>
             <w:r>
               <w:rPr>
@@ -2068,7 +2136,7 @@
               <w:szCs w:val="22"/>
             </w:rPr>
           </w:pPr>
-          <w:hyperlink w:anchor="_Toc243700220" w:history="1">
+          <w:hyperlink w:anchor="_Toc243722782" w:history="1">
             <w:r>
               <w:rPr>
                 <w:rStyle w:val="Hyperlink"/>
@@ -2092,7 +2160,7 @@
               <w:rPr>
                 <w:noProof/>
               </w:rPr>
-              <w:instrText xml:space="preserve"> PAGEREF _Toc243700220 \h </w:instrText>
+              <w:instrText xml:space="preserve"> PAGEREF _Toc243722782 \h </w:instrText>
             </w:r>
             <w:r>
               <w:rPr>
@@ -2135,7 +2203,7 @@
       <w:pPr>
         <w:pStyle w:val="Heading1"/>
       </w:pPr>
-      <w:bookmarkStart w:id="1" w:name="_Toc243700217"/>
+      <w:bookmarkStart w:id="1" w:name="_Toc243722779"/>
       <w:r>
         <w:lastRenderedPageBreak/>
         <w:t>1  About this documentation</w:t>
@@ -2147,10 +2215,13 @@
         <w:spacing w:after="120" w:line="276" w:lineRule="auto"/>
       </w:pPr>
       <w:r>
-        <w:t>This folder documents the complete Dateroem Wood Sales system as it stood on 3 October 2026 (updated on 4 October 2026 with the changes made that evening, and on 5 October 2026 for the desktop app working from any computer): the core backend, the database,</w:t>
+        <w:t>This folder documents the complete Dateroem Wood Sales system as it stood on 3 October 2026 (updated on 4 October 2026 with the changes made that evening, and on 5 October 2026 for the desktop ap</w:t>
       </w:r>
       <w:r>
-        <w:t xml:space="preserve"> payments and AI, the customer website, the staff mobile app, the desktop administration app, the servers behind each of them, and how to run and change everything. The documents were written from the source code itself.</w:t>
+        <w:t>p working from any computer): the core backend, the database, payments and AI, the customer website, the staff mobile app, the desktop administration app, the servers behind each of them, and how to run and change everything. The documents were written fro</w:t>
+      </w:r>
+      <w:r>
+        <w:t>m the source code itself.</w:t>
       </w:r>
     </w:p>
     <w:p>
@@ -2158,10 +2229,7 @@
         <w:spacing w:after="120" w:line="276" w:lineRule="auto"/>
       </w:pPr>
       <w:r>
-        <w:t>All documents are ordinary Word fil</w:t>
-      </w:r>
-      <w:r>
-        <w:t>es and can be edited directly. Each has a "Document control" table at the front - add a line there whenever you change it.</w:t>
+        <w:t>All documents are ordinary Word files and can be edited directly. Each has a "Document control" table at the front - add a line there whenever you change it.</w:t>
       </w:r>
     </w:p>
     <w:p>
@@ -2173,7 +2241,7 @@
       <w:pPr>
         <w:pStyle w:val="Heading1"/>
       </w:pPr>
-      <w:bookmarkStart w:id="2" w:name="_Toc243700218"/>
+      <w:bookmarkStart w:id="2" w:name="_Toc243722780"/>
       <w:r>
         <w:lastRenderedPageBreak/>
         <w:t>2  Where to start</w:t>
@@ -2322,14 +2390,7 @@
                 <w:sz w:val="19"/>
                 <w:szCs w:val="19"/>
               </w:rPr>
-              <w:t>System Overview and Architecture; Configuration and Secrets Reference; Pr</w:t>
-            </w:r>
-            <w:r>
-              <w:rPr>
-                <w:sz w:val="19"/>
-                <w:szCs w:val="19"/>
-              </w:rPr>
-              <w:t>oduction Go-Live Checklist; Hosting and Deployment Guide; Running and Operating the System</w:t>
+              <w:t>System Overview and Architecture; Configuration and Secrets Reference; Production Go-Live Checklist; Hosting and Deployment Guide; Running and Operating the System</w:t>
             </w:r>
           </w:p>
         </w:tc>
@@ -2390,7 +2451,14 @@
                 <w:sz w:val="19"/>
                 <w:szCs w:val="19"/>
               </w:rPr>
-              <w:t>Hosting and Deployment Guide (every value to change after the move is listed there); Production Go-Live Checklist</w:t>
+              <w:t xml:space="preserve">Hosting and Deployment Guide (every value </w:t>
+            </w:r>
+            <w:r>
+              <w:rPr>
+                <w:sz w:val="19"/>
+                <w:szCs w:val="19"/>
+              </w:rPr>
+              <w:t>to change after the move is listed there); Production Go-Live Checklist</w:t>
             </w:r>
           </w:p>
         </w:tc>
@@ -2650,7 +2718,7 @@
       <w:pPr>
         <w:pStyle w:val="Heading1"/>
       </w:pPr>
-      <w:bookmarkStart w:id="3" w:name="_Toc243700219"/>
+      <w:bookmarkStart w:id="3" w:name="_Toc243722781"/>
       <w:r>
         <w:lastRenderedPageBreak/>
         <w:t>3  The documents</w:t>
@@ -4706,7 +4774,7 @@
       <w:pPr>
         <w:pStyle w:val="Heading1"/>
       </w:pPr>
-      <w:bookmarkStart w:id="4" w:name="_Toc243700220"/>
+      <w:bookmarkStart w:id="4" w:name="_Toc243722782"/>
       <w:r>
         <w:lastRenderedPageBreak/>
         <w:t>4  Conventions used</w:t>
@@ -5078,10 +5146,72 @@
 <file path=word/numbering.xml><?xml version="1.0" encoding="utf-8"?>
 <w:numbering xmlns:wpc="http://schemas.microsoft.com/office/word/2010/wordprocessingCanvas" xmlns:cx="http://schemas.microsoft.com/office/drawing/2014/chartex" xmlns:cx1="http://schemas.microsoft.com/office/drawing/2015/9/8/chartex" xmlns:mc="http://schemas.openxmlformats.org/markup-compatibility/2006" xmlns:o="urn:schemas-microsoft-com:office:office" xmlns:r="http://schemas.openxmlformats.org/officeDocument/2006/relationships" xmlns:m="http://schemas.openxmlformats.org/officeDocument/2006/math" xmlns:v="urn:schemas-microsoft-com:vml" xmlns:wp14="http://schemas.microsoft.com/office/word/2010/wordprocessingDrawing" xmlns:wp="http://schemas.openxmlformats.org/drawingml/2006/wordprocessingDrawing" xmlns:w10="urn:schemas-microsoft-com:office:word" xmlns:w="http://schemas.openxmlformats.org/wordprocessingml/2006/main" xmlns:w14="http://schemas.microsoft.com/office/word/2010/wordml" xmlns:w15="http://schemas.microsoft.com/office/word/2012/wordml" xmlns:w16se="http://schemas.microsoft.com/office/word/2015/wordml/symex" xmlns:wpg="http://schemas.microsoft.com/office/word/2010/wordprocessingGroup" xmlns:wpi="http://schemas.microsoft.com/office/word/2010/wordprocessingInk" xmlns:wne="http://schemas.microsoft.com/office/word/2006/wordml" xmlns:wps="http://schemas.microsoft.com/office/word/2010/wordprocessingShape" mc:Ignorable="w14 w15 w16se wp14">
   <w:abstractNum w:abstractNumId="0" w15:restartNumberingAfterBreak="0">
-    <w:nsid w:val="1732153D"/>
+    <w:nsid w:val="39CD224F"/>
     <w:multiLevelType w:val="hybridMultilevel"/>
-    <w:tmpl w:val="04E058E6"/>
-    <w:lvl w:ilvl="0" w:tplc="E17C11BE" w:tentative="1">
+    <w:tmpl w:val="CC5435AA"/>
+    <w:lvl w:ilvl="0" w:tplc="268293AA" w:tentative="1">
+      <w:start w:val="1"/>
+      <w:numFmt w:val="decimal"/>
+      <w:lvlText w:val="%1."/>
+      <w:lvlJc w:val="left"/>
+      <w:pPr>
+        <w:ind w:left="540" w:hanging="300"/>
+      </w:pPr>
+    </w:lvl>
+    <w:lvl w:ilvl="1" w:tplc="8996A6C8" w:tentative="1">
+      <w:start w:val="1"/>
+      <w:numFmt w:val="lowerLetter"/>
+      <w:lvlText w:val="%2."/>
+      <w:lvlJc w:val="left"/>
+      <w:pPr>
+        <w:ind w:left="940" w:hanging="300"/>
+      </w:pPr>
+    </w:lvl>
+    <w:lvl w:ilvl="2" w:tplc="B7723D82" w:tentative="1">
+      <w:start w:val="1"/>
+      <w:numFmt w:val="lowerRoman"/>
+      <w:lvlText w:val="%3."/>
+      <w:lvlJc w:val="left"/>
+      <w:pPr>
+        <w:ind w:left="1340" w:hanging="300"/>
+      </w:pPr>
+    </w:lvl>
+    <w:lvl w:ilvl="3" w:tplc="0164DA2E">
+      <w:numFmt w:val="decimal"/>
+      <w:lvlText w:val=""/>
+      <w:lvlJc w:val="left"/>
+    </w:lvl>
+    <w:lvl w:ilvl="4" w:tplc="960CE1AA">
+      <w:numFmt w:val="decimal"/>
+      <w:lvlText w:val=""/>
+      <w:lvlJc w:val="left"/>
+    </w:lvl>
+    <w:lvl w:ilvl="5" w:tplc="F272BD9A">
+      <w:numFmt w:val="decimal"/>
+      <w:lvlText w:val=""/>
+      <w:lvlJc w:val="left"/>
+    </w:lvl>
+    <w:lvl w:ilvl="6" w:tplc="5D282CB6">
+      <w:numFmt w:val="decimal"/>
+      <w:lvlText w:val=""/>
+      <w:lvlJc w:val="left"/>
+    </w:lvl>
+    <w:lvl w:ilvl="7" w:tplc="CB7AB1CE">
+      <w:numFmt w:val="decimal"/>
+      <w:lvlText w:val=""/>
+      <w:lvlJc w:val="left"/>
+    </w:lvl>
+    <w:lvl w:ilvl="8" w:tplc="A046417C">
+      <w:numFmt w:val="decimal"/>
+      <w:lvlText w:val=""/>
+      <w:lvlJc w:val="left"/>
+    </w:lvl>
+  </w:abstractNum>
+  <w:abstractNum w:abstractNumId="1" w15:restartNumberingAfterBreak="0">
+    <w:nsid w:val="516142AD"/>
+    <w:multiLevelType w:val="hybridMultilevel"/>
+    <w:tmpl w:val="6C74FA92"/>
+    <w:lvl w:ilvl="0" w:tplc="7E24C336" w:tentative="1">
       <w:start w:val="1"/>
       <w:numFmt w:val="bullet"/>
       <w:lvlText w:val="●"/>
@@ -5090,7 +5220,7 @@
         <w:ind w:left="720" w:hanging="360"/>
       </w:pPr>
     </w:lvl>
-    <w:lvl w:ilvl="1" w:tplc="10B40EE6" w:tentative="1">
+    <w:lvl w:ilvl="1" w:tplc="9F728666" w:tentative="1">
       <w:start w:val="1"/>
       <w:numFmt w:val="bullet"/>
       <w:lvlText w:val="○"/>
@@ -5099,7 +5229,7 @@
         <w:ind w:left="1440" w:hanging="360"/>
       </w:pPr>
     </w:lvl>
-    <w:lvl w:ilvl="2" w:tplc="02641F5A" w:tentative="1">
+    <w:lvl w:ilvl="2" w:tplc="9710C9F0" w:tentative="1">
       <w:start w:val="1"/>
       <w:numFmt w:val="bullet"/>
       <w:lvlText w:val="■"/>
@@ -5108,7 +5238,7 @@
         <w:ind w:left="2160" w:hanging="360"/>
       </w:pPr>
     </w:lvl>
-    <w:lvl w:ilvl="3" w:tplc="40962B82" w:tentative="1">
+    <w:lvl w:ilvl="3" w:tplc="81201370" w:tentative="1">
       <w:start w:val="1"/>
       <w:numFmt w:val="bullet"/>
       <w:lvlText w:val="●"/>
@@ -5117,7 +5247,7 @@
         <w:ind w:left="2880" w:hanging="360"/>
       </w:pPr>
     </w:lvl>
-    <w:lvl w:ilvl="4" w:tplc="6D6C57B8" w:tentative="1">
+    <w:lvl w:ilvl="4" w:tplc="3510F316" w:tentative="1">
       <w:start w:val="1"/>
       <w:numFmt w:val="bullet"/>
       <w:lvlText w:val="○"/>
@@ -5126,7 +5256,7 @@
         <w:ind w:left="3600" w:hanging="360"/>
       </w:pPr>
     </w:lvl>
-    <w:lvl w:ilvl="5" w:tplc="A1EEC0C8" w:tentative="1">
+    <w:lvl w:ilvl="5" w:tplc="544C4C40" w:tentative="1">
       <w:start w:val="1"/>
       <w:numFmt w:val="bullet"/>
       <w:lvlText w:val="■"/>
@@ -5135,7 +5265,7 @@
         <w:ind w:left="4320" w:hanging="360"/>
       </w:pPr>
     </w:lvl>
-    <w:lvl w:ilvl="6" w:tplc="38545022" w:tentative="1">
+    <w:lvl w:ilvl="6" w:tplc="AEEC2D14" w:tentative="1">
       <w:start w:val="1"/>
       <w:numFmt w:val="bullet"/>
       <w:lvlText w:val="●"/>
@@ -5144,7 +5274,7 @@
         <w:ind w:left="5040" w:hanging="360"/>
       </w:pPr>
     </w:lvl>
-    <w:lvl w:ilvl="7" w:tplc="C3064454" w:tentative="1">
+    <w:lvl w:ilvl="7" w:tplc="DC62349C" w:tentative="1">
       <w:start w:val="1"/>
       <w:numFmt w:val="bullet"/>
       <w:lvlText w:val="●"/>
@@ -5153,7 +5283,7 @@
         <w:ind w:left="5760" w:hanging="360"/>
       </w:pPr>
     </w:lvl>
-    <w:lvl w:ilvl="8" w:tplc="DAE647B8" w:tentative="1">
+    <w:lvl w:ilvl="8" w:tplc="C576DC2A" w:tentative="1">
       <w:start w:val="1"/>
       <w:numFmt w:val="bullet"/>
       <w:lvlText w:val="●"/>
@@ -5163,73 +5293,11 @@
       </w:pPr>
     </w:lvl>
   </w:abstractNum>
-  <w:abstractNum w:abstractNumId="1" w15:restartNumberingAfterBreak="0">
-    <w:nsid w:val="44FB23D0"/>
+  <w:abstractNum w:abstractNumId="2" w15:restartNumberingAfterBreak="0">
+    <w:nsid w:val="7BAB1F75"/>
     <w:multiLevelType w:val="hybridMultilevel"/>
-    <w:tmpl w:val="4FB41286"/>
-    <w:lvl w:ilvl="0" w:tplc="159A2D0E" w:tentative="1">
-      <w:start w:val="1"/>
-      <w:numFmt w:val="decimal"/>
-      <w:lvlText w:val="%1."/>
-      <w:lvlJc w:val="left"/>
-      <w:pPr>
-        <w:ind w:left="540" w:hanging="300"/>
-      </w:pPr>
-    </w:lvl>
-    <w:lvl w:ilvl="1" w:tplc="E528C04C" w:tentative="1">
-      <w:start w:val="1"/>
-      <w:numFmt w:val="lowerLetter"/>
-      <w:lvlText w:val="%2."/>
-      <w:lvlJc w:val="left"/>
-      <w:pPr>
-        <w:ind w:left="940" w:hanging="300"/>
-      </w:pPr>
-    </w:lvl>
-    <w:lvl w:ilvl="2" w:tplc="9F32EA4E" w:tentative="1">
-      <w:start w:val="1"/>
-      <w:numFmt w:val="lowerRoman"/>
-      <w:lvlText w:val="%3."/>
-      <w:lvlJc w:val="left"/>
-      <w:pPr>
-        <w:ind w:left="1340" w:hanging="300"/>
-      </w:pPr>
-    </w:lvl>
-    <w:lvl w:ilvl="3" w:tplc="5D3E893C">
-      <w:numFmt w:val="decimal"/>
-      <w:lvlText w:val=""/>
-      <w:lvlJc w:val="left"/>
-    </w:lvl>
-    <w:lvl w:ilvl="4" w:tplc="4B76469E">
-      <w:numFmt w:val="decimal"/>
-      <w:lvlText w:val=""/>
-      <w:lvlJc w:val="left"/>
-    </w:lvl>
-    <w:lvl w:ilvl="5" w:tplc="95C4F2BE">
-      <w:numFmt w:val="decimal"/>
-      <w:lvlText w:val=""/>
-      <w:lvlJc w:val="left"/>
-    </w:lvl>
-    <w:lvl w:ilvl="6" w:tplc="16425178">
-      <w:numFmt w:val="decimal"/>
-      <w:lvlText w:val=""/>
-      <w:lvlJc w:val="left"/>
-    </w:lvl>
-    <w:lvl w:ilvl="7" w:tplc="E604EB3A">
-      <w:numFmt w:val="decimal"/>
-      <w:lvlText w:val=""/>
-      <w:lvlJc w:val="left"/>
-    </w:lvl>
-    <w:lvl w:ilvl="8" w:tplc="B49A2EEA">
-      <w:numFmt w:val="decimal"/>
-      <w:lvlText w:val=""/>
-      <w:lvlJc w:val="left"/>
-    </w:lvl>
-  </w:abstractNum>
-  <w:abstractNum w:abstractNumId="2" w15:restartNumberingAfterBreak="0">
-    <w:nsid w:val="5EE008B4"/>
-    <w:multiLevelType w:val="hybridMultilevel"/>
-    <w:tmpl w:val="3B9E7B4A"/>
-    <w:lvl w:ilvl="0" w:tplc="21D4089C">
+    <w:tmpl w:val="264A458C"/>
+    <w:lvl w:ilvl="0" w:tplc="9BA0B8A0">
       <w:start w:val="1"/>
       <w:numFmt w:val="bullet"/>
       <w:lvlText w:val="•"/>
@@ -5238,7 +5306,7 @@
         <w:ind w:left="540" w:hanging="300"/>
       </w:pPr>
     </w:lvl>
-    <w:lvl w:ilvl="1" w:tplc="A6B4B80E" w:tentative="1">
+    <w:lvl w:ilvl="1" w:tplc="80EC6AEA" w:tentative="1">
       <w:start w:val="1"/>
       <w:numFmt w:val="bullet"/>
       <w:lvlText w:val="–"/>
@@ -5247,7 +5315,7 @@
         <w:ind w:left="940" w:hanging="300"/>
       </w:pPr>
     </w:lvl>
-    <w:lvl w:ilvl="2" w:tplc="98FA4DCE" w:tentative="1">
+    <w:lvl w:ilvl="2" w:tplc="16007292" w:tentative="1">
       <w:start w:val="1"/>
       <w:numFmt w:val="bullet"/>
       <w:lvlText w:val="◦"/>
@@ -5256,39 +5324,39 @@
         <w:ind w:left="1340" w:hanging="300"/>
       </w:pPr>
     </w:lvl>
-    <w:lvl w:ilvl="3" w:tplc="3E64117A">
+    <w:lvl w:ilvl="3" w:tplc="CAE8D0FA">
       <w:numFmt w:val="decimal"/>
       <w:lvlText w:val=""/>
       <w:lvlJc w:val="left"/>
     </w:lvl>
-    <w:lvl w:ilvl="4" w:tplc="BD9467C0">
+    <w:lvl w:ilvl="4" w:tplc="815E5E7E">
       <w:numFmt w:val="decimal"/>
       <w:lvlText w:val=""/>
       <w:lvlJc w:val="left"/>
     </w:lvl>
-    <w:lvl w:ilvl="5" w:tplc="CED0A2BA">
+    <w:lvl w:ilvl="5" w:tplc="61F0CB98">
       <w:numFmt w:val="decimal"/>
       <w:lvlText w:val=""/>
       <w:lvlJc w:val="left"/>
     </w:lvl>
-    <w:lvl w:ilvl="6" w:tplc="46B882E0">
+    <w:lvl w:ilvl="6" w:tplc="2DD23A3E">
       <w:numFmt w:val="decimal"/>
       <w:lvlText w:val=""/>
       <w:lvlJc w:val="left"/>
     </w:lvl>
-    <w:lvl w:ilvl="7" w:tplc="6A300AD2">
+    <w:lvl w:ilvl="7" w:tplc="EF5C50F6">
       <w:numFmt w:val="decimal"/>
       <w:lvlText w:val=""/>
       <w:lvlJc w:val="left"/>
     </w:lvl>
-    <w:lvl w:ilvl="8" w:tplc="7E561622">
+    <w:lvl w:ilvl="8" w:tplc="6CAA2BC4">
       <w:numFmt w:val="decimal"/>
       <w:lvlText w:val=""/>
       <w:lvlJc w:val="left"/>
     </w:lvl>
   </w:abstractNum>
   <w:num w:numId="1">
-    <w:abstractNumId w:val="0"/>
+    <w:abstractNumId w:val="1"/>
     <w:lvlOverride w:ilvl="0">
       <w:startOverride w:val="1"/>
     </w:lvlOverride>
@@ -5923,7 +5991,7 @@
     <w:autoRedefine/>
     <w:uiPriority w:val="39"/>
     <w:unhideWhenUsed/>
-    <w:rsid w:val="004A214C"/>
+    <w:rsid w:val="000A6942"/>
     <w:pPr>
       <w:spacing w:after="100"/>
     </w:pPr>

</xml_diff>

<commit_message>
Phone: the menu and Home keep up with changes made elsewhere
"the circular thing that should show my picture doent show" / "in home the new edited info i did doesnt show in my mobile": the menu's name was the copy read when the app opened, and its photo was never tried again after a failed first load. The name and photo now come from AccountState (filled from /auth/me each time Home opens), and a failed photo is retried after 2, 4, 6 ... seconds, then every 30. Home loads again whenever it comes back into view, and its company card says when it is the copy kept on the phone because the server couldn't be reached. Four documents updated.

Co-Authored-By: Claude Opus 5.5 <noreply@anthropic.com>
</commit_message>
<xml_diff>
--- a/documentation/00 Documentation Index.docx
+++ b/documentation/00 Documentation Index.docx
@@ -80,7 +80,7 @@
           <w:left w:w="10" w:type="dxa"/>
           <w:right w:w="10" w:type="dxa"/>
         </w:tblCellMar>
-        <w:tblLook w:val="0000" w:firstRow="0" w:lastRow="0" w:firstColumn="0" w:lastColumn="0" w:noHBand="0" w:noVBand="0"/>
+        <w:tblLook w:val="04A0" w:firstRow="1" w:lastRow="0" w:firstColumn="1" w:lastColumn="0" w:noHBand="0" w:noVBand="1"/>
       </w:tblPr>
       <w:tblGrid>
         <w:gridCol w:w="2600"/>
@@ -461,7 +461,7 @@
           <w:left w:w="10" w:type="dxa"/>
           <w:right w:w="10" w:type="dxa"/>
         </w:tblCellMar>
-        <w:tblLook w:val="0000" w:firstRow="0" w:lastRow="0" w:firstColumn="0" w:lastColumn="0" w:noHBand="0" w:noVBand="0"/>
+        <w:tblLook w:val="04A0" w:firstRow="1" w:lastRow="0" w:firstColumn="1" w:lastColumn="0" w:noHBand="0" w:noVBand="1"/>
       </w:tblPr>
       <w:tblGrid>
         <w:gridCol w:w="1300"/>
@@ -1878,6 +1878,74 @@
                 <w:szCs w:val="19"/>
               </w:rPr>
               <w:t>Phone error messages in a scrolling box.</w:t>
+            </w:r>
+          </w:p>
+        </w:tc>
+      </w:tr>
+      <w:tr>
+        <w:tblPrEx>
+          <w:tblCellMar>
+            <w:top w:w="0" w:type="dxa"/>
+            <w:bottom w:w="0" w:type="dxa"/>
+          </w:tblCellMar>
+        </w:tblPrEx>
+        <w:tc>
+          <w:tcPr>
+            <w:tcW w:w="1300" w:type="dxa"/>
+            <w:tcMar>
+              <w:top w:w="50" w:type="dxa"/>
+              <w:left w:w="90" w:type="dxa"/>
+              <w:bottom w:w="50" w:type="dxa"/>
+              <w:right w:w="90" w:type="dxa"/>
+            </w:tcMar>
+          </w:tcPr>
+          <w:p>
+            <w:r>
+              <w:rPr>
+                <w:sz w:val="19"/>
+                <w:szCs w:val="19"/>
+              </w:rPr>
+              <w:t>1.1</w:t>
+            </w:r>
+          </w:p>
+        </w:tc>
+        <w:tc>
+          <w:tcPr>
+            <w:tcW w:w="1900" w:type="dxa"/>
+            <w:tcMar>
+              <w:top w:w="50" w:type="dxa"/>
+              <w:left w:w="90" w:type="dxa"/>
+              <w:bottom w:w="50" w:type="dxa"/>
+              <w:right w:w="90" w:type="dxa"/>
+            </w:tcMar>
+          </w:tcPr>
+          <w:p>
+            <w:r>
+              <w:rPr>
+                <w:sz w:val="19"/>
+                <w:szCs w:val="19"/>
+              </w:rPr>
+              <w:t>24 October 2026</w:t>
+            </w:r>
+          </w:p>
+        </w:tc>
+        <w:tc>
+          <w:tcPr>
+            <w:tcW w:w="6438" w:type="dxa"/>
+            <w:tcMar>
+              <w:top w:w="50" w:type="dxa"/>
+              <w:left w:w="90" w:type="dxa"/>
+              <w:bottom w:w="50" w:type="dxa"/>
+              <w:right w:w="90" w:type="dxa"/>
+            </w:tcMar>
+          </w:tcPr>
+          <w:p>
+            <w:r>
+              <w:rPr>
+                <w:sz w:val="19"/>
+                <w:szCs w:val="19"/>
+              </w:rPr>
+              <w:t>The phone's menu and Home follow changes made on the desktop or website.</w:t>
             </w:r>
           </w:p>
         </w:tc>
@@ -1914,7 +1982,7 @@
     <w:sdt>
       <w:sdtPr>
         <w:alias w:val="Contents"/>
-        <w:id w:val="659433312"/>
+        <w:id w:val="-1096084203"/>
       </w:sdtPr>
       <w:sdtEndPr/>
       <w:sdtContent>
@@ -1941,7 +2009,7 @@
           <w:r>
             <w:fldChar w:fldCharType="separate"/>
           </w:r>
-          <w:hyperlink w:anchor="_Toc243722779" w:history="1">
+          <w:hyperlink w:anchor="_Toc243724300" w:history="1">
             <w:r>
               <w:rPr>
                 <w:rStyle w:val="Hyperlink"/>
@@ -1965,7 +2033,7 @@
               <w:rPr>
                 <w:noProof/>
               </w:rPr>
-              <w:instrText xml:space="preserve"> PAGEREF _Toc243722779 \h </w:instrText>
+              <w:instrText xml:space="preserve"> PAGEREF _Toc243724300 \h </w:instrText>
             </w:r>
             <w:r>
               <w:rPr>
@@ -2006,7 +2074,7 @@
               <w:szCs w:val="22"/>
             </w:rPr>
           </w:pPr>
-          <w:hyperlink w:anchor="_Toc243722780" w:history="1">
+          <w:hyperlink w:anchor="_Toc243724301" w:history="1">
             <w:r>
               <w:rPr>
                 <w:rStyle w:val="Hyperlink"/>
@@ -2030,7 +2098,7 @@
               <w:rPr>
                 <w:noProof/>
               </w:rPr>
-              <w:instrText xml:space="preserve"> PAGEREF _Toc243722780 \h </w:instrText>
+              <w:instrText xml:space="preserve"> PAGEREF _Toc243724301 \h </w:instrText>
             </w:r>
             <w:r>
               <w:rPr>
@@ -2071,7 +2139,7 @@
               <w:szCs w:val="22"/>
             </w:rPr>
           </w:pPr>
-          <w:hyperlink w:anchor="_Toc243722781" w:history="1">
+          <w:hyperlink w:anchor="_Toc243724302" w:history="1">
             <w:r>
               <w:rPr>
                 <w:rStyle w:val="Hyperlink"/>
@@ -2095,7 +2163,7 @@
               <w:rPr>
                 <w:noProof/>
               </w:rPr>
-              <w:instrText xml:space="preserve"> PAGEREF _Toc243722781 \h </w:instrText>
+              <w:instrText xml:space="preserve"> PAGEREF _Toc243724302 \h </w:instrText>
             </w:r>
             <w:r>
               <w:rPr>
@@ -2136,7 +2204,7 @@
               <w:szCs w:val="22"/>
             </w:rPr>
           </w:pPr>
-          <w:hyperlink w:anchor="_Toc243722782" w:history="1">
+          <w:hyperlink w:anchor="_Toc243724303" w:history="1">
             <w:r>
               <w:rPr>
                 <w:rStyle w:val="Hyperlink"/>
@@ -2160,7 +2228,7 @@
               <w:rPr>
                 <w:noProof/>
               </w:rPr>
-              <w:instrText xml:space="preserve"> PAGEREF _Toc243722782 \h </w:instrText>
+              <w:instrText xml:space="preserve"> PAGEREF _Toc243724303 \h </w:instrText>
             </w:r>
             <w:r>
               <w:rPr>
@@ -2203,7 +2271,7 @@
       <w:pPr>
         <w:pStyle w:val="Heading1"/>
       </w:pPr>
-      <w:bookmarkStart w:id="1" w:name="_Toc243722779"/>
+      <w:bookmarkStart w:id="1" w:name="_Toc243724300"/>
       <w:r>
         <w:lastRenderedPageBreak/>
         <w:t>1  About this documentation</w:t>
@@ -2215,13 +2283,10 @@
         <w:spacing w:after="120" w:line="276" w:lineRule="auto"/>
       </w:pPr>
       <w:r>
-        <w:t>This folder documents the complete Dateroem Wood Sales system as it stood on 3 October 2026 (updated on 4 October 2026 with the changes made that evening, and on 5 October 2026 for the desktop ap</w:t>
+        <w:t>This folder documents the complete Dateroem Wood Sales system as it stood on 3 October 2026 (updated on 4 October 2026 with the changes made that evening, and on 5 October 2026 for the desktop app working from any computer): the core backend, the database,</w:t>
       </w:r>
       <w:r>
-        <w:t>p working from any computer): the core backend, the database, payments and AI, the customer website, the staff mobile app, the desktop administration app, the servers behind each of them, and how to run and change everything. The documents were written fro</w:t>
-      </w:r>
-      <w:r>
-        <w:t>m the source code itself.</w:t>
+        <w:t xml:space="preserve"> payments and AI, the customer website, the staff mobile app, the desktop administration app, the servers behind each of them, and how to run and change everything. The documents were written from the source code itself.</w:t>
       </w:r>
     </w:p>
     <w:p>
@@ -2229,7 +2294,10 @@
         <w:spacing w:after="120" w:line="276" w:lineRule="auto"/>
       </w:pPr>
       <w:r>
-        <w:t>All documents are ordinary Word files and can be edited directly. Each has a "Document control" table at the front - add a line there whenever you change it.</w:t>
+        <w:t>All documents are ordinary Word fil</w:t>
+      </w:r>
+      <w:r>
+        <w:t>es and can be edited directly. Each has a "Document control" table at the front - add a line there whenever you change it.</w:t>
       </w:r>
     </w:p>
     <w:p>
@@ -2241,7 +2309,7 @@
       <w:pPr>
         <w:pStyle w:val="Heading1"/>
       </w:pPr>
-      <w:bookmarkStart w:id="2" w:name="_Toc243722780"/>
+      <w:bookmarkStart w:id="2" w:name="_Toc243724301"/>
       <w:r>
         <w:lastRenderedPageBreak/>
         <w:t>2  Where to start</w:t>
@@ -2264,7 +2332,7 @@
           <w:left w:w="10" w:type="dxa"/>
           <w:right w:w="10" w:type="dxa"/>
         </w:tblCellMar>
-        <w:tblLook w:val="0000" w:firstRow="0" w:lastRow="0" w:firstColumn="0" w:lastColumn="0" w:noHBand="0" w:noVBand="0"/>
+        <w:tblLook w:val="04A0" w:firstRow="1" w:lastRow="0" w:firstColumn="1" w:lastColumn="0" w:noHBand="0" w:noVBand="1"/>
       </w:tblPr>
       <w:tblGrid>
         <w:gridCol w:w="3125"/>
@@ -2390,7 +2458,14 @@
                 <w:sz w:val="19"/>
                 <w:szCs w:val="19"/>
               </w:rPr>
-              <w:t>System Overview and Architecture; Configuration and Secrets Reference; Production Go-Live Checklist; Hosting and Deployment Guide; Running and Operating the System</w:t>
+              <w:t>System Overview and Architecture; Configuration and Secrets Reference; Pr</w:t>
+            </w:r>
+            <w:r>
+              <w:rPr>
+                <w:sz w:val="19"/>
+                <w:szCs w:val="19"/>
+              </w:rPr>
+              <w:t>oduction Go-Live Checklist; Hosting and Deployment Guide; Running and Operating the System</w:t>
             </w:r>
           </w:p>
         </w:tc>
@@ -2451,14 +2526,7 @@
                 <w:sz w:val="19"/>
                 <w:szCs w:val="19"/>
               </w:rPr>
-              <w:t xml:space="preserve">Hosting and Deployment Guide (every value </w:t>
-            </w:r>
-            <w:r>
-              <w:rPr>
-                <w:sz w:val="19"/>
-                <w:szCs w:val="19"/>
-              </w:rPr>
-              <w:t>to change after the move is listed there); Production Go-Live Checklist</w:t>
+              <w:t>Hosting and Deployment Guide (every value to change after the move is listed there); Production Go-Live Checklist</w:t>
             </w:r>
           </w:p>
         </w:tc>
@@ -2718,7 +2786,7 @@
       <w:pPr>
         <w:pStyle w:val="Heading1"/>
       </w:pPr>
-      <w:bookmarkStart w:id="3" w:name="_Toc243722781"/>
+      <w:bookmarkStart w:id="3" w:name="_Toc243724302"/>
       <w:r>
         <w:lastRenderedPageBreak/>
         <w:t>3  The documents</w:t>
@@ -2741,7 +2809,7 @@
           <w:left w:w="10" w:type="dxa"/>
           <w:right w:w="10" w:type="dxa"/>
         </w:tblCellMar>
-        <w:tblLook w:val="0000" w:firstRow="0" w:lastRow="0" w:firstColumn="0" w:lastColumn="0" w:noHBand="0" w:noVBand="0"/>
+        <w:tblLook w:val="04A0" w:firstRow="1" w:lastRow="0" w:firstColumn="1" w:lastColumn="0" w:noHBand="0" w:noVBand="1"/>
       </w:tblPr>
       <w:tblGrid>
         <w:gridCol w:w="2289"/>
@@ -4774,7 +4842,7 @@
       <w:pPr>
         <w:pStyle w:val="Heading1"/>
       </w:pPr>
-      <w:bookmarkStart w:id="4" w:name="_Toc243722782"/>
+      <w:bookmarkStart w:id="4" w:name="_Toc243724303"/>
       <w:r>
         <w:lastRenderedPageBreak/>
         <w:t>4  Conventions used</w:t>
@@ -5146,72 +5214,72 @@
 <file path=word/numbering.xml><?xml version="1.0" encoding="utf-8"?>
 <w:numbering xmlns:wpc="http://schemas.microsoft.com/office/word/2010/wordprocessingCanvas" xmlns:cx="http://schemas.microsoft.com/office/drawing/2014/chartex" xmlns:cx1="http://schemas.microsoft.com/office/drawing/2015/9/8/chartex" xmlns:mc="http://schemas.openxmlformats.org/markup-compatibility/2006" xmlns:o="urn:schemas-microsoft-com:office:office" xmlns:r="http://schemas.openxmlformats.org/officeDocument/2006/relationships" xmlns:m="http://schemas.openxmlformats.org/officeDocument/2006/math" xmlns:v="urn:schemas-microsoft-com:vml" xmlns:wp14="http://schemas.microsoft.com/office/word/2010/wordprocessingDrawing" xmlns:wp="http://schemas.openxmlformats.org/drawingml/2006/wordprocessingDrawing" xmlns:w10="urn:schemas-microsoft-com:office:word" xmlns:w="http://schemas.openxmlformats.org/wordprocessingml/2006/main" xmlns:w14="http://schemas.microsoft.com/office/word/2010/wordml" xmlns:w15="http://schemas.microsoft.com/office/word/2012/wordml" xmlns:w16se="http://schemas.microsoft.com/office/word/2015/wordml/symex" xmlns:wpg="http://schemas.microsoft.com/office/word/2010/wordprocessingGroup" xmlns:wpi="http://schemas.microsoft.com/office/word/2010/wordprocessingInk" xmlns:wne="http://schemas.microsoft.com/office/word/2006/wordml" xmlns:wps="http://schemas.microsoft.com/office/word/2010/wordprocessingShape" mc:Ignorable="w14 w15 w16se wp14">
   <w:abstractNum w:abstractNumId="0" w15:restartNumberingAfterBreak="0">
-    <w:nsid w:val="39CD224F"/>
+    <w:nsid w:val="380305BC"/>
     <w:multiLevelType w:val="hybridMultilevel"/>
-    <w:tmpl w:val="CC5435AA"/>
-    <w:lvl w:ilvl="0" w:tplc="268293AA" w:tentative="1">
+    <w:tmpl w:val="62D0492A"/>
+    <w:lvl w:ilvl="0" w:tplc="5B78898C">
       <w:start w:val="1"/>
-      <w:numFmt w:val="decimal"/>
-      <w:lvlText w:val="%1."/>
+      <w:numFmt w:val="bullet"/>
+      <w:lvlText w:val="•"/>
       <w:lvlJc w:val="left"/>
       <w:pPr>
         <w:ind w:left="540" w:hanging="300"/>
       </w:pPr>
     </w:lvl>
-    <w:lvl w:ilvl="1" w:tplc="8996A6C8" w:tentative="1">
+    <w:lvl w:ilvl="1" w:tplc="54662638" w:tentative="1">
       <w:start w:val="1"/>
-      <w:numFmt w:val="lowerLetter"/>
-      <w:lvlText w:val="%2."/>
+      <w:numFmt w:val="bullet"/>
+      <w:lvlText w:val="–"/>
       <w:lvlJc w:val="left"/>
       <w:pPr>
         <w:ind w:left="940" w:hanging="300"/>
       </w:pPr>
     </w:lvl>
-    <w:lvl w:ilvl="2" w:tplc="B7723D82" w:tentative="1">
+    <w:lvl w:ilvl="2" w:tplc="B498C1D0" w:tentative="1">
       <w:start w:val="1"/>
-      <w:numFmt w:val="lowerRoman"/>
-      <w:lvlText w:val="%3."/>
+      <w:numFmt w:val="bullet"/>
+      <w:lvlText w:val="◦"/>
       <w:lvlJc w:val="left"/>
       <w:pPr>
         <w:ind w:left="1340" w:hanging="300"/>
       </w:pPr>
     </w:lvl>
-    <w:lvl w:ilvl="3" w:tplc="0164DA2E">
+    <w:lvl w:ilvl="3" w:tplc="C4EAF8DE">
       <w:numFmt w:val="decimal"/>
       <w:lvlText w:val=""/>
       <w:lvlJc w:val="left"/>
     </w:lvl>
-    <w:lvl w:ilvl="4" w:tplc="960CE1AA">
+    <w:lvl w:ilvl="4" w:tplc="E9BC7570">
       <w:numFmt w:val="decimal"/>
       <w:lvlText w:val=""/>
       <w:lvlJc w:val="left"/>
     </w:lvl>
-    <w:lvl w:ilvl="5" w:tplc="F272BD9A">
+    <w:lvl w:ilvl="5" w:tplc="D8749488">
       <w:numFmt w:val="decimal"/>
       <w:lvlText w:val=""/>
       <w:lvlJc w:val="left"/>
     </w:lvl>
-    <w:lvl w:ilvl="6" w:tplc="5D282CB6">
+    <w:lvl w:ilvl="6" w:tplc="D3A4E442">
       <w:numFmt w:val="decimal"/>
       <w:lvlText w:val=""/>
       <w:lvlJc w:val="left"/>
     </w:lvl>
-    <w:lvl w:ilvl="7" w:tplc="CB7AB1CE">
+    <w:lvl w:ilvl="7" w:tplc="582A9DEC">
       <w:numFmt w:val="decimal"/>
       <w:lvlText w:val=""/>
       <w:lvlJc w:val="left"/>
     </w:lvl>
-    <w:lvl w:ilvl="8" w:tplc="A046417C">
+    <w:lvl w:ilvl="8" w:tplc="FCBE8B76">
       <w:numFmt w:val="decimal"/>
       <w:lvlText w:val=""/>
       <w:lvlJc w:val="left"/>
     </w:lvl>
   </w:abstractNum>
   <w:abstractNum w:abstractNumId="1" w15:restartNumberingAfterBreak="0">
-    <w:nsid w:val="516142AD"/>
+    <w:nsid w:val="5D816806"/>
     <w:multiLevelType w:val="hybridMultilevel"/>
-    <w:tmpl w:val="6C74FA92"/>
-    <w:lvl w:ilvl="0" w:tplc="7E24C336" w:tentative="1">
+    <w:tmpl w:val="F1BAECCA"/>
+    <w:lvl w:ilvl="0" w:tplc="C0502E0C" w:tentative="1">
       <w:start w:val="1"/>
       <w:numFmt w:val="bullet"/>
       <w:lvlText w:val="●"/>
@@ -5220,7 +5288,7 @@
         <w:ind w:left="720" w:hanging="360"/>
       </w:pPr>
     </w:lvl>
-    <w:lvl w:ilvl="1" w:tplc="9F728666" w:tentative="1">
+    <w:lvl w:ilvl="1" w:tplc="DB7A938C" w:tentative="1">
       <w:start w:val="1"/>
       <w:numFmt w:val="bullet"/>
       <w:lvlText w:val="○"/>
@@ -5229,7 +5297,7 @@
         <w:ind w:left="1440" w:hanging="360"/>
       </w:pPr>
     </w:lvl>
-    <w:lvl w:ilvl="2" w:tplc="9710C9F0" w:tentative="1">
+    <w:lvl w:ilvl="2" w:tplc="E93E90CC" w:tentative="1">
       <w:start w:val="1"/>
       <w:numFmt w:val="bullet"/>
       <w:lvlText w:val="■"/>
@@ -5238,7 +5306,7 @@
         <w:ind w:left="2160" w:hanging="360"/>
       </w:pPr>
     </w:lvl>
-    <w:lvl w:ilvl="3" w:tplc="81201370" w:tentative="1">
+    <w:lvl w:ilvl="3" w:tplc="60D6469A" w:tentative="1">
       <w:start w:val="1"/>
       <w:numFmt w:val="bullet"/>
       <w:lvlText w:val="●"/>
@@ -5247,7 +5315,7 @@
         <w:ind w:left="2880" w:hanging="360"/>
       </w:pPr>
     </w:lvl>
-    <w:lvl w:ilvl="4" w:tplc="3510F316" w:tentative="1">
+    <w:lvl w:ilvl="4" w:tplc="E3A60182" w:tentative="1">
       <w:start w:val="1"/>
       <w:numFmt w:val="bullet"/>
       <w:lvlText w:val="○"/>
@@ -5256,7 +5324,7 @@
         <w:ind w:left="3600" w:hanging="360"/>
       </w:pPr>
     </w:lvl>
-    <w:lvl w:ilvl="5" w:tplc="544C4C40" w:tentative="1">
+    <w:lvl w:ilvl="5" w:tplc="327ADAEA" w:tentative="1">
       <w:start w:val="1"/>
       <w:numFmt w:val="bullet"/>
       <w:lvlText w:val="■"/>
@@ -5265,7 +5333,7 @@
         <w:ind w:left="4320" w:hanging="360"/>
       </w:pPr>
     </w:lvl>
-    <w:lvl w:ilvl="6" w:tplc="AEEC2D14" w:tentative="1">
+    <w:lvl w:ilvl="6" w:tplc="DC9497C8" w:tentative="1">
       <w:start w:val="1"/>
       <w:numFmt w:val="bullet"/>
       <w:lvlText w:val="●"/>
@@ -5274,7 +5342,7 @@
         <w:ind w:left="5040" w:hanging="360"/>
       </w:pPr>
     </w:lvl>
-    <w:lvl w:ilvl="7" w:tplc="DC62349C" w:tentative="1">
+    <w:lvl w:ilvl="7" w:tplc="3E5CA3AA" w:tentative="1">
       <w:start w:val="1"/>
       <w:numFmt w:val="bullet"/>
       <w:lvlText w:val="●"/>
@@ -5283,7 +5351,7 @@
         <w:ind w:left="5760" w:hanging="360"/>
       </w:pPr>
     </w:lvl>
-    <w:lvl w:ilvl="8" w:tplc="C576DC2A" w:tentative="1">
+    <w:lvl w:ilvl="8" w:tplc="380C95A6" w:tentative="1">
       <w:start w:val="1"/>
       <w:numFmt w:val="bullet"/>
       <w:lvlText w:val="●"/>
@@ -5294,62 +5362,62 @@
     </w:lvl>
   </w:abstractNum>
   <w:abstractNum w:abstractNumId="2" w15:restartNumberingAfterBreak="0">
-    <w:nsid w:val="7BAB1F75"/>
+    <w:nsid w:val="663B2131"/>
     <w:multiLevelType w:val="hybridMultilevel"/>
-    <w:tmpl w:val="264A458C"/>
-    <w:lvl w:ilvl="0" w:tplc="9BA0B8A0">
+    <w:tmpl w:val="02886082"/>
+    <w:lvl w:ilvl="0" w:tplc="E0F84926" w:tentative="1">
       <w:start w:val="1"/>
-      <w:numFmt w:val="bullet"/>
-      <w:lvlText w:val="•"/>
+      <w:numFmt w:val="decimal"/>
+      <w:lvlText w:val="%1."/>
       <w:lvlJc w:val="left"/>
       <w:pPr>
         <w:ind w:left="540" w:hanging="300"/>
       </w:pPr>
     </w:lvl>
-    <w:lvl w:ilvl="1" w:tplc="80EC6AEA" w:tentative="1">
+    <w:lvl w:ilvl="1" w:tplc="A8CAF6F8" w:tentative="1">
       <w:start w:val="1"/>
-      <w:numFmt w:val="bullet"/>
-      <w:lvlText w:val="–"/>
+      <w:numFmt w:val="lowerLetter"/>
+      <w:lvlText w:val="%2."/>
       <w:lvlJc w:val="left"/>
       <w:pPr>
         <w:ind w:left="940" w:hanging="300"/>
       </w:pPr>
     </w:lvl>
-    <w:lvl w:ilvl="2" w:tplc="16007292" w:tentative="1">
+    <w:lvl w:ilvl="2" w:tplc="321A5640" w:tentative="1">
       <w:start w:val="1"/>
-      <w:numFmt w:val="bullet"/>
-      <w:lvlText w:val="◦"/>
+      <w:numFmt w:val="lowerRoman"/>
+      <w:lvlText w:val="%3."/>
       <w:lvlJc w:val="left"/>
       <w:pPr>
         <w:ind w:left="1340" w:hanging="300"/>
       </w:pPr>
     </w:lvl>
-    <w:lvl w:ilvl="3" w:tplc="CAE8D0FA">
+    <w:lvl w:ilvl="3" w:tplc="27CE568C">
       <w:numFmt w:val="decimal"/>
       <w:lvlText w:val=""/>
       <w:lvlJc w:val="left"/>
     </w:lvl>
-    <w:lvl w:ilvl="4" w:tplc="815E5E7E">
+    <w:lvl w:ilvl="4" w:tplc="C7823CCE">
       <w:numFmt w:val="decimal"/>
       <w:lvlText w:val=""/>
       <w:lvlJc w:val="left"/>
     </w:lvl>
-    <w:lvl w:ilvl="5" w:tplc="61F0CB98">
+    <w:lvl w:ilvl="5" w:tplc="0F769F12">
       <w:numFmt w:val="decimal"/>
       <w:lvlText w:val=""/>
       <w:lvlJc w:val="left"/>
     </w:lvl>
-    <w:lvl w:ilvl="6" w:tplc="2DD23A3E">
+    <w:lvl w:ilvl="6" w:tplc="1226AD3E">
       <w:numFmt w:val="decimal"/>
       <w:lvlText w:val=""/>
       <w:lvlJc w:val="left"/>
     </w:lvl>
-    <w:lvl w:ilvl="7" w:tplc="EF5C50F6">
+    <w:lvl w:ilvl="7" w:tplc="9C40AD7C">
       <w:numFmt w:val="decimal"/>
       <w:lvlText w:val=""/>
       <w:lvlJc w:val="left"/>
     </w:lvl>
-    <w:lvl w:ilvl="8" w:tplc="6CAA2BC4">
+    <w:lvl w:ilvl="8" w:tplc="061EEA12">
       <w:numFmt w:val="decimal"/>
       <w:lvlText w:val=""/>
       <w:lvlJc w:val="left"/>
@@ -5362,7 +5430,7 @@
     </w:lvlOverride>
   </w:num>
   <w:num w:numId="2">
-    <w:abstractNumId w:val="2"/>
+    <w:abstractNumId w:val="0"/>
     <w:lvlOverride w:ilvl="0">
       <w:startOverride w:val="1"/>
     </w:lvlOverride>
@@ -5991,7 +6059,7 @@
     <w:autoRedefine/>
     <w:uiPriority w:val="39"/>
     <w:unhideWhenUsed/>
-    <w:rsid w:val="000A6942"/>
+    <w:rsid w:val="002C0DBB"/>
     <w:pPr>
       <w:spacing w:after="100"/>
     </w:pPr>

</xml_diff>

<commit_message>
About page: the founder's approved bio and photos
The founder's own bio, put in order and approved by the owner: his story, the four reasons he started the business as a list, how he leads the purchasing and supply teams, and his closing words as a quote (ABOUT_FOUNDER in core/aboutStory.js). Two approved photos, saved without camera or location data: the round portrait (public/brand/founder.jpg, cut from a clearer group photo with only him in the frame) and a photo with a young tree (public/brand/founder-tree.jpg) under it with a caption. On phones: portrait, story, then the tree photo, paragraphs left-aligned. Three documents updated.

Co-Authored-By: Claude Opus 5.5 <noreply@anthropic.com>
</commit_message>
<xml_diff>
--- a/documentation/00 Documentation Index.docx
+++ b/documentation/00 Documentation Index.docx
@@ -2086,6 +2086,74 @@
           </w:p>
         </w:tc>
       </w:tr>
+      <w:tr>
+        <w:tblPrEx>
+          <w:tblCellMar>
+            <w:top w:w="0" w:type="dxa"/>
+            <w:bottom w:w="0" w:type="dxa"/>
+          </w:tblCellMar>
+        </w:tblPrEx>
+        <w:tc>
+          <w:tcPr>
+            <w:tcW w:w="1300" w:type="dxa"/>
+            <w:tcMar>
+              <w:top w:w="50" w:type="dxa"/>
+              <w:left w:w="90" w:type="dxa"/>
+              <w:bottom w:w="50" w:type="dxa"/>
+              <w:right w:w="90" w:type="dxa"/>
+            </w:tcMar>
+          </w:tcPr>
+          <w:p>
+            <w:r>
+              <w:rPr>
+                <w:sz w:val="19"/>
+                <w:szCs w:val="19"/>
+              </w:rPr>
+              <w:t>1.1</w:t>
+            </w:r>
+          </w:p>
+        </w:tc>
+        <w:tc>
+          <w:tcPr>
+            <w:tcW w:w="1900" w:type="dxa"/>
+            <w:tcMar>
+              <w:top w:w="50" w:type="dxa"/>
+              <w:left w:w="90" w:type="dxa"/>
+              <w:bottom w:w="50" w:type="dxa"/>
+              <w:right w:w="90" w:type="dxa"/>
+            </w:tcMar>
+          </w:tcPr>
+          <w:p>
+            <w:r>
+              <w:rPr>
+                <w:sz w:val="19"/>
+                <w:szCs w:val="19"/>
+              </w:rPr>
+              <w:t>24 October 2026</w:t>
+            </w:r>
+          </w:p>
+        </w:tc>
+        <w:tc>
+          <w:tcPr>
+            <w:tcW w:w="6438" w:type="dxa"/>
+            <w:tcMar>
+              <w:top w:w="50" w:type="dxa"/>
+              <w:left w:w="90" w:type="dxa"/>
+              <w:bottom w:w="50" w:type="dxa"/>
+              <w:right w:w="90" w:type="dxa"/>
+            </w:tcMar>
+          </w:tcPr>
+          <w:p>
+            <w:r>
+              <w:rPr>
+                <w:sz w:val="19"/>
+                <w:szCs w:val="19"/>
+              </w:rPr>
+              <w:t>The founder's bio and photos on the About page.</w:t>
+            </w:r>
+          </w:p>
+        </w:tc>
+      </w:tr>
     </w:tbl>
     <w:p>
       <w:pPr>
@@ -2097,7 +2165,8 @@
           <w:sz w:val="20"/>
           <w:szCs w:val="20"/>
         </w:rPr>
-        <w:t>Keep this document up to date: when a feature, setting or server changes, edit the matching section here and add a line t</w:t>
+        <w:lastRenderedPageBreak/>
+        <w:t>Keep this document up to date: when a feature, setti</w:t>
       </w:r>
       <w:r>
         <w:rPr>
@@ -2105,7 +2174,7 @@
           <w:sz w:val="20"/>
           <w:szCs w:val="20"/>
         </w:rPr>
-        <w:t>o the table above.</w:t>
+        <w:t>ng or server changes, edit the matching section here and add a line to the table above.</w:t>
       </w:r>
     </w:p>
     <w:p>
@@ -2120,14 +2189,13 @@
           <w:sz w:val="28"/>
           <w:szCs w:val="28"/>
         </w:rPr>
-        <w:lastRenderedPageBreak/>
         <w:t>Contents</w:t>
       </w:r>
     </w:p>
     <w:sdt>
       <w:sdtPr>
         <w:alias w:val="Contents"/>
-        <w:id w:val="637844419"/>
+        <w:id w:val="-7145199"/>
       </w:sdtPr>
       <w:sdtEndPr/>
       <w:sdtContent>
@@ -2154,7 +2222,7 @@
           <w:r>
             <w:fldChar w:fldCharType="separate"/>
           </w:r>
-          <w:hyperlink w:anchor="_Toc243726482" w:history="1">
+          <w:hyperlink w:anchor="_Toc243728579" w:history="1">
             <w:r>
               <w:rPr>
                 <w:rStyle w:val="Hyperlink"/>
@@ -2178,7 +2246,7 @@
               <w:rPr>
                 <w:noProof/>
               </w:rPr>
-              <w:instrText xml:space="preserve"> PAGEREF _Toc243726482 \h </w:instrText>
+              <w:instrText xml:space="preserve"> PAGEREF _Toc243728579 \h </w:instrText>
             </w:r>
             <w:r>
               <w:rPr>
@@ -2219,7 +2287,7 @@
               <w:szCs w:val="22"/>
             </w:rPr>
           </w:pPr>
-          <w:hyperlink w:anchor="_Toc243726483" w:history="1">
+          <w:hyperlink w:anchor="_Toc243728580" w:history="1">
             <w:r>
               <w:rPr>
                 <w:rStyle w:val="Hyperlink"/>
@@ -2243,7 +2311,7 @@
               <w:rPr>
                 <w:noProof/>
               </w:rPr>
-              <w:instrText xml:space="preserve"> PAGEREF _Toc243726483 \h </w:instrText>
+              <w:instrText xml:space="preserve"> PAGEREF _Toc243728580 \h </w:instrText>
             </w:r>
             <w:r>
               <w:rPr>
@@ -2284,7 +2352,7 @@
               <w:szCs w:val="22"/>
             </w:rPr>
           </w:pPr>
-          <w:hyperlink w:anchor="_Toc243726484" w:history="1">
+          <w:hyperlink w:anchor="_Toc243728581" w:history="1">
             <w:r>
               <w:rPr>
                 <w:rStyle w:val="Hyperlink"/>
@@ -2308,7 +2376,7 @@
               <w:rPr>
                 <w:noProof/>
               </w:rPr>
-              <w:instrText xml:space="preserve"> PAGEREF _Toc243726484 \h </w:instrText>
+              <w:instrText xml:space="preserve"> PAGEREF _Toc243728581 \h </w:instrText>
             </w:r>
             <w:r>
               <w:rPr>
@@ -2349,7 +2417,7 @@
               <w:szCs w:val="22"/>
             </w:rPr>
           </w:pPr>
-          <w:hyperlink w:anchor="_Toc243726485" w:history="1">
+          <w:hyperlink w:anchor="_Toc243728582" w:history="1">
             <w:r>
               <w:rPr>
                 <w:rStyle w:val="Hyperlink"/>
@@ -2373,7 +2441,7 @@
               <w:rPr>
                 <w:noProof/>
               </w:rPr>
-              <w:instrText xml:space="preserve"> PAGEREF _Toc243726485 \h </w:instrText>
+              <w:instrText xml:space="preserve"> PAGEREF _Toc243728582 \h </w:instrText>
             </w:r>
             <w:r>
               <w:rPr>
@@ -2416,7 +2484,7 @@
       <w:pPr>
         <w:pStyle w:val="Heading1"/>
       </w:pPr>
-      <w:bookmarkStart w:id="1" w:name="_Toc243726482"/>
+      <w:bookmarkStart w:id="1" w:name="_Toc243728579"/>
       <w:r>
         <w:lastRenderedPageBreak/>
         <w:t>1  About this documentation</w:t>
@@ -2454,7 +2522,7 @@
       <w:pPr>
         <w:pStyle w:val="Heading1"/>
       </w:pPr>
-      <w:bookmarkStart w:id="2" w:name="_Toc243726483"/>
+      <w:bookmarkStart w:id="2" w:name="_Toc243728580"/>
       <w:r>
         <w:lastRenderedPageBreak/>
         <w:t>2  Where to start</w:t>
@@ -2931,7 +2999,7 @@
       <w:pPr>
         <w:pStyle w:val="Heading1"/>
       </w:pPr>
-      <w:bookmarkStart w:id="3" w:name="_Toc243726484"/>
+      <w:bookmarkStart w:id="3" w:name="_Toc243728581"/>
       <w:r>
         <w:lastRenderedPageBreak/>
         <w:t>3  The documents</w:t>
@@ -4987,7 +5055,7 @@
       <w:pPr>
         <w:pStyle w:val="Heading1"/>
       </w:pPr>
-      <w:bookmarkStart w:id="4" w:name="_Toc243726485"/>
+      <w:bookmarkStart w:id="4" w:name="_Toc243728582"/>
       <w:r>
         <w:lastRenderedPageBreak/>
         <w:t>4  Conventions used</w:t>
@@ -5367,10 +5435,72 @@
 <file path=word/numbering.xml><?xml version="1.0" encoding="utf-8"?>
 <w:numbering xmlns:wpc="http://schemas.microsoft.com/office/word/2010/wordprocessingCanvas" xmlns:cx="http://schemas.microsoft.com/office/drawing/2014/chartex" xmlns:cx1="http://schemas.microsoft.com/office/drawing/2015/9/8/chartex" xmlns:mc="http://schemas.openxmlformats.org/markup-compatibility/2006" xmlns:o="urn:schemas-microsoft-com:office:office" xmlns:r="http://schemas.openxmlformats.org/officeDocument/2006/relationships" xmlns:m="http://schemas.openxmlformats.org/officeDocument/2006/math" xmlns:v="urn:schemas-microsoft-com:vml" xmlns:wp14="http://schemas.microsoft.com/office/word/2010/wordprocessingDrawing" xmlns:wp="http://schemas.openxmlformats.org/drawingml/2006/wordprocessingDrawing" xmlns:w10="urn:schemas-microsoft-com:office:word" xmlns:w="http://schemas.openxmlformats.org/wordprocessingml/2006/main" xmlns:w14="http://schemas.microsoft.com/office/word/2010/wordml" xmlns:w15="http://schemas.microsoft.com/office/word/2012/wordml" xmlns:w16se="http://schemas.microsoft.com/office/word/2015/wordml/symex" xmlns:wpg="http://schemas.microsoft.com/office/word/2010/wordprocessingGroup" xmlns:wpi="http://schemas.microsoft.com/office/word/2010/wordprocessingInk" xmlns:wne="http://schemas.microsoft.com/office/word/2006/wordml" xmlns:wps="http://schemas.microsoft.com/office/word/2010/wordprocessingShape" mc:Ignorable="w14 w15 w16se wp14">
   <w:abstractNum w:abstractNumId="0" w15:restartNumberingAfterBreak="0">
-    <w:nsid w:val="03DC4DE8"/>
+    <w:nsid w:val="1EE31A3B"/>
     <w:multiLevelType w:val="hybridMultilevel"/>
-    <w:tmpl w:val="07CC643A"/>
-    <w:lvl w:ilvl="0" w:tplc="7ACA0440">
+    <w:tmpl w:val="ED4043D4"/>
+    <w:lvl w:ilvl="0" w:tplc="77883B0E" w:tentative="1">
+      <w:start w:val="1"/>
+      <w:numFmt w:val="decimal"/>
+      <w:lvlText w:val="%1."/>
+      <w:lvlJc w:val="left"/>
+      <w:pPr>
+        <w:ind w:left="540" w:hanging="300"/>
+      </w:pPr>
+    </w:lvl>
+    <w:lvl w:ilvl="1" w:tplc="E2322724" w:tentative="1">
+      <w:start w:val="1"/>
+      <w:numFmt w:val="lowerLetter"/>
+      <w:lvlText w:val="%2."/>
+      <w:lvlJc w:val="left"/>
+      <w:pPr>
+        <w:ind w:left="940" w:hanging="300"/>
+      </w:pPr>
+    </w:lvl>
+    <w:lvl w:ilvl="2" w:tplc="D97050FA" w:tentative="1">
+      <w:start w:val="1"/>
+      <w:numFmt w:val="lowerRoman"/>
+      <w:lvlText w:val="%3."/>
+      <w:lvlJc w:val="left"/>
+      <w:pPr>
+        <w:ind w:left="1340" w:hanging="300"/>
+      </w:pPr>
+    </w:lvl>
+    <w:lvl w:ilvl="3" w:tplc="F404CBC8">
+      <w:numFmt w:val="decimal"/>
+      <w:lvlText w:val=""/>
+      <w:lvlJc w:val="left"/>
+    </w:lvl>
+    <w:lvl w:ilvl="4" w:tplc="338038A8">
+      <w:numFmt w:val="decimal"/>
+      <w:lvlText w:val=""/>
+      <w:lvlJc w:val="left"/>
+    </w:lvl>
+    <w:lvl w:ilvl="5" w:tplc="DB4A50CA">
+      <w:numFmt w:val="decimal"/>
+      <w:lvlText w:val=""/>
+      <w:lvlJc w:val="left"/>
+    </w:lvl>
+    <w:lvl w:ilvl="6" w:tplc="DB26DDAE">
+      <w:numFmt w:val="decimal"/>
+      <w:lvlText w:val=""/>
+      <w:lvlJc w:val="left"/>
+    </w:lvl>
+    <w:lvl w:ilvl="7" w:tplc="F814BEF4">
+      <w:numFmt w:val="decimal"/>
+      <w:lvlText w:val=""/>
+      <w:lvlJc w:val="left"/>
+    </w:lvl>
+    <w:lvl w:ilvl="8" w:tplc="52747DCE">
+      <w:numFmt w:val="decimal"/>
+      <w:lvlText w:val=""/>
+      <w:lvlJc w:val="left"/>
+    </w:lvl>
+  </w:abstractNum>
+  <w:abstractNum w:abstractNumId="1" w15:restartNumberingAfterBreak="0">
+    <w:nsid w:val="57FE7280"/>
+    <w:multiLevelType w:val="hybridMultilevel"/>
+    <w:tmpl w:val="B87CF986"/>
+    <w:lvl w:ilvl="0" w:tplc="4442E370">
       <w:start w:val="1"/>
       <w:numFmt w:val="bullet"/>
       <w:lvlText w:val="•"/>
@@ -5379,7 +5509,7 @@
         <w:ind w:left="540" w:hanging="300"/>
       </w:pPr>
     </w:lvl>
-    <w:lvl w:ilvl="1" w:tplc="8C38D29C" w:tentative="1">
+    <w:lvl w:ilvl="1" w:tplc="D9E00ECA" w:tentative="1">
       <w:start w:val="1"/>
       <w:numFmt w:val="bullet"/>
       <w:lvlText w:val="–"/>
@@ -5388,7 +5518,7 @@
         <w:ind w:left="940" w:hanging="300"/>
       </w:pPr>
     </w:lvl>
-    <w:lvl w:ilvl="2" w:tplc="501E089A" w:tentative="1">
+    <w:lvl w:ilvl="2" w:tplc="D9A8BC8C" w:tentative="1">
       <w:start w:val="1"/>
       <w:numFmt w:val="bullet"/>
       <w:lvlText w:val="◦"/>
@@ -5397,104 +5527,42 @@
         <w:ind w:left="1340" w:hanging="300"/>
       </w:pPr>
     </w:lvl>
-    <w:lvl w:ilvl="3" w:tplc="6846A064">
+    <w:lvl w:ilvl="3" w:tplc="C130C298">
       <w:numFmt w:val="decimal"/>
       <w:lvlText w:val=""/>
       <w:lvlJc w:val="left"/>
     </w:lvl>
-    <w:lvl w:ilvl="4" w:tplc="977CDAF6">
+    <w:lvl w:ilvl="4" w:tplc="F20A0ADC">
       <w:numFmt w:val="decimal"/>
       <w:lvlText w:val=""/>
       <w:lvlJc w:val="left"/>
     </w:lvl>
-    <w:lvl w:ilvl="5" w:tplc="AD32E77C">
+    <w:lvl w:ilvl="5" w:tplc="F7CC091A">
       <w:numFmt w:val="decimal"/>
       <w:lvlText w:val=""/>
       <w:lvlJc w:val="left"/>
     </w:lvl>
-    <w:lvl w:ilvl="6" w:tplc="1966D44E">
+    <w:lvl w:ilvl="6" w:tplc="8B68A45E">
       <w:numFmt w:val="decimal"/>
       <w:lvlText w:val=""/>
       <w:lvlJc w:val="left"/>
     </w:lvl>
-    <w:lvl w:ilvl="7" w:tplc="372C01CA">
+    <w:lvl w:ilvl="7" w:tplc="432C6EE6">
       <w:numFmt w:val="decimal"/>
       <w:lvlText w:val=""/>
       <w:lvlJc w:val="left"/>
     </w:lvl>
-    <w:lvl w:ilvl="8" w:tplc="EA9ACD04">
-      <w:numFmt w:val="decimal"/>
-      <w:lvlText w:val=""/>
-      <w:lvlJc w:val="left"/>
-    </w:lvl>
-  </w:abstractNum>
-  <w:abstractNum w:abstractNumId="1" w15:restartNumberingAfterBreak="0">
-    <w:nsid w:val="5DF247EA"/>
-    <w:multiLevelType w:val="hybridMultilevel"/>
-    <w:tmpl w:val="3F2CC42A"/>
-    <w:lvl w:ilvl="0" w:tplc="27122A9A" w:tentative="1">
-      <w:start w:val="1"/>
-      <w:numFmt w:val="decimal"/>
-      <w:lvlText w:val="%1."/>
-      <w:lvlJc w:val="left"/>
-      <w:pPr>
-        <w:ind w:left="540" w:hanging="300"/>
-      </w:pPr>
-    </w:lvl>
-    <w:lvl w:ilvl="1" w:tplc="B136E3B6" w:tentative="1">
-      <w:start w:val="1"/>
-      <w:numFmt w:val="lowerLetter"/>
-      <w:lvlText w:val="%2."/>
-      <w:lvlJc w:val="left"/>
-      <w:pPr>
-        <w:ind w:left="940" w:hanging="300"/>
-      </w:pPr>
-    </w:lvl>
-    <w:lvl w:ilvl="2" w:tplc="5F78F43E" w:tentative="1">
-      <w:start w:val="1"/>
-      <w:numFmt w:val="lowerRoman"/>
-      <w:lvlText w:val="%3."/>
-      <w:lvlJc w:val="left"/>
-      <w:pPr>
-        <w:ind w:left="1340" w:hanging="300"/>
-      </w:pPr>
-    </w:lvl>
-    <w:lvl w:ilvl="3" w:tplc="9AF40202">
-      <w:numFmt w:val="decimal"/>
-      <w:lvlText w:val=""/>
-      <w:lvlJc w:val="left"/>
-    </w:lvl>
-    <w:lvl w:ilvl="4" w:tplc="82FEB244">
-      <w:numFmt w:val="decimal"/>
-      <w:lvlText w:val=""/>
-      <w:lvlJc w:val="left"/>
-    </w:lvl>
-    <w:lvl w:ilvl="5" w:tplc="59CE94D8">
-      <w:numFmt w:val="decimal"/>
-      <w:lvlText w:val=""/>
-      <w:lvlJc w:val="left"/>
-    </w:lvl>
-    <w:lvl w:ilvl="6" w:tplc="B46C29A2">
-      <w:numFmt w:val="decimal"/>
-      <w:lvlText w:val=""/>
-      <w:lvlJc w:val="left"/>
-    </w:lvl>
-    <w:lvl w:ilvl="7" w:tplc="A880BBD0">
-      <w:numFmt w:val="decimal"/>
-      <w:lvlText w:val=""/>
-      <w:lvlJc w:val="left"/>
-    </w:lvl>
-    <w:lvl w:ilvl="8" w:tplc="915A92E6">
+    <w:lvl w:ilvl="8" w:tplc="D57ED216">
       <w:numFmt w:val="decimal"/>
       <w:lvlText w:val=""/>
       <w:lvlJc w:val="left"/>
     </w:lvl>
   </w:abstractNum>
   <w:abstractNum w:abstractNumId="2" w15:restartNumberingAfterBreak="0">
-    <w:nsid w:val="76D46B75"/>
+    <w:nsid w:val="6D3A09D1"/>
     <w:multiLevelType w:val="hybridMultilevel"/>
-    <w:tmpl w:val="7BF015C2"/>
-    <w:lvl w:ilvl="0" w:tplc="310AD5DE" w:tentative="1">
+    <w:tmpl w:val="78E68A14"/>
+    <w:lvl w:ilvl="0" w:tplc="9EB8AAE4" w:tentative="1">
       <w:start w:val="1"/>
       <w:numFmt w:val="bullet"/>
       <w:lvlText w:val="●"/>
@@ -5503,7 +5571,7 @@
         <w:ind w:left="720" w:hanging="360"/>
       </w:pPr>
     </w:lvl>
-    <w:lvl w:ilvl="1" w:tplc="36EEA492" w:tentative="1">
+    <w:lvl w:ilvl="1" w:tplc="8760F57C" w:tentative="1">
       <w:start w:val="1"/>
       <w:numFmt w:val="bullet"/>
       <w:lvlText w:val="○"/>
@@ -5512,7 +5580,7 @@
         <w:ind w:left="1440" w:hanging="360"/>
       </w:pPr>
     </w:lvl>
-    <w:lvl w:ilvl="2" w:tplc="21647B08" w:tentative="1">
+    <w:lvl w:ilvl="2" w:tplc="38206CE2" w:tentative="1">
       <w:start w:val="1"/>
       <w:numFmt w:val="bullet"/>
       <w:lvlText w:val="■"/>
@@ -5521,7 +5589,7 @@
         <w:ind w:left="2160" w:hanging="360"/>
       </w:pPr>
     </w:lvl>
-    <w:lvl w:ilvl="3" w:tplc="5AE8CB28" w:tentative="1">
+    <w:lvl w:ilvl="3" w:tplc="85F81212" w:tentative="1">
       <w:start w:val="1"/>
       <w:numFmt w:val="bullet"/>
       <w:lvlText w:val="●"/>
@@ -5530,7 +5598,7 @@
         <w:ind w:left="2880" w:hanging="360"/>
       </w:pPr>
     </w:lvl>
-    <w:lvl w:ilvl="4" w:tplc="6E32DCE8" w:tentative="1">
+    <w:lvl w:ilvl="4" w:tplc="ACDA93DE" w:tentative="1">
       <w:start w:val="1"/>
       <w:numFmt w:val="bullet"/>
       <w:lvlText w:val="○"/>
@@ -5539,7 +5607,7 @@
         <w:ind w:left="3600" w:hanging="360"/>
       </w:pPr>
     </w:lvl>
-    <w:lvl w:ilvl="5" w:tplc="41387DDA" w:tentative="1">
+    <w:lvl w:ilvl="5" w:tplc="4AC84460" w:tentative="1">
       <w:start w:val="1"/>
       <w:numFmt w:val="bullet"/>
       <w:lvlText w:val="■"/>
@@ -5548,7 +5616,7 @@
         <w:ind w:left="4320" w:hanging="360"/>
       </w:pPr>
     </w:lvl>
-    <w:lvl w:ilvl="6" w:tplc="8454F186" w:tentative="1">
+    <w:lvl w:ilvl="6" w:tplc="63A88FF4" w:tentative="1">
       <w:start w:val="1"/>
       <w:numFmt w:val="bullet"/>
       <w:lvlText w:val="●"/>
@@ -5557,7 +5625,7 @@
         <w:ind w:left="5040" w:hanging="360"/>
       </w:pPr>
     </w:lvl>
-    <w:lvl w:ilvl="7" w:tplc="46967602" w:tentative="1">
+    <w:lvl w:ilvl="7" w:tplc="F06A956A" w:tentative="1">
       <w:start w:val="1"/>
       <w:numFmt w:val="bullet"/>
       <w:lvlText w:val="●"/>
@@ -5566,7 +5634,7 @@
         <w:ind w:left="5760" w:hanging="360"/>
       </w:pPr>
     </w:lvl>
-    <w:lvl w:ilvl="8" w:tplc="BF2C70AC" w:tentative="1">
+    <w:lvl w:ilvl="8" w:tplc="85EC4F32" w:tentative="1">
       <w:start w:val="1"/>
       <w:numFmt w:val="bullet"/>
       <w:lvlText w:val="●"/>
@@ -5583,7 +5651,7 @@
     </w:lvlOverride>
   </w:num>
   <w:num w:numId="2">
-    <w:abstractNumId w:val="0"/>
+    <w:abstractNumId w:val="1"/>
     <w:lvlOverride w:ilvl="0">
       <w:startOverride w:val="1"/>
     </w:lvlOverride>
@@ -6212,7 +6280,7 @@
     <w:autoRedefine/>
     <w:uiPriority w:val="39"/>
     <w:unhideWhenUsed/>
-    <w:rsid w:val="00A574BC"/>
+    <w:rsid w:val="00626DD1"/>
     <w:pPr>
       <w:spacing w:after="100"/>
     </w:pPr>

</xml_diff>

<commit_message>
The Groq key lives in application.properties
The owner put a new Groq key in application.properties, but the start commands (run_backend.sh, start_backend.sh, the desktop's server_manager.py - none of them in git) still exported the old one, which wins over the file. Those exports were removed (backups kept), the backend restarted, and the assistant answers with the new key. The kit's backend.env.example no longer blanks it (the line starts with #), setup-server.sh's closing steps say what is still typed, and the Configuration, Hosting and Troubleshooting documents say where the key lives now.

Co-Authored-By: Claude Opus 5.5 <noreply@anthropic.com>
</commit_message>
<xml_diff>
--- a/documentation/00 Documentation Index.docx
+++ b/documentation/00 Documentation Index.docx
@@ -2154,6 +2154,74 @@
           </w:p>
         </w:tc>
       </w:tr>
+      <w:tr>
+        <w:tblPrEx>
+          <w:tblCellMar>
+            <w:top w:w="0" w:type="dxa"/>
+            <w:bottom w:w="0" w:type="dxa"/>
+          </w:tblCellMar>
+        </w:tblPrEx>
+        <w:tc>
+          <w:tcPr>
+            <w:tcW w:w="1300" w:type="dxa"/>
+            <w:tcMar>
+              <w:top w:w="50" w:type="dxa"/>
+              <w:left w:w="90" w:type="dxa"/>
+              <w:bottom w:w="50" w:type="dxa"/>
+              <w:right w:w="90" w:type="dxa"/>
+            </w:tcMar>
+          </w:tcPr>
+          <w:p>
+            <w:r>
+              <w:rPr>
+                <w:sz w:val="19"/>
+                <w:szCs w:val="19"/>
+              </w:rPr>
+              <w:t>1.1</w:t>
+            </w:r>
+          </w:p>
+        </w:tc>
+        <w:tc>
+          <w:tcPr>
+            <w:tcW w:w="1900" w:type="dxa"/>
+            <w:tcMar>
+              <w:top w:w="50" w:type="dxa"/>
+              <w:left w:w="90" w:type="dxa"/>
+              <w:bottom w:w="50" w:type="dxa"/>
+              <w:right w:w="90" w:type="dxa"/>
+            </w:tcMar>
+          </w:tcPr>
+          <w:p>
+            <w:r>
+              <w:rPr>
+                <w:sz w:val="19"/>
+                <w:szCs w:val="19"/>
+              </w:rPr>
+              <w:t>24 October 2026</w:t>
+            </w:r>
+          </w:p>
+        </w:tc>
+        <w:tc>
+          <w:tcPr>
+            <w:tcW w:w="6438" w:type="dxa"/>
+            <w:tcMar>
+              <w:top w:w="50" w:type="dxa"/>
+              <w:left w:w="90" w:type="dxa"/>
+              <w:bottom w:w="50" w:type="dxa"/>
+              <w:right w:w="90" w:type="dxa"/>
+            </w:tcMar>
+          </w:tcPr>
+          <w:p>
+            <w:r>
+              <w:rPr>
+                <w:sz w:val="19"/>
+                <w:szCs w:val="19"/>
+              </w:rPr>
+              <w:t>Where the Groq key lives now (application.properties).</w:t>
+            </w:r>
+          </w:p>
+        </w:tc>
+      </w:tr>
     </w:tbl>
     <w:p>
       <w:pPr>
@@ -2166,15 +2234,7 @@
           <w:szCs w:val="20"/>
         </w:rPr>
         <w:lastRenderedPageBreak/>
-        <w:t>Keep this document up to date: when a feature, setti</w:t>
-      </w:r>
-      <w:r>
-        <w:rPr>
-          <w:color w:val="5F6B66"/>
-          <w:sz w:val="20"/>
-          <w:szCs w:val="20"/>
-        </w:rPr>
-        <w:t>ng or server changes, edit the matching section here and add a line to the table above.</w:t>
+        <w:t>Keep this document up to date: when a feature, setting or server changes, edit the matching section here and add a line to the table above.</w:t>
       </w:r>
     </w:p>
     <w:p>
@@ -2195,7 +2255,7 @@
     <w:sdt>
       <w:sdtPr>
         <w:alias w:val="Contents"/>
-        <w:id w:val="-7145199"/>
+        <w:id w:val="-633869785"/>
       </w:sdtPr>
       <w:sdtEndPr/>
       <w:sdtContent>
@@ -2222,7 +2282,7 @@
           <w:r>
             <w:fldChar w:fldCharType="separate"/>
           </w:r>
-          <w:hyperlink w:anchor="_Toc243728579" w:history="1">
+          <w:hyperlink w:anchor="_Toc243729573" w:history="1">
             <w:r>
               <w:rPr>
                 <w:rStyle w:val="Hyperlink"/>
@@ -2246,7 +2306,7 @@
               <w:rPr>
                 <w:noProof/>
               </w:rPr>
-              <w:instrText xml:space="preserve"> PAGEREF _Toc243728579 \h </w:instrText>
+              <w:instrText xml:space="preserve"> PAGEREF _Toc243729573 \h </w:instrText>
             </w:r>
             <w:r>
               <w:rPr>
@@ -2287,7 +2347,7 @@
               <w:szCs w:val="22"/>
             </w:rPr>
           </w:pPr>
-          <w:hyperlink w:anchor="_Toc243728580" w:history="1">
+          <w:hyperlink w:anchor="_Toc243729574" w:history="1">
             <w:r>
               <w:rPr>
                 <w:rStyle w:val="Hyperlink"/>
@@ -2311,7 +2371,7 @@
               <w:rPr>
                 <w:noProof/>
               </w:rPr>
-              <w:instrText xml:space="preserve"> PAGEREF _Toc243728580 \h </w:instrText>
+              <w:instrText xml:space="preserve"> PAGEREF _Toc243729574 \h </w:instrText>
             </w:r>
             <w:r>
               <w:rPr>
@@ -2352,7 +2412,7 @@
               <w:szCs w:val="22"/>
             </w:rPr>
           </w:pPr>
-          <w:hyperlink w:anchor="_Toc243728581" w:history="1">
+          <w:hyperlink w:anchor="_Toc243729575" w:history="1">
             <w:r>
               <w:rPr>
                 <w:rStyle w:val="Hyperlink"/>
@@ -2376,7 +2436,7 @@
               <w:rPr>
                 <w:noProof/>
               </w:rPr>
-              <w:instrText xml:space="preserve"> PAGEREF _Toc243728581 \h </w:instrText>
+              <w:instrText xml:space="preserve"> PAGEREF _Toc243729575 \h </w:instrText>
             </w:r>
             <w:r>
               <w:rPr>
@@ -2417,7 +2477,7 @@
               <w:szCs w:val="22"/>
             </w:rPr>
           </w:pPr>
-          <w:hyperlink w:anchor="_Toc243728582" w:history="1">
+          <w:hyperlink w:anchor="_Toc243729576" w:history="1">
             <w:r>
               <w:rPr>
                 <w:rStyle w:val="Hyperlink"/>
@@ -2441,7 +2501,7 @@
               <w:rPr>
                 <w:noProof/>
               </w:rPr>
-              <w:instrText xml:space="preserve"> PAGEREF _Toc243728582 \h </w:instrText>
+              <w:instrText xml:space="preserve"> PAGEREF _Toc243729576 \h </w:instrText>
             </w:r>
             <w:r>
               <w:rPr>
@@ -2484,7 +2544,7 @@
       <w:pPr>
         <w:pStyle w:val="Heading1"/>
       </w:pPr>
-      <w:bookmarkStart w:id="1" w:name="_Toc243728579"/>
+      <w:bookmarkStart w:id="1" w:name="_Toc243729573"/>
       <w:r>
         <w:lastRenderedPageBreak/>
         <w:t>1  About this documentation</w:t>
@@ -2496,10 +2556,10 @@
         <w:spacing w:after="120" w:line="276" w:lineRule="auto"/>
       </w:pPr>
       <w:r>
-        <w:t>This folder documents the complete Dateroem Wood Sales system as it stood on 3 October 2026 (updated on 4 October 2026 with the changes made that evening, and on 5 October 2026 for the desktop app working from any computer): the core backend, the database,</w:t>
+        <w:t>This folder documents the complete Dateroem Wood Sales system as it stood on 3 October 2026 (updated on 4 October 2026 with the changes made that evening, and on 5 October 2026 for the desktop app working from any computer): the core backend, the database</w:t>
       </w:r>
       <w:r>
-        <w:t xml:space="preserve"> payments and AI, the customer website, the staff mobile app, the desktop administration app, the servers behind each of them, and how to run and change everything. The documents were written from the source code itself.</w:t>
+        <w:t>, payments and AI, the customer website, the staff mobile app, the desktop administration app, the servers behind each of them, and how to run and change everything. The documents were written from the source code itself.</w:t>
       </w:r>
     </w:p>
     <w:p>
@@ -2507,10 +2567,10 @@
         <w:spacing w:after="120" w:line="276" w:lineRule="auto"/>
       </w:pPr>
       <w:r>
-        <w:t>All documents are ordinary Word fil</w:t>
+        <w:t>All documents are ordinary Word fi</w:t>
       </w:r>
       <w:r>
-        <w:t>es and can be edited directly. Each has a "Document control" table at the front - add a line there whenever you change it.</w:t>
+        <w:t>les and can be edited directly. Each has a "Document control" table at the front - add a line there whenever you change it.</w:t>
       </w:r>
     </w:p>
     <w:p>
@@ -2522,7 +2582,7 @@
       <w:pPr>
         <w:pStyle w:val="Heading1"/>
       </w:pPr>
-      <w:bookmarkStart w:id="2" w:name="_Toc243728580"/>
+      <w:bookmarkStart w:id="2" w:name="_Toc243729574"/>
       <w:r>
         <w:lastRenderedPageBreak/>
         <w:t>2  Where to start</w:t>
@@ -2671,14 +2731,7 @@
                 <w:sz w:val="19"/>
                 <w:szCs w:val="19"/>
               </w:rPr>
-              <w:t>System Overview and Architecture; Configuration and Secrets Reference; Pr</w:t>
-            </w:r>
-            <w:r>
-              <w:rPr>
-                <w:sz w:val="19"/>
-                <w:szCs w:val="19"/>
-              </w:rPr>
-              <w:t>oduction Go-Live Checklist; Hosting and Deployment Guide; Running and Operating the System</w:t>
+              <w:t>System Overview and Architecture; Configuration and Secrets Reference; Production Go-Live Checklist; Hosting and Deployment Guide; Running and Operating the System</w:t>
             </w:r>
           </w:p>
         </w:tc>
@@ -2999,7 +3052,7 @@
       <w:pPr>
         <w:pStyle w:val="Heading1"/>
       </w:pPr>
-      <w:bookmarkStart w:id="3" w:name="_Toc243728581"/>
+      <w:bookmarkStart w:id="3" w:name="_Toc243729575"/>
       <w:r>
         <w:lastRenderedPageBreak/>
         <w:t>3  The documents</w:t>
@@ -5055,7 +5108,7 @@
       <w:pPr>
         <w:pStyle w:val="Heading1"/>
       </w:pPr>
-      <w:bookmarkStart w:id="4" w:name="_Toc243728582"/>
+      <w:bookmarkStart w:id="4" w:name="_Toc243729576"/>
       <w:r>
         <w:lastRenderedPageBreak/>
         <w:t>4  Conventions used</w:t>
@@ -5435,134 +5488,10 @@
 <file path=word/numbering.xml><?xml version="1.0" encoding="utf-8"?>
 <w:numbering xmlns:wpc="http://schemas.microsoft.com/office/word/2010/wordprocessingCanvas" xmlns:cx="http://schemas.microsoft.com/office/drawing/2014/chartex" xmlns:cx1="http://schemas.microsoft.com/office/drawing/2015/9/8/chartex" xmlns:mc="http://schemas.openxmlformats.org/markup-compatibility/2006" xmlns:o="urn:schemas-microsoft-com:office:office" xmlns:r="http://schemas.openxmlformats.org/officeDocument/2006/relationships" xmlns:m="http://schemas.openxmlformats.org/officeDocument/2006/math" xmlns:v="urn:schemas-microsoft-com:vml" xmlns:wp14="http://schemas.microsoft.com/office/word/2010/wordprocessingDrawing" xmlns:wp="http://schemas.openxmlformats.org/drawingml/2006/wordprocessingDrawing" xmlns:w10="urn:schemas-microsoft-com:office:word" xmlns:w="http://schemas.openxmlformats.org/wordprocessingml/2006/main" xmlns:w14="http://schemas.microsoft.com/office/word/2010/wordml" xmlns:w15="http://schemas.microsoft.com/office/word/2012/wordml" xmlns:w16se="http://schemas.microsoft.com/office/word/2015/wordml/symex" xmlns:wpg="http://schemas.microsoft.com/office/word/2010/wordprocessingGroup" xmlns:wpi="http://schemas.microsoft.com/office/word/2010/wordprocessingInk" xmlns:wne="http://schemas.microsoft.com/office/word/2006/wordml" xmlns:wps="http://schemas.microsoft.com/office/word/2010/wordprocessingShape" mc:Ignorable="w14 w15 w16se wp14">
   <w:abstractNum w:abstractNumId="0" w15:restartNumberingAfterBreak="0">
-    <w:nsid w:val="1EE31A3B"/>
+    <w:nsid w:val="023B4A8E"/>
     <w:multiLevelType w:val="hybridMultilevel"/>
-    <w:tmpl w:val="ED4043D4"/>
-    <w:lvl w:ilvl="0" w:tplc="77883B0E" w:tentative="1">
-      <w:start w:val="1"/>
-      <w:numFmt w:val="decimal"/>
-      <w:lvlText w:val="%1."/>
-      <w:lvlJc w:val="left"/>
-      <w:pPr>
-        <w:ind w:left="540" w:hanging="300"/>
-      </w:pPr>
-    </w:lvl>
-    <w:lvl w:ilvl="1" w:tplc="E2322724" w:tentative="1">
-      <w:start w:val="1"/>
-      <w:numFmt w:val="lowerLetter"/>
-      <w:lvlText w:val="%2."/>
-      <w:lvlJc w:val="left"/>
-      <w:pPr>
-        <w:ind w:left="940" w:hanging="300"/>
-      </w:pPr>
-    </w:lvl>
-    <w:lvl w:ilvl="2" w:tplc="D97050FA" w:tentative="1">
-      <w:start w:val="1"/>
-      <w:numFmt w:val="lowerRoman"/>
-      <w:lvlText w:val="%3."/>
-      <w:lvlJc w:val="left"/>
-      <w:pPr>
-        <w:ind w:left="1340" w:hanging="300"/>
-      </w:pPr>
-    </w:lvl>
-    <w:lvl w:ilvl="3" w:tplc="F404CBC8">
-      <w:numFmt w:val="decimal"/>
-      <w:lvlText w:val=""/>
-      <w:lvlJc w:val="left"/>
-    </w:lvl>
-    <w:lvl w:ilvl="4" w:tplc="338038A8">
-      <w:numFmt w:val="decimal"/>
-      <w:lvlText w:val=""/>
-      <w:lvlJc w:val="left"/>
-    </w:lvl>
-    <w:lvl w:ilvl="5" w:tplc="DB4A50CA">
-      <w:numFmt w:val="decimal"/>
-      <w:lvlText w:val=""/>
-      <w:lvlJc w:val="left"/>
-    </w:lvl>
-    <w:lvl w:ilvl="6" w:tplc="DB26DDAE">
-      <w:numFmt w:val="decimal"/>
-      <w:lvlText w:val=""/>
-      <w:lvlJc w:val="left"/>
-    </w:lvl>
-    <w:lvl w:ilvl="7" w:tplc="F814BEF4">
-      <w:numFmt w:val="decimal"/>
-      <w:lvlText w:val=""/>
-      <w:lvlJc w:val="left"/>
-    </w:lvl>
-    <w:lvl w:ilvl="8" w:tplc="52747DCE">
-      <w:numFmt w:val="decimal"/>
-      <w:lvlText w:val=""/>
-      <w:lvlJc w:val="left"/>
-    </w:lvl>
-  </w:abstractNum>
-  <w:abstractNum w:abstractNumId="1" w15:restartNumberingAfterBreak="0">
-    <w:nsid w:val="57FE7280"/>
-    <w:multiLevelType w:val="hybridMultilevel"/>
-    <w:tmpl w:val="B87CF986"/>
-    <w:lvl w:ilvl="0" w:tplc="4442E370">
-      <w:start w:val="1"/>
-      <w:numFmt w:val="bullet"/>
-      <w:lvlText w:val="•"/>
-      <w:lvlJc w:val="left"/>
-      <w:pPr>
-        <w:ind w:left="540" w:hanging="300"/>
-      </w:pPr>
-    </w:lvl>
-    <w:lvl w:ilvl="1" w:tplc="D9E00ECA" w:tentative="1">
-      <w:start w:val="1"/>
-      <w:numFmt w:val="bullet"/>
-      <w:lvlText w:val="–"/>
-      <w:lvlJc w:val="left"/>
-      <w:pPr>
-        <w:ind w:left="940" w:hanging="300"/>
-      </w:pPr>
-    </w:lvl>
-    <w:lvl w:ilvl="2" w:tplc="D9A8BC8C" w:tentative="1">
-      <w:start w:val="1"/>
-      <w:numFmt w:val="bullet"/>
-      <w:lvlText w:val="◦"/>
-      <w:lvlJc w:val="left"/>
-      <w:pPr>
-        <w:ind w:left="1340" w:hanging="300"/>
-      </w:pPr>
-    </w:lvl>
-    <w:lvl w:ilvl="3" w:tplc="C130C298">
-      <w:numFmt w:val="decimal"/>
-      <w:lvlText w:val=""/>
-      <w:lvlJc w:val="left"/>
-    </w:lvl>
-    <w:lvl w:ilvl="4" w:tplc="F20A0ADC">
-      <w:numFmt w:val="decimal"/>
-      <w:lvlText w:val=""/>
-      <w:lvlJc w:val="left"/>
-    </w:lvl>
-    <w:lvl w:ilvl="5" w:tplc="F7CC091A">
-      <w:numFmt w:val="decimal"/>
-      <w:lvlText w:val=""/>
-      <w:lvlJc w:val="left"/>
-    </w:lvl>
-    <w:lvl w:ilvl="6" w:tplc="8B68A45E">
-      <w:numFmt w:val="decimal"/>
-      <w:lvlText w:val=""/>
-      <w:lvlJc w:val="left"/>
-    </w:lvl>
-    <w:lvl w:ilvl="7" w:tplc="432C6EE6">
-      <w:numFmt w:val="decimal"/>
-      <w:lvlText w:val=""/>
-      <w:lvlJc w:val="left"/>
-    </w:lvl>
-    <w:lvl w:ilvl="8" w:tplc="D57ED216">
-      <w:numFmt w:val="decimal"/>
-      <w:lvlText w:val=""/>
-      <w:lvlJc w:val="left"/>
-    </w:lvl>
-  </w:abstractNum>
-  <w:abstractNum w:abstractNumId="2" w15:restartNumberingAfterBreak="0">
-    <w:nsid w:val="6D3A09D1"/>
-    <w:multiLevelType w:val="hybridMultilevel"/>
-    <w:tmpl w:val="78E68A14"/>
-    <w:lvl w:ilvl="0" w:tplc="9EB8AAE4" w:tentative="1">
+    <w:tmpl w:val="DF0EA646"/>
+    <w:lvl w:ilvl="0" w:tplc="7EC4C756" w:tentative="1">
       <w:start w:val="1"/>
       <w:numFmt w:val="bullet"/>
       <w:lvlText w:val="●"/>
@@ -5571,7 +5500,7 @@
         <w:ind w:left="720" w:hanging="360"/>
       </w:pPr>
     </w:lvl>
-    <w:lvl w:ilvl="1" w:tplc="8760F57C" w:tentative="1">
+    <w:lvl w:ilvl="1" w:tplc="D5B2C066" w:tentative="1">
       <w:start w:val="1"/>
       <w:numFmt w:val="bullet"/>
       <w:lvlText w:val="○"/>
@@ -5580,7 +5509,7 @@
         <w:ind w:left="1440" w:hanging="360"/>
       </w:pPr>
     </w:lvl>
-    <w:lvl w:ilvl="2" w:tplc="38206CE2" w:tentative="1">
+    <w:lvl w:ilvl="2" w:tplc="93024D6C" w:tentative="1">
       <w:start w:val="1"/>
       <w:numFmt w:val="bullet"/>
       <w:lvlText w:val="■"/>
@@ -5589,7 +5518,7 @@
         <w:ind w:left="2160" w:hanging="360"/>
       </w:pPr>
     </w:lvl>
-    <w:lvl w:ilvl="3" w:tplc="85F81212" w:tentative="1">
+    <w:lvl w:ilvl="3" w:tplc="98FEEC12" w:tentative="1">
       <w:start w:val="1"/>
       <w:numFmt w:val="bullet"/>
       <w:lvlText w:val="●"/>
@@ -5598,7 +5527,7 @@
         <w:ind w:left="2880" w:hanging="360"/>
       </w:pPr>
     </w:lvl>
-    <w:lvl w:ilvl="4" w:tplc="ACDA93DE" w:tentative="1">
+    <w:lvl w:ilvl="4" w:tplc="2118179C" w:tentative="1">
       <w:start w:val="1"/>
       <w:numFmt w:val="bullet"/>
       <w:lvlText w:val="○"/>
@@ -5607,7 +5536,7 @@
         <w:ind w:left="3600" w:hanging="360"/>
       </w:pPr>
     </w:lvl>
-    <w:lvl w:ilvl="5" w:tplc="4AC84460" w:tentative="1">
+    <w:lvl w:ilvl="5" w:tplc="2F5C537C" w:tentative="1">
       <w:start w:val="1"/>
       <w:numFmt w:val="bullet"/>
       <w:lvlText w:val="■"/>
@@ -5616,7 +5545,7 @@
         <w:ind w:left="4320" w:hanging="360"/>
       </w:pPr>
     </w:lvl>
-    <w:lvl w:ilvl="6" w:tplc="63A88FF4" w:tentative="1">
+    <w:lvl w:ilvl="6" w:tplc="5274B26E" w:tentative="1">
       <w:start w:val="1"/>
       <w:numFmt w:val="bullet"/>
       <w:lvlText w:val="●"/>
@@ -5625,7 +5554,7 @@
         <w:ind w:left="5040" w:hanging="360"/>
       </w:pPr>
     </w:lvl>
-    <w:lvl w:ilvl="7" w:tplc="F06A956A" w:tentative="1">
+    <w:lvl w:ilvl="7" w:tplc="C2D4F662" w:tentative="1">
       <w:start w:val="1"/>
       <w:numFmt w:val="bullet"/>
       <w:lvlText w:val="●"/>
@@ -5634,7 +5563,7 @@
         <w:ind w:left="5760" w:hanging="360"/>
       </w:pPr>
     </w:lvl>
-    <w:lvl w:ilvl="8" w:tplc="85EC4F32" w:tentative="1">
+    <w:lvl w:ilvl="8" w:tplc="BD7CD83E" w:tentative="1">
       <w:start w:val="1"/>
       <w:numFmt w:val="bullet"/>
       <w:lvlText w:val="●"/>
@@ -5644,14 +5573,138 @@
       </w:pPr>
     </w:lvl>
   </w:abstractNum>
+  <w:abstractNum w:abstractNumId="1" w15:restartNumberingAfterBreak="0">
+    <w:nsid w:val="1A032AF9"/>
+    <w:multiLevelType w:val="hybridMultilevel"/>
+    <w:tmpl w:val="7A048196"/>
+    <w:lvl w:ilvl="0" w:tplc="C388C220" w:tentative="1">
+      <w:start w:val="1"/>
+      <w:numFmt w:val="decimal"/>
+      <w:lvlText w:val="%1."/>
+      <w:lvlJc w:val="left"/>
+      <w:pPr>
+        <w:ind w:left="540" w:hanging="300"/>
+      </w:pPr>
+    </w:lvl>
+    <w:lvl w:ilvl="1" w:tplc="D88E6E42" w:tentative="1">
+      <w:start w:val="1"/>
+      <w:numFmt w:val="lowerLetter"/>
+      <w:lvlText w:val="%2."/>
+      <w:lvlJc w:val="left"/>
+      <w:pPr>
+        <w:ind w:left="940" w:hanging="300"/>
+      </w:pPr>
+    </w:lvl>
+    <w:lvl w:ilvl="2" w:tplc="6652B536" w:tentative="1">
+      <w:start w:val="1"/>
+      <w:numFmt w:val="lowerRoman"/>
+      <w:lvlText w:val="%3."/>
+      <w:lvlJc w:val="left"/>
+      <w:pPr>
+        <w:ind w:left="1340" w:hanging="300"/>
+      </w:pPr>
+    </w:lvl>
+    <w:lvl w:ilvl="3" w:tplc="7F2E7926">
+      <w:numFmt w:val="decimal"/>
+      <w:lvlText w:val=""/>
+      <w:lvlJc w:val="left"/>
+    </w:lvl>
+    <w:lvl w:ilvl="4" w:tplc="4296E55C">
+      <w:numFmt w:val="decimal"/>
+      <w:lvlText w:val=""/>
+      <w:lvlJc w:val="left"/>
+    </w:lvl>
+    <w:lvl w:ilvl="5" w:tplc="7A4E8FFE">
+      <w:numFmt w:val="decimal"/>
+      <w:lvlText w:val=""/>
+      <w:lvlJc w:val="left"/>
+    </w:lvl>
+    <w:lvl w:ilvl="6" w:tplc="66ECF6E2">
+      <w:numFmt w:val="decimal"/>
+      <w:lvlText w:val=""/>
+      <w:lvlJc w:val="left"/>
+    </w:lvl>
+    <w:lvl w:ilvl="7" w:tplc="E6F4B894">
+      <w:numFmt w:val="decimal"/>
+      <w:lvlText w:val=""/>
+      <w:lvlJc w:val="left"/>
+    </w:lvl>
+    <w:lvl w:ilvl="8" w:tplc="99584906">
+      <w:numFmt w:val="decimal"/>
+      <w:lvlText w:val=""/>
+      <w:lvlJc w:val="left"/>
+    </w:lvl>
+  </w:abstractNum>
+  <w:abstractNum w:abstractNumId="2" w15:restartNumberingAfterBreak="0">
+    <w:nsid w:val="1FA54114"/>
+    <w:multiLevelType w:val="hybridMultilevel"/>
+    <w:tmpl w:val="CF768496"/>
+    <w:lvl w:ilvl="0" w:tplc="E29C2062">
+      <w:start w:val="1"/>
+      <w:numFmt w:val="bullet"/>
+      <w:lvlText w:val="•"/>
+      <w:lvlJc w:val="left"/>
+      <w:pPr>
+        <w:ind w:left="540" w:hanging="300"/>
+      </w:pPr>
+    </w:lvl>
+    <w:lvl w:ilvl="1" w:tplc="AE129C22" w:tentative="1">
+      <w:start w:val="1"/>
+      <w:numFmt w:val="bullet"/>
+      <w:lvlText w:val="–"/>
+      <w:lvlJc w:val="left"/>
+      <w:pPr>
+        <w:ind w:left="940" w:hanging="300"/>
+      </w:pPr>
+    </w:lvl>
+    <w:lvl w:ilvl="2" w:tplc="730C0B9C" w:tentative="1">
+      <w:start w:val="1"/>
+      <w:numFmt w:val="bullet"/>
+      <w:lvlText w:val="◦"/>
+      <w:lvlJc w:val="left"/>
+      <w:pPr>
+        <w:ind w:left="1340" w:hanging="300"/>
+      </w:pPr>
+    </w:lvl>
+    <w:lvl w:ilvl="3" w:tplc="B54E0956">
+      <w:numFmt w:val="decimal"/>
+      <w:lvlText w:val=""/>
+      <w:lvlJc w:val="left"/>
+    </w:lvl>
+    <w:lvl w:ilvl="4" w:tplc="9B36E364">
+      <w:numFmt w:val="decimal"/>
+      <w:lvlText w:val=""/>
+      <w:lvlJc w:val="left"/>
+    </w:lvl>
+    <w:lvl w:ilvl="5" w:tplc="F97A59B8">
+      <w:numFmt w:val="decimal"/>
+      <w:lvlText w:val=""/>
+      <w:lvlJc w:val="left"/>
+    </w:lvl>
+    <w:lvl w:ilvl="6" w:tplc="588C57EC">
+      <w:numFmt w:val="decimal"/>
+      <w:lvlText w:val=""/>
+      <w:lvlJc w:val="left"/>
+    </w:lvl>
+    <w:lvl w:ilvl="7" w:tplc="713C7D38">
+      <w:numFmt w:val="decimal"/>
+      <w:lvlText w:val=""/>
+      <w:lvlJc w:val="left"/>
+    </w:lvl>
+    <w:lvl w:ilvl="8" w:tplc="3EA6AF4A">
+      <w:numFmt w:val="decimal"/>
+      <w:lvlText w:val=""/>
+      <w:lvlJc w:val="left"/>
+    </w:lvl>
+  </w:abstractNum>
   <w:num w:numId="1">
-    <w:abstractNumId w:val="2"/>
+    <w:abstractNumId w:val="0"/>
     <w:lvlOverride w:ilvl="0">
       <w:startOverride w:val="1"/>
     </w:lvlOverride>
   </w:num>
   <w:num w:numId="2">
-    <w:abstractNumId w:val="1"/>
+    <w:abstractNumId w:val="2"/>
     <w:lvlOverride w:ilvl="0">
       <w:startOverride w:val="1"/>
     </w:lvlOverride>
@@ -6280,7 +6333,7 @@
     <w:autoRedefine/>
     <w:uiPriority w:val="39"/>
     <w:unhideWhenUsed/>
-    <w:rsid w:val="00626DD1"/>
+    <w:rsid w:val="007923D0"/>
     <w:pPr>
       <w:spacing w:after="100"/>
     </w:pPr>

</xml_diff>

<commit_message>
Documents: the forest look is live
Dated 1.1 rows of 25 October 2026 in six documents. Website User Interface: a new section "The forest look" (what the visitor sees on every page, the entrance, the cards with an amount, Add to cart and Order now, Featured as the young tree beside the products, the product page; the lighter phone version and why; where the pictures come from) with two screenshots from the live site, the VITE_FOREST_LOOK setting, buying from a card under Buying and paying, and publishing through the HostAfrica release in place of the old ngrok paragraph. Backend Server and AI Assistant: the tidied description copy is served only while it matches the description. Configuration and Secrets Reference: the look switch in .env.production. Development Timeline and the Index: the release. The checker requires the new text; all 18 documents pass and the secret scan finds nothing.

Co-Authored-By: Claude Opus 5.5 <noreply@anthropic.com>
</commit_message>
<xml_diff>
--- a/documentation/00 Documentation Index.docx
+++ b/documentation/00 Documentation Index.docx
@@ -2291,6 +2291,74 @@
           </w:p>
         </w:tc>
       </w:tr>
+      <w:tr>
+        <w:tblPrEx>
+          <w:tblCellMar>
+            <w:top w:w="0" w:type="dxa"/>
+            <w:bottom w:w="0" w:type="dxa"/>
+          </w:tblCellMar>
+        </w:tblPrEx>
+        <w:tc>
+          <w:tcPr>
+            <w:tcW w:w="1300" w:type="dxa"/>
+            <w:tcMar>
+              <w:top w:w="50" w:type="dxa"/>
+              <w:left w:w="90" w:type="dxa"/>
+              <w:bottom w:w="50" w:type="dxa"/>
+              <w:right w:w="90" w:type="dxa"/>
+            </w:tcMar>
+          </w:tcPr>
+          <w:p>
+            <w:r>
+              <w:rPr>
+                <w:sz w:val="19"/>
+                <w:szCs w:val="19"/>
+              </w:rPr>
+              <w:t>1.1</w:t>
+            </w:r>
+          </w:p>
+        </w:tc>
+        <w:tc>
+          <w:tcPr>
+            <w:tcW w:w="1900" w:type="dxa"/>
+            <w:tcMar>
+              <w:top w:w="50" w:type="dxa"/>
+              <w:left w:w="90" w:type="dxa"/>
+              <w:bottom w:w="50" w:type="dxa"/>
+              <w:right w:w="90" w:type="dxa"/>
+            </w:tcMar>
+          </w:tcPr>
+          <w:p>
+            <w:r>
+              <w:rPr>
+                <w:sz w:val="19"/>
+                <w:szCs w:val="19"/>
+              </w:rPr>
+              <w:t>25 October 2026</w:t>
+            </w:r>
+          </w:p>
+        </w:tc>
+        <w:tc>
+          <w:tcPr>
+            <w:tcW w:w="6438" w:type="dxa"/>
+            <w:tcMar>
+              <w:top w:w="50" w:type="dxa"/>
+              <w:left w:w="90" w:type="dxa"/>
+              <w:bottom w:w="50" w:type="dxa"/>
+              <w:right w:w="90" w:type="dxa"/>
+            </w:tcMar>
+          </w:tcPr>
+          <w:p>
+            <w:r>
+              <w:rPr>
+                <w:sz w:val="19"/>
+                <w:szCs w:val="19"/>
+              </w:rPr>
+              <w:t>The website's forest look is live (Website User Interface).</w:t>
+            </w:r>
+          </w:p>
+        </w:tc>
+      </w:tr>
     </w:tbl>
     <w:p>
       <w:pPr>
@@ -2302,15 +2370,7 @@
           <w:sz w:val="20"/>
           <w:szCs w:val="20"/>
         </w:rPr>
-        <w:t xml:space="preserve">Keep this document up to date: when a feature, setting or server changes, edit the matching section here and add a </w:t>
-      </w:r>
-      <w:r>
-        <w:rPr>
-          <w:color w:val="5F6B66"/>
-          <w:sz w:val="20"/>
-          <w:szCs w:val="20"/>
-        </w:rPr>
-        <w:t>line to the table above.</w:t>
+        <w:t>Keep this document up to date: when a feature, setting or server changes, edit the matching section here and add a line to the table above.</w:t>
       </w:r>
     </w:p>
     <w:p>
@@ -2331,7 +2391,7 @@
     <w:sdt>
       <w:sdtPr>
         <w:alias w:val="Contents"/>
-        <w:id w:val="-557716737"/>
+        <w:id w:val="-100271955"/>
       </w:sdtPr>
       <w:sdtEndPr/>
       <w:sdtContent>
@@ -2358,7 +2418,7 @@
           <w:r>
             <w:fldChar w:fldCharType="separate"/>
           </w:r>
-          <w:hyperlink w:anchor="_Toc243816007" w:history="1">
+          <w:hyperlink w:anchor="_Toc243836803" w:history="1">
             <w:r>
               <w:rPr>
                 <w:rStyle w:val="Hyperlink"/>
@@ -2382,7 +2442,7 @@
               <w:rPr>
                 <w:noProof/>
               </w:rPr>
-              <w:instrText xml:space="preserve"> PAGEREF _Toc243816007 \h </w:instrText>
+              <w:instrText xml:space="preserve"> PAGEREF _Toc243836803 \h </w:instrText>
             </w:r>
             <w:r>
               <w:rPr>
@@ -2423,7 +2483,7 @@
               <w:szCs w:val="22"/>
             </w:rPr>
           </w:pPr>
-          <w:hyperlink w:anchor="_Toc243816008" w:history="1">
+          <w:hyperlink w:anchor="_Toc243836804" w:history="1">
             <w:r>
               <w:rPr>
                 <w:rStyle w:val="Hyperlink"/>
@@ -2447,7 +2507,7 @@
               <w:rPr>
                 <w:noProof/>
               </w:rPr>
-              <w:instrText xml:space="preserve"> PAGEREF _Toc243816008 \h </w:instrText>
+              <w:instrText xml:space="preserve"> PAGEREF _Toc243836804 \h </w:instrText>
             </w:r>
             <w:r>
               <w:rPr>
@@ -2488,7 +2548,7 @@
               <w:szCs w:val="22"/>
             </w:rPr>
           </w:pPr>
-          <w:hyperlink w:anchor="_Toc243816009" w:history="1">
+          <w:hyperlink w:anchor="_Toc243836805" w:history="1">
             <w:r>
               <w:rPr>
                 <w:rStyle w:val="Hyperlink"/>
@@ -2512,7 +2572,7 @@
               <w:rPr>
                 <w:noProof/>
               </w:rPr>
-              <w:instrText xml:space="preserve"> PAGEREF _Toc243816009 \h </w:instrText>
+              <w:instrText xml:space="preserve"> PAGEREF _Toc243836805 \h </w:instrText>
             </w:r>
             <w:r>
               <w:rPr>
@@ -2553,7 +2613,7 @@
               <w:szCs w:val="22"/>
             </w:rPr>
           </w:pPr>
-          <w:hyperlink w:anchor="_Toc243816010" w:history="1">
+          <w:hyperlink w:anchor="_Toc243836806" w:history="1">
             <w:r>
               <w:rPr>
                 <w:rStyle w:val="Hyperlink"/>
@@ -2577,7 +2637,7 @@
               <w:rPr>
                 <w:noProof/>
               </w:rPr>
-              <w:instrText xml:space="preserve"> PAGEREF _Toc243816010 \h </w:instrText>
+              <w:instrText xml:space="preserve"> PAGEREF _Toc243836806 \h </w:instrText>
             </w:r>
             <w:r>
               <w:rPr>
@@ -2620,7 +2680,7 @@
       <w:pPr>
         <w:pStyle w:val="Heading1"/>
       </w:pPr>
-      <w:bookmarkStart w:id="1" w:name="_Toc243816007"/>
+      <w:bookmarkStart w:id="1" w:name="_Toc243836803"/>
       <w:r>
         <w:lastRenderedPageBreak/>
         <w:t>1  About this documentation</w:t>
@@ -2632,10 +2692,13 @@
         <w:spacing w:after="120" w:line="276" w:lineRule="auto"/>
       </w:pPr>
       <w:r>
-        <w:t>This folder documents the complete Dateroem Wood Sales system as it stood on 3 October 2026 (updated on 4 October 2026 with the changes made that evening, and on 5 October 2026 for the desktop app working from any computer): the core backend, the database,</w:t>
+        <w:t xml:space="preserve">This folder documents the complete Dateroem Wood Sales </w:t>
       </w:r>
       <w:r>
-        <w:t xml:space="preserve"> payments and AI, the customer website, the staff mobile app, the desktop administration app, the servers behind each of them, and how to run and change everything. The documents were written from the source code itself.</w:t>
+        <w:t>system as it stood on 3 October 2026 (updated on 4 October 2026 with the changes made that evening, and on 5 October 2026 for the desktop app working from any computer): the core backend, the database, payments and AI, the customer website, the staff mobil</w:t>
+      </w:r>
+      <w:r>
+        <w:t>e app, the desktop administration app, the servers behind each of them, and how to run and change everything. The documents were written from the source code itself.</w:t>
       </w:r>
     </w:p>
     <w:p>
@@ -2643,10 +2706,10 @@
         <w:spacing w:after="120" w:line="276" w:lineRule="auto"/>
       </w:pPr>
       <w:r>
-        <w:t>All documents are ordinary Word fil</w:t>
+        <w:t>All documents are ordinary Word files and can be edited directly. Each has a "Document con</w:t>
       </w:r>
       <w:r>
-        <w:t>es and can be edited directly. Each has a "Document control" table at the front - add a line there whenever you change it.</w:t>
+        <w:t>trol" table at the front - add a line there whenever you change it.</w:t>
       </w:r>
     </w:p>
     <w:p>
@@ -2658,7 +2721,7 @@
       <w:pPr>
         <w:pStyle w:val="Heading1"/>
       </w:pPr>
-      <w:bookmarkStart w:id="2" w:name="_Toc243816008"/>
+      <w:bookmarkStart w:id="2" w:name="_Toc243836804"/>
       <w:r>
         <w:lastRenderedPageBreak/>
         <w:t>2  Where to start</w:t>
@@ -2807,14 +2870,7 @@
                 <w:sz w:val="19"/>
                 <w:szCs w:val="19"/>
               </w:rPr>
-              <w:t>System Overview and Architecture; Configuration and Secrets Reference; Pr</w:t>
-            </w:r>
-            <w:r>
-              <w:rPr>
-                <w:sz w:val="19"/>
-                <w:szCs w:val="19"/>
-              </w:rPr>
-              <w:t>oduction Go-Live Checklist; Hosting and Deployment Guide; Running and Operating the System</w:t>
+              <w:t>System Overview and Architecture; Configuration and Secrets Reference; Production Go-Live Checklist; Hosting and Deployment Guide; Running and Operating the System</w:t>
             </w:r>
           </w:p>
         </w:tc>
@@ -2875,7 +2931,14 @@
                 <w:sz w:val="19"/>
                 <w:szCs w:val="19"/>
               </w:rPr>
-              <w:t>Hosting and Deployment Guide (every value to change after the move is listed there); Production Go-Live Checklist</w:t>
+              <w:t xml:space="preserve">Hosting and Deployment Guide (every value </w:t>
+            </w:r>
+            <w:r>
+              <w:rPr>
+                <w:sz w:val="19"/>
+                <w:szCs w:val="19"/>
+              </w:rPr>
+              <w:t>to change after the move is listed there); Production Go-Live Checklist</w:t>
             </w:r>
           </w:p>
         </w:tc>
@@ -3135,7 +3198,7 @@
       <w:pPr>
         <w:pStyle w:val="Heading1"/>
       </w:pPr>
-      <w:bookmarkStart w:id="3" w:name="_Toc243816009"/>
+      <w:bookmarkStart w:id="3" w:name="_Toc243836805"/>
       <w:r>
         <w:lastRenderedPageBreak/>
         <w:t>3  The documents</w:t>
@@ -5191,7 +5254,7 @@
       <w:pPr>
         <w:pStyle w:val="Heading1"/>
       </w:pPr>
-      <w:bookmarkStart w:id="4" w:name="_Toc243816010"/>
+      <w:bookmarkStart w:id="4" w:name="_Toc243836806"/>
       <w:r>
         <w:lastRenderedPageBreak/>
         <w:t>4  Conventions used</w:t>
@@ -5571,10 +5634,72 @@
 <file path=word/numbering.xml><?xml version="1.0" encoding="utf-8"?>
 <w:numbering xmlns:wpc="http://schemas.microsoft.com/office/word/2010/wordprocessingCanvas" xmlns:cx="http://schemas.microsoft.com/office/drawing/2014/chartex" xmlns:cx1="http://schemas.microsoft.com/office/drawing/2015/9/8/chartex" xmlns:mc="http://schemas.openxmlformats.org/markup-compatibility/2006" xmlns:o="urn:schemas-microsoft-com:office:office" xmlns:r="http://schemas.openxmlformats.org/officeDocument/2006/relationships" xmlns:m="http://schemas.openxmlformats.org/officeDocument/2006/math" xmlns:v="urn:schemas-microsoft-com:vml" xmlns:wp14="http://schemas.microsoft.com/office/word/2010/wordprocessingDrawing" xmlns:wp="http://schemas.openxmlformats.org/drawingml/2006/wordprocessingDrawing" xmlns:w10="urn:schemas-microsoft-com:office:word" xmlns:w="http://schemas.openxmlformats.org/wordprocessingml/2006/main" xmlns:w14="http://schemas.microsoft.com/office/word/2010/wordml" xmlns:w15="http://schemas.microsoft.com/office/word/2012/wordml" xmlns:w16se="http://schemas.microsoft.com/office/word/2015/wordml/symex" xmlns:wpg="http://schemas.microsoft.com/office/word/2010/wordprocessingGroup" xmlns:wpi="http://schemas.microsoft.com/office/word/2010/wordprocessingInk" xmlns:wne="http://schemas.microsoft.com/office/word/2006/wordml" xmlns:wps="http://schemas.microsoft.com/office/word/2010/wordprocessingShape" mc:Ignorable="w14 w15 w16se wp14">
   <w:abstractNum w:abstractNumId="0" w15:restartNumberingAfterBreak="0">
-    <w:nsid w:val="4292187C"/>
+    <w:nsid w:val="26DD2C64"/>
     <w:multiLevelType w:val="hybridMultilevel"/>
-    <w:tmpl w:val="F3A82124"/>
-    <w:lvl w:ilvl="0" w:tplc="DCAC774E">
+    <w:tmpl w:val="6CE6490A"/>
+    <w:lvl w:ilvl="0" w:tplc="8F982BEE" w:tentative="1">
+      <w:start w:val="1"/>
+      <w:numFmt w:val="decimal"/>
+      <w:lvlText w:val="%1."/>
+      <w:lvlJc w:val="left"/>
+      <w:pPr>
+        <w:ind w:left="540" w:hanging="300"/>
+      </w:pPr>
+    </w:lvl>
+    <w:lvl w:ilvl="1" w:tplc="C382E774" w:tentative="1">
+      <w:start w:val="1"/>
+      <w:numFmt w:val="lowerLetter"/>
+      <w:lvlText w:val="%2."/>
+      <w:lvlJc w:val="left"/>
+      <w:pPr>
+        <w:ind w:left="940" w:hanging="300"/>
+      </w:pPr>
+    </w:lvl>
+    <w:lvl w:ilvl="2" w:tplc="FF4224F4" w:tentative="1">
+      <w:start w:val="1"/>
+      <w:numFmt w:val="lowerRoman"/>
+      <w:lvlText w:val="%3."/>
+      <w:lvlJc w:val="left"/>
+      <w:pPr>
+        <w:ind w:left="1340" w:hanging="300"/>
+      </w:pPr>
+    </w:lvl>
+    <w:lvl w:ilvl="3" w:tplc="108E7954">
+      <w:numFmt w:val="decimal"/>
+      <w:lvlText w:val=""/>
+      <w:lvlJc w:val="left"/>
+    </w:lvl>
+    <w:lvl w:ilvl="4" w:tplc="E6143708">
+      <w:numFmt w:val="decimal"/>
+      <w:lvlText w:val=""/>
+      <w:lvlJc w:val="left"/>
+    </w:lvl>
+    <w:lvl w:ilvl="5" w:tplc="B3D801B2">
+      <w:numFmt w:val="decimal"/>
+      <w:lvlText w:val=""/>
+      <w:lvlJc w:val="left"/>
+    </w:lvl>
+    <w:lvl w:ilvl="6" w:tplc="5C1AA56E">
+      <w:numFmt w:val="decimal"/>
+      <w:lvlText w:val=""/>
+      <w:lvlJc w:val="left"/>
+    </w:lvl>
+    <w:lvl w:ilvl="7" w:tplc="1690EEF4">
+      <w:numFmt w:val="decimal"/>
+      <w:lvlText w:val=""/>
+      <w:lvlJc w:val="left"/>
+    </w:lvl>
+    <w:lvl w:ilvl="8" w:tplc="AB7EA328">
+      <w:numFmt w:val="decimal"/>
+      <w:lvlText w:val=""/>
+      <w:lvlJc w:val="left"/>
+    </w:lvl>
+  </w:abstractNum>
+  <w:abstractNum w:abstractNumId="1" w15:restartNumberingAfterBreak="0">
+    <w:nsid w:val="409A049C"/>
+    <w:multiLevelType w:val="hybridMultilevel"/>
+    <w:tmpl w:val="2C32EFE0"/>
+    <w:lvl w:ilvl="0" w:tplc="E77C2582">
       <w:start w:val="1"/>
       <w:numFmt w:val="bullet"/>
       <w:lvlText w:val="•"/>
@@ -5583,7 +5708,7 @@
         <w:ind w:left="540" w:hanging="300"/>
       </w:pPr>
     </w:lvl>
-    <w:lvl w:ilvl="1" w:tplc="4F92013C" w:tentative="1">
+    <w:lvl w:ilvl="1" w:tplc="59BACCD6" w:tentative="1">
       <w:start w:val="1"/>
       <w:numFmt w:val="bullet"/>
       <w:lvlText w:val="–"/>
@@ -5592,7 +5717,7 @@
         <w:ind w:left="940" w:hanging="300"/>
       </w:pPr>
     </w:lvl>
-    <w:lvl w:ilvl="2" w:tplc="D3B8E436" w:tentative="1">
+    <w:lvl w:ilvl="2" w:tplc="B9E6294C" w:tentative="1">
       <w:start w:val="1"/>
       <w:numFmt w:val="bullet"/>
       <w:lvlText w:val="◦"/>
@@ -5601,42 +5726,42 @@
         <w:ind w:left="1340" w:hanging="300"/>
       </w:pPr>
     </w:lvl>
-    <w:lvl w:ilvl="3" w:tplc="AC861ED6">
+    <w:lvl w:ilvl="3" w:tplc="B3485C12">
       <w:numFmt w:val="decimal"/>
       <w:lvlText w:val=""/>
       <w:lvlJc w:val="left"/>
     </w:lvl>
-    <w:lvl w:ilvl="4" w:tplc="673E1BD6">
+    <w:lvl w:ilvl="4" w:tplc="8CD415EC">
       <w:numFmt w:val="decimal"/>
       <w:lvlText w:val=""/>
       <w:lvlJc w:val="left"/>
     </w:lvl>
-    <w:lvl w:ilvl="5" w:tplc="2B3AC28E">
+    <w:lvl w:ilvl="5" w:tplc="756873EC">
       <w:numFmt w:val="decimal"/>
       <w:lvlText w:val=""/>
       <w:lvlJc w:val="left"/>
     </w:lvl>
-    <w:lvl w:ilvl="6" w:tplc="6B58A848">
+    <w:lvl w:ilvl="6" w:tplc="B1C68DA8">
       <w:numFmt w:val="decimal"/>
       <w:lvlText w:val=""/>
       <w:lvlJc w:val="left"/>
     </w:lvl>
-    <w:lvl w:ilvl="7" w:tplc="4B1AA302">
+    <w:lvl w:ilvl="7" w:tplc="F126ED58">
       <w:numFmt w:val="decimal"/>
       <w:lvlText w:val=""/>
       <w:lvlJc w:val="left"/>
     </w:lvl>
-    <w:lvl w:ilvl="8" w:tplc="1918260A">
+    <w:lvl w:ilvl="8" w:tplc="0EB8F6EC">
       <w:numFmt w:val="decimal"/>
       <w:lvlText w:val=""/>
       <w:lvlJc w:val="left"/>
     </w:lvl>
   </w:abstractNum>
-  <w:abstractNum w:abstractNumId="1" w15:restartNumberingAfterBreak="0">
-    <w:nsid w:val="53B50E25"/>
+  <w:abstractNum w:abstractNumId="2" w15:restartNumberingAfterBreak="0">
+    <w:nsid w:val="64BF3B57"/>
     <w:multiLevelType w:val="hybridMultilevel"/>
-    <w:tmpl w:val="C3841188"/>
-    <w:lvl w:ilvl="0" w:tplc="11C4DADC" w:tentative="1">
+    <w:tmpl w:val="51BE5CBC"/>
+    <w:lvl w:ilvl="0" w:tplc="ED600CDC" w:tentative="1">
       <w:start w:val="1"/>
       <w:numFmt w:val="bullet"/>
       <w:lvlText w:val="●"/>
@@ -5645,7 +5770,7 @@
         <w:ind w:left="720" w:hanging="360"/>
       </w:pPr>
     </w:lvl>
-    <w:lvl w:ilvl="1" w:tplc="BB867D00" w:tentative="1">
+    <w:lvl w:ilvl="1" w:tplc="CCE89182" w:tentative="1">
       <w:start w:val="1"/>
       <w:numFmt w:val="bullet"/>
       <w:lvlText w:val="○"/>
@@ -5654,7 +5779,7 @@
         <w:ind w:left="1440" w:hanging="360"/>
       </w:pPr>
     </w:lvl>
-    <w:lvl w:ilvl="2" w:tplc="C4FC7DF6" w:tentative="1">
+    <w:lvl w:ilvl="2" w:tplc="B27E1ABC" w:tentative="1">
       <w:start w:val="1"/>
       <w:numFmt w:val="bullet"/>
       <w:lvlText w:val="■"/>
@@ -5663,7 +5788,7 @@
         <w:ind w:left="2160" w:hanging="360"/>
       </w:pPr>
     </w:lvl>
-    <w:lvl w:ilvl="3" w:tplc="BC20BCE2" w:tentative="1">
+    <w:lvl w:ilvl="3" w:tplc="0B5AEDB2" w:tentative="1">
       <w:start w:val="1"/>
       <w:numFmt w:val="bullet"/>
       <w:lvlText w:val="●"/>
@@ -5672,7 +5797,7 @@
         <w:ind w:left="2880" w:hanging="360"/>
       </w:pPr>
     </w:lvl>
-    <w:lvl w:ilvl="4" w:tplc="9FAE56FE" w:tentative="1">
+    <w:lvl w:ilvl="4" w:tplc="779AE4A0" w:tentative="1">
       <w:start w:val="1"/>
       <w:numFmt w:val="bullet"/>
       <w:lvlText w:val="○"/>
@@ -5681,7 +5806,7 @@
         <w:ind w:left="3600" w:hanging="360"/>
       </w:pPr>
     </w:lvl>
-    <w:lvl w:ilvl="5" w:tplc="D8720B0C" w:tentative="1">
+    <w:lvl w:ilvl="5" w:tplc="74541814" w:tentative="1">
       <w:start w:val="1"/>
       <w:numFmt w:val="bullet"/>
       <w:lvlText w:val="■"/>
@@ -5690,7 +5815,7 @@
         <w:ind w:left="4320" w:hanging="360"/>
       </w:pPr>
     </w:lvl>
-    <w:lvl w:ilvl="6" w:tplc="1046C230" w:tentative="1">
+    <w:lvl w:ilvl="6" w:tplc="03E0E676" w:tentative="1">
       <w:start w:val="1"/>
       <w:numFmt w:val="bullet"/>
       <w:lvlText w:val="●"/>
@@ -5699,7 +5824,7 @@
         <w:ind w:left="5040" w:hanging="360"/>
       </w:pPr>
     </w:lvl>
-    <w:lvl w:ilvl="7" w:tplc="2BAA68C8" w:tentative="1">
+    <w:lvl w:ilvl="7" w:tplc="E3668556" w:tentative="1">
       <w:start w:val="1"/>
       <w:numFmt w:val="bullet"/>
       <w:lvlText w:val="●"/>
@@ -5708,7 +5833,7 @@
         <w:ind w:left="5760" w:hanging="360"/>
       </w:pPr>
     </w:lvl>
-    <w:lvl w:ilvl="8" w:tplc="331071D6" w:tentative="1">
+    <w:lvl w:ilvl="8" w:tplc="BB8A440A" w:tentative="1">
       <w:start w:val="1"/>
       <w:numFmt w:val="bullet"/>
       <w:lvlText w:val="●"/>
@@ -5718,76 +5843,14 @@
       </w:pPr>
     </w:lvl>
   </w:abstractNum>
-  <w:abstractNum w:abstractNumId="2" w15:restartNumberingAfterBreak="0">
-    <w:nsid w:val="66BD287F"/>
-    <w:multiLevelType w:val="hybridMultilevel"/>
-    <w:tmpl w:val="BA561136"/>
-    <w:lvl w:ilvl="0" w:tplc="9482C452" w:tentative="1">
-      <w:start w:val="1"/>
-      <w:numFmt w:val="decimal"/>
-      <w:lvlText w:val="%1."/>
-      <w:lvlJc w:val="left"/>
-      <w:pPr>
-        <w:ind w:left="540" w:hanging="300"/>
-      </w:pPr>
-    </w:lvl>
-    <w:lvl w:ilvl="1" w:tplc="0FF82020" w:tentative="1">
-      <w:start w:val="1"/>
-      <w:numFmt w:val="lowerLetter"/>
-      <w:lvlText w:val="%2."/>
-      <w:lvlJc w:val="left"/>
-      <w:pPr>
-        <w:ind w:left="940" w:hanging="300"/>
-      </w:pPr>
-    </w:lvl>
-    <w:lvl w:ilvl="2" w:tplc="E8CA5458" w:tentative="1">
-      <w:start w:val="1"/>
-      <w:numFmt w:val="lowerRoman"/>
-      <w:lvlText w:val="%3."/>
-      <w:lvlJc w:val="left"/>
-      <w:pPr>
-        <w:ind w:left="1340" w:hanging="300"/>
-      </w:pPr>
-    </w:lvl>
-    <w:lvl w:ilvl="3" w:tplc="3C980AA6">
-      <w:numFmt w:val="decimal"/>
-      <w:lvlText w:val=""/>
-      <w:lvlJc w:val="left"/>
-    </w:lvl>
-    <w:lvl w:ilvl="4" w:tplc="DB48102C">
-      <w:numFmt w:val="decimal"/>
-      <w:lvlText w:val=""/>
-      <w:lvlJc w:val="left"/>
-    </w:lvl>
-    <w:lvl w:ilvl="5" w:tplc="CDA00AA2">
-      <w:numFmt w:val="decimal"/>
-      <w:lvlText w:val=""/>
-      <w:lvlJc w:val="left"/>
-    </w:lvl>
-    <w:lvl w:ilvl="6" w:tplc="31609510">
-      <w:numFmt w:val="decimal"/>
-      <w:lvlText w:val=""/>
-      <w:lvlJc w:val="left"/>
-    </w:lvl>
-    <w:lvl w:ilvl="7" w:tplc="02780680">
-      <w:numFmt w:val="decimal"/>
-      <w:lvlText w:val=""/>
-      <w:lvlJc w:val="left"/>
-    </w:lvl>
-    <w:lvl w:ilvl="8" w:tplc="B6EC2746">
-      <w:numFmt w:val="decimal"/>
-      <w:lvlText w:val=""/>
-      <w:lvlJc w:val="left"/>
-    </w:lvl>
-  </w:abstractNum>
   <w:num w:numId="1">
-    <w:abstractNumId w:val="1"/>
+    <w:abstractNumId w:val="2"/>
     <w:lvlOverride w:ilvl="0">
       <w:startOverride w:val="1"/>
     </w:lvlOverride>
   </w:num>
   <w:num w:numId="2">
-    <w:abstractNumId w:val="0"/>
+    <w:abstractNumId w:val="1"/>
     <w:lvlOverride w:ilvl="0">
       <w:startOverride w:val="1"/>
     </w:lvlOverride>
@@ -6416,7 +6479,7 @@
     <w:autoRedefine/>
     <w:uiPriority w:val="39"/>
     <w:unhideWhenUsed/>
-    <w:rsid w:val="002E6626"/>
+    <w:rsid w:val="00082705"/>
     <w:pPr>
       <w:spacing w:after="100"/>
     </w:pPr>

</xml_diff>

<commit_message>
Documents: the modern chat is live
Dated 1.1 rows of 25 October 2026 (evening) in four documents. Website User Interface: a new section "The chat panel (forest look)" (the forest behind it, the emblem header with Online, the welcome with GENERAL_QUESTIONS, the bubbles, the message bar, chatAnswer.js unfolding one-line lists) with a screenshot from the live site. AI Assistant: COMPANY_FACTS in the context table and the "where to change" table, and the retry when an answer ends on a colon. Development Timeline and the Index: the release. The checker requires the new text; all 18 documents pass and the secret scan finds nothing.

Co-Authored-By: Claude Opus 5.5 <noreply@anthropic.com>
</commit_message>
<xml_diff>
--- a/documentation/00 Documentation Index.docx
+++ b/documentation/00 Documentation Index.docx
@@ -80,7 +80,7 @@
           <w:left w:w="10" w:type="dxa"/>
           <w:right w:w="10" w:type="dxa"/>
         </w:tblCellMar>
-        <w:tblLook w:val="04A0" w:firstRow="1" w:lastRow="0" w:firstColumn="1" w:lastColumn="0" w:noHBand="0" w:noVBand="1"/>
+        <w:tblLook w:val="0000" w:firstRow="0" w:lastRow="0" w:firstColumn="0" w:lastColumn="0" w:noHBand="0" w:noVBand="0"/>
       </w:tblPr>
       <w:tblGrid>
         <w:gridCol w:w="2600"/>
@@ -461,7 +461,7 @@
           <w:left w:w="10" w:type="dxa"/>
           <w:right w:w="10" w:type="dxa"/>
         </w:tblCellMar>
-        <w:tblLook w:val="04A0" w:firstRow="1" w:lastRow="0" w:firstColumn="1" w:lastColumn="0" w:noHBand="0" w:noVBand="1"/>
+        <w:tblLook w:val="0000" w:firstRow="0" w:lastRow="0" w:firstColumn="0" w:lastColumn="0" w:noHBand="0" w:noVBand="0"/>
       </w:tblPr>
       <w:tblGrid>
         <w:gridCol w:w="1300"/>
@@ -2355,6 +2355,81 @@
                 <w:szCs w:val="19"/>
               </w:rPr>
               <w:t>The website's forest look is live (Website User Interface).</w:t>
+            </w:r>
+          </w:p>
+        </w:tc>
+      </w:tr>
+      <w:tr>
+        <w:tblPrEx>
+          <w:tblCellMar>
+            <w:top w:w="0" w:type="dxa"/>
+            <w:bottom w:w="0" w:type="dxa"/>
+          </w:tblCellMar>
+        </w:tblPrEx>
+        <w:tc>
+          <w:tcPr>
+            <w:tcW w:w="1300" w:type="dxa"/>
+            <w:tcMar>
+              <w:top w:w="50" w:type="dxa"/>
+              <w:left w:w="90" w:type="dxa"/>
+              <w:bottom w:w="50" w:type="dxa"/>
+              <w:right w:w="90" w:type="dxa"/>
+            </w:tcMar>
+          </w:tcPr>
+          <w:p>
+            <w:r>
+              <w:rPr>
+                <w:sz w:val="19"/>
+                <w:szCs w:val="19"/>
+              </w:rPr>
+              <w:t>1.1</w:t>
+            </w:r>
+          </w:p>
+        </w:tc>
+        <w:tc>
+          <w:tcPr>
+            <w:tcW w:w="1900" w:type="dxa"/>
+            <w:tcMar>
+              <w:top w:w="50" w:type="dxa"/>
+              <w:left w:w="90" w:type="dxa"/>
+              <w:bottom w:w="50" w:type="dxa"/>
+              <w:right w:w="90" w:type="dxa"/>
+            </w:tcMar>
+          </w:tcPr>
+          <w:p>
+            <w:r>
+              <w:rPr>
+                <w:sz w:val="19"/>
+                <w:szCs w:val="19"/>
+              </w:rPr>
+              <w:t>25 October 2026</w:t>
+            </w:r>
+          </w:p>
+        </w:tc>
+        <w:tc>
+          <w:tcPr>
+            <w:tcW w:w="6438" w:type="dxa"/>
+            <w:tcMar>
+              <w:top w:w="50" w:type="dxa"/>
+              <w:left w:w="90" w:type="dxa"/>
+              <w:bottom w:w="50" w:type="dxa"/>
+              <w:right w:w="90" w:type="dxa"/>
+            </w:tcMar>
+          </w:tcPr>
+          <w:p>
+            <w:r>
+              <w:rPr>
+                <w:sz w:val="19"/>
+                <w:szCs w:val="19"/>
+              </w:rPr>
+              <w:t>The modern cha</w:t>
+            </w:r>
+            <w:r>
+              <w:rPr>
+                <w:sz w:val="19"/>
+                <w:szCs w:val="19"/>
+              </w:rPr>
+              <w:t>t panel is live (Website User Interface, AI Assistant).</w:t>
             </w:r>
           </w:p>
         </w:tc>
@@ -2391,7 +2466,7 @@
     <w:sdt>
       <w:sdtPr>
         <w:alias w:val="Contents"/>
-        <w:id w:val="-100271955"/>
+        <w:id w:val="-133335826"/>
       </w:sdtPr>
       <w:sdtEndPr/>
       <w:sdtContent>
@@ -2418,7 +2493,7 @@
           <w:r>
             <w:fldChar w:fldCharType="separate"/>
           </w:r>
-          <w:hyperlink w:anchor="_Toc243836803" w:history="1">
+          <w:hyperlink w:anchor="_Toc243848196" w:history="1">
             <w:r>
               <w:rPr>
                 <w:rStyle w:val="Hyperlink"/>
@@ -2442,7 +2517,7 @@
               <w:rPr>
                 <w:noProof/>
               </w:rPr>
-              <w:instrText xml:space="preserve"> PAGEREF _Toc243836803 \h </w:instrText>
+              <w:instrText xml:space="preserve"> PAGEREF _Toc243848196 \h </w:instrText>
             </w:r>
             <w:r>
               <w:rPr>
@@ -2483,7 +2558,7 @@
               <w:szCs w:val="22"/>
             </w:rPr>
           </w:pPr>
-          <w:hyperlink w:anchor="_Toc243836804" w:history="1">
+          <w:hyperlink w:anchor="_Toc243848197" w:history="1">
             <w:r>
               <w:rPr>
                 <w:rStyle w:val="Hyperlink"/>
@@ -2507,7 +2582,7 @@
               <w:rPr>
                 <w:noProof/>
               </w:rPr>
-              <w:instrText xml:space="preserve"> PAGEREF _Toc243836804 \h </w:instrText>
+              <w:instrText xml:space="preserve"> PAGEREF _Toc243848197 \h </w:instrText>
             </w:r>
             <w:r>
               <w:rPr>
@@ -2548,7 +2623,7 @@
               <w:szCs w:val="22"/>
             </w:rPr>
           </w:pPr>
-          <w:hyperlink w:anchor="_Toc243836805" w:history="1">
+          <w:hyperlink w:anchor="_Toc243848198" w:history="1">
             <w:r>
               <w:rPr>
                 <w:rStyle w:val="Hyperlink"/>
@@ -2572,7 +2647,7 @@
               <w:rPr>
                 <w:noProof/>
               </w:rPr>
-              <w:instrText xml:space="preserve"> PAGEREF _Toc243836805 \h </w:instrText>
+              <w:instrText xml:space="preserve"> PAGEREF _Toc243848198 \h </w:instrText>
             </w:r>
             <w:r>
               <w:rPr>
@@ -2613,7 +2688,7 @@
               <w:szCs w:val="22"/>
             </w:rPr>
           </w:pPr>
-          <w:hyperlink w:anchor="_Toc243836806" w:history="1">
+          <w:hyperlink w:anchor="_Toc243848199" w:history="1">
             <w:r>
               <w:rPr>
                 <w:rStyle w:val="Hyperlink"/>
@@ -2637,7 +2712,7 @@
               <w:rPr>
                 <w:noProof/>
               </w:rPr>
-              <w:instrText xml:space="preserve"> PAGEREF _Toc243836806 \h </w:instrText>
+              <w:instrText xml:space="preserve"> PAGEREF _Toc243848199 \h </w:instrText>
             </w:r>
             <w:r>
               <w:rPr>
@@ -2680,7 +2755,7 @@
       <w:pPr>
         <w:pStyle w:val="Heading1"/>
       </w:pPr>
-      <w:bookmarkStart w:id="1" w:name="_Toc243836803"/>
+      <w:bookmarkStart w:id="1" w:name="_Toc243848196"/>
       <w:r>
         <w:lastRenderedPageBreak/>
         <w:t>1  About this documentation</w:t>
@@ -2692,13 +2767,10 @@
         <w:spacing w:after="120" w:line="276" w:lineRule="auto"/>
       </w:pPr>
       <w:r>
-        <w:t xml:space="preserve">This folder documents the complete Dateroem Wood Sales </w:t>
+        <w:t>This folder documents the complete Dateroem Wood Sales system as it stood on 3 October 2026 (updated on 4 October 2026 with the changes made that evening, and on 5 October 2026 for the desktop app working from any computer): the</w:t>
       </w:r>
       <w:r>
-        <w:t>system as it stood on 3 October 2026 (updated on 4 October 2026 with the changes made that evening, and on 5 October 2026 for the desktop app working from any computer): the core backend, the database, payments and AI, the customer website, the staff mobil</w:t>
-      </w:r>
-      <w:r>
-        <w:t>e app, the desktop administration app, the servers behind each of them, and how to run and change everything. The documents were written from the source code itself.</w:t>
+        <w:t xml:space="preserve"> core backend, the database, payments and AI, the customer website, the staff mobile app, the desktop administration app, the servers behind each of them, and how to run and change everything. The documents were written from the source code itself.</w:t>
       </w:r>
     </w:p>
     <w:p>
@@ -2706,10 +2778,10 @@
         <w:spacing w:after="120" w:line="276" w:lineRule="auto"/>
       </w:pPr>
       <w:r>
-        <w:t>All documents are ordinary Word files and can be edited directly. Each has a "Document con</w:t>
+        <w:t>All doc</w:t>
       </w:r>
       <w:r>
-        <w:t>trol" table at the front - add a line there whenever you change it.</w:t>
+        <w:t>uments are ordinary Word files and can be edited directly. Each has a "Document control" table at the front - add a line there whenever you change it.</w:t>
       </w:r>
     </w:p>
     <w:p>
@@ -2721,7 +2793,7 @@
       <w:pPr>
         <w:pStyle w:val="Heading1"/>
       </w:pPr>
-      <w:bookmarkStart w:id="2" w:name="_Toc243836804"/>
+      <w:bookmarkStart w:id="2" w:name="_Toc243848197"/>
       <w:r>
         <w:lastRenderedPageBreak/>
         <w:t>2  Where to start</w:t>
@@ -2744,7 +2816,7 @@
           <w:left w:w="10" w:type="dxa"/>
           <w:right w:w="10" w:type="dxa"/>
         </w:tblCellMar>
-        <w:tblLook w:val="04A0" w:firstRow="1" w:lastRow="0" w:firstColumn="1" w:lastColumn="0" w:noHBand="0" w:noVBand="1"/>
+        <w:tblLook w:val="0000" w:firstRow="0" w:lastRow="0" w:firstColumn="0" w:lastColumn="0" w:noHBand="0" w:noVBand="0"/>
       </w:tblPr>
       <w:tblGrid>
         <w:gridCol w:w="3125"/>
@@ -2931,14 +3003,7 @@
                 <w:sz w:val="19"/>
                 <w:szCs w:val="19"/>
               </w:rPr>
-              <w:t xml:space="preserve">Hosting and Deployment Guide (every value </w:t>
-            </w:r>
-            <w:r>
-              <w:rPr>
-                <w:sz w:val="19"/>
-                <w:szCs w:val="19"/>
-              </w:rPr>
-              <w:t>to change after the move is listed there); Production Go-Live Checklist</w:t>
+              <w:t>Hosting and Deployment Guide (every value to change after the move is listed there); Production Go-Live Checklist</w:t>
             </w:r>
           </w:p>
         </w:tc>
@@ -3198,7 +3263,7 @@
       <w:pPr>
         <w:pStyle w:val="Heading1"/>
       </w:pPr>
-      <w:bookmarkStart w:id="3" w:name="_Toc243836805"/>
+      <w:bookmarkStart w:id="3" w:name="_Toc243848198"/>
       <w:r>
         <w:lastRenderedPageBreak/>
         <w:t>3  The documents</w:t>
@@ -3221,7 +3286,7 @@
           <w:left w:w="10" w:type="dxa"/>
           <w:right w:w="10" w:type="dxa"/>
         </w:tblCellMar>
-        <w:tblLook w:val="04A0" w:firstRow="1" w:lastRow="0" w:firstColumn="1" w:lastColumn="0" w:noHBand="0" w:noVBand="1"/>
+        <w:tblLook w:val="0000" w:firstRow="0" w:lastRow="0" w:firstColumn="0" w:lastColumn="0" w:noHBand="0" w:noVBand="0"/>
       </w:tblPr>
       <w:tblGrid>
         <w:gridCol w:w="2289"/>
@@ -5254,7 +5319,7 @@
       <w:pPr>
         <w:pStyle w:val="Heading1"/>
       </w:pPr>
-      <w:bookmarkStart w:id="4" w:name="_Toc243836806"/>
+      <w:bookmarkStart w:id="4" w:name="_Toc243848199"/>
       <w:r>
         <w:lastRenderedPageBreak/>
         <w:t>4  Conventions used</w:t>
@@ -5634,134 +5699,10 @@
 <file path=word/numbering.xml><?xml version="1.0" encoding="utf-8"?>
 <w:numbering xmlns:wpc="http://schemas.microsoft.com/office/word/2010/wordprocessingCanvas" xmlns:cx="http://schemas.microsoft.com/office/drawing/2014/chartex" xmlns:cx1="http://schemas.microsoft.com/office/drawing/2015/9/8/chartex" xmlns:mc="http://schemas.openxmlformats.org/markup-compatibility/2006" xmlns:o="urn:schemas-microsoft-com:office:office" xmlns:r="http://schemas.openxmlformats.org/officeDocument/2006/relationships" xmlns:m="http://schemas.openxmlformats.org/officeDocument/2006/math" xmlns:v="urn:schemas-microsoft-com:vml" xmlns:wp14="http://schemas.microsoft.com/office/word/2010/wordprocessingDrawing" xmlns:wp="http://schemas.openxmlformats.org/drawingml/2006/wordprocessingDrawing" xmlns:w10="urn:schemas-microsoft-com:office:word" xmlns:w="http://schemas.openxmlformats.org/wordprocessingml/2006/main" xmlns:w14="http://schemas.microsoft.com/office/word/2010/wordml" xmlns:w15="http://schemas.microsoft.com/office/word/2012/wordml" xmlns:w16se="http://schemas.microsoft.com/office/word/2015/wordml/symex" xmlns:wpg="http://schemas.microsoft.com/office/word/2010/wordprocessingGroup" xmlns:wpi="http://schemas.microsoft.com/office/word/2010/wordprocessingInk" xmlns:wne="http://schemas.microsoft.com/office/word/2006/wordml" xmlns:wps="http://schemas.microsoft.com/office/word/2010/wordprocessingShape" mc:Ignorable="w14 w15 w16se wp14">
   <w:abstractNum w:abstractNumId="0" w15:restartNumberingAfterBreak="0">
-    <w:nsid w:val="26DD2C64"/>
+    <w:nsid w:val="3FAC6370"/>
     <w:multiLevelType w:val="hybridMultilevel"/>
-    <w:tmpl w:val="6CE6490A"/>
-    <w:lvl w:ilvl="0" w:tplc="8F982BEE" w:tentative="1">
-      <w:start w:val="1"/>
-      <w:numFmt w:val="decimal"/>
-      <w:lvlText w:val="%1."/>
-      <w:lvlJc w:val="left"/>
-      <w:pPr>
-        <w:ind w:left="540" w:hanging="300"/>
-      </w:pPr>
-    </w:lvl>
-    <w:lvl w:ilvl="1" w:tplc="C382E774" w:tentative="1">
-      <w:start w:val="1"/>
-      <w:numFmt w:val="lowerLetter"/>
-      <w:lvlText w:val="%2."/>
-      <w:lvlJc w:val="left"/>
-      <w:pPr>
-        <w:ind w:left="940" w:hanging="300"/>
-      </w:pPr>
-    </w:lvl>
-    <w:lvl w:ilvl="2" w:tplc="FF4224F4" w:tentative="1">
-      <w:start w:val="1"/>
-      <w:numFmt w:val="lowerRoman"/>
-      <w:lvlText w:val="%3."/>
-      <w:lvlJc w:val="left"/>
-      <w:pPr>
-        <w:ind w:left="1340" w:hanging="300"/>
-      </w:pPr>
-    </w:lvl>
-    <w:lvl w:ilvl="3" w:tplc="108E7954">
-      <w:numFmt w:val="decimal"/>
-      <w:lvlText w:val=""/>
-      <w:lvlJc w:val="left"/>
-    </w:lvl>
-    <w:lvl w:ilvl="4" w:tplc="E6143708">
-      <w:numFmt w:val="decimal"/>
-      <w:lvlText w:val=""/>
-      <w:lvlJc w:val="left"/>
-    </w:lvl>
-    <w:lvl w:ilvl="5" w:tplc="B3D801B2">
-      <w:numFmt w:val="decimal"/>
-      <w:lvlText w:val=""/>
-      <w:lvlJc w:val="left"/>
-    </w:lvl>
-    <w:lvl w:ilvl="6" w:tplc="5C1AA56E">
-      <w:numFmt w:val="decimal"/>
-      <w:lvlText w:val=""/>
-      <w:lvlJc w:val="left"/>
-    </w:lvl>
-    <w:lvl w:ilvl="7" w:tplc="1690EEF4">
-      <w:numFmt w:val="decimal"/>
-      <w:lvlText w:val=""/>
-      <w:lvlJc w:val="left"/>
-    </w:lvl>
-    <w:lvl w:ilvl="8" w:tplc="AB7EA328">
-      <w:numFmt w:val="decimal"/>
-      <w:lvlText w:val=""/>
-      <w:lvlJc w:val="left"/>
-    </w:lvl>
-  </w:abstractNum>
-  <w:abstractNum w:abstractNumId="1" w15:restartNumberingAfterBreak="0">
-    <w:nsid w:val="409A049C"/>
-    <w:multiLevelType w:val="hybridMultilevel"/>
-    <w:tmpl w:val="2C32EFE0"/>
-    <w:lvl w:ilvl="0" w:tplc="E77C2582">
-      <w:start w:val="1"/>
-      <w:numFmt w:val="bullet"/>
-      <w:lvlText w:val="•"/>
-      <w:lvlJc w:val="left"/>
-      <w:pPr>
-        <w:ind w:left="540" w:hanging="300"/>
-      </w:pPr>
-    </w:lvl>
-    <w:lvl w:ilvl="1" w:tplc="59BACCD6" w:tentative="1">
-      <w:start w:val="1"/>
-      <w:numFmt w:val="bullet"/>
-      <w:lvlText w:val="–"/>
-      <w:lvlJc w:val="left"/>
-      <w:pPr>
-        <w:ind w:left="940" w:hanging="300"/>
-      </w:pPr>
-    </w:lvl>
-    <w:lvl w:ilvl="2" w:tplc="B9E6294C" w:tentative="1">
-      <w:start w:val="1"/>
-      <w:numFmt w:val="bullet"/>
-      <w:lvlText w:val="◦"/>
-      <w:lvlJc w:val="left"/>
-      <w:pPr>
-        <w:ind w:left="1340" w:hanging="300"/>
-      </w:pPr>
-    </w:lvl>
-    <w:lvl w:ilvl="3" w:tplc="B3485C12">
-      <w:numFmt w:val="decimal"/>
-      <w:lvlText w:val=""/>
-      <w:lvlJc w:val="left"/>
-    </w:lvl>
-    <w:lvl w:ilvl="4" w:tplc="8CD415EC">
-      <w:numFmt w:val="decimal"/>
-      <w:lvlText w:val=""/>
-      <w:lvlJc w:val="left"/>
-    </w:lvl>
-    <w:lvl w:ilvl="5" w:tplc="756873EC">
-      <w:numFmt w:val="decimal"/>
-      <w:lvlText w:val=""/>
-      <w:lvlJc w:val="left"/>
-    </w:lvl>
-    <w:lvl w:ilvl="6" w:tplc="B1C68DA8">
-      <w:numFmt w:val="decimal"/>
-      <w:lvlText w:val=""/>
-      <w:lvlJc w:val="left"/>
-    </w:lvl>
-    <w:lvl w:ilvl="7" w:tplc="F126ED58">
-      <w:numFmt w:val="decimal"/>
-      <w:lvlText w:val=""/>
-      <w:lvlJc w:val="left"/>
-    </w:lvl>
-    <w:lvl w:ilvl="8" w:tplc="0EB8F6EC">
-      <w:numFmt w:val="decimal"/>
-      <w:lvlText w:val=""/>
-      <w:lvlJc w:val="left"/>
-    </w:lvl>
-  </w:abstractNum>
-  <w:abstractNum w:abstractNumId="2" w15:restartNumberingAfterBreak="0">
-    <w:nsid w:val="64BF3B57"/>
-    <w:multiLevelType w:val="hybridMultilevel"/>
-    <w:tmpl w:val="51BE5CBC"/>
-    <w:lvl w:ilvl="0" w:tplc="ED600CDC" w:tentative="1">
+    <w:tmpl w:val="076C36F2"/>
+    <w:lvl w:ilvl="0" w:tplc="72E2DFDC" w:tentative="1">
       <w:start w:val="1"/>
       <w:numFmt w:val="bullet"/>
       <w:lvlText w:val="●"/>
@@ -5770,7 +5711,7 @@
         <w:ind w:left="720" w:hanging="360"/>
       </w:pPr>
     </w:lvl>
-    <w:lvl w:ilvl="1" w:tplc="CCE89182" w:tentative="1">
+    <w:lvl w:ilvl="1" w:tplc="901AE11C" w:tentative="1">
       <w:start w:val="1"/>
       <w:numFmt w:val="bullet"/>
       <w:lvlText w:val="○"/>
@@ -5779,7 +5720,7 @@
         <w:ind w:left="1440" w:hanging="360"/>
       </w:pPr>
     </w:lvl>
-    <w:lvl w:ilvl="2" w:tplc="B27E1ABC" w:tentative="1">
+    <w:lvl w:ilvl="2" w:tplc="83B089F8" w:tentative="1">
       <w:start w:val="1"/>
       <w:numFmt w:val="bullet"/>
       <w:lvlText w:val="■"/>
@@ -5788,7 +5729,7 @@
         <w:ind w:left="2160" w:hanging="360"/>
       </w:pPr>
     </w:lvl>
-    <w:lvl w:ilvl="3" w:tplc="0B5AEDB2" w:tentative="1">
+    <w:lvl w:ilvl="3" w:tplc="717C32DA" w:tentative="1">
       <w:start w:val="1"/>
       <w:numFmt w:val="bullet"/>
       <w:lvlText w:val="●"/>
@@ -5797,7 +5738,7 @@
         <w:ind w:left="2880" w:hanging="360"/>
       </w:pPr>
     </w:lvl>
-    <w:lvl w:ilvl="4" w:tplc="779AE4A0" w:tentative="1">
+    <w:lvl w:ilvl="4" w:tplc="4CBE9E5A" w:tentative="1">
       <w:start w:val="1"/>
       <w:numFmt w:val="bullet"/>
       <w:lvlText w:val="○"/>
@@ -5806,7 +5747,7 @@
         <w:ind w:left="3600" w:hanging="360"/>
       </w:pPr>
     </w:lvl>
-    <w:lvl w:ilvl="5" w:tplc="74541814" w:tentative="1">
+    <w:lvl w:ilvl="5" w:tplc="884061A8" w:tentative="1">
       <w:start w:val="1"/>
       <w:numFmt w:val="bullet"/>
       <w:lvlText w:val="■"/>
@@ -5815,7 +5756,7 @@
         <w:ind w:left="4320" w:hanging="360"/>
       </w:pPr>
     </w:lvl>
-    <w:lvl w:ilvl="6" w:tplc="03E0E676" w:tentative="1">
+    <w:lvl w:ilvl="6" w:tplc="D5362594" w:tentative="1">
       <w:start w:val="1"/>
       <w:numFmt w:val="bullet"/>
       <w:lvlText w:val="●"/>
@@ -5824,7 +5765,7 @@
         <w:ind w:left="5040" w:hanging="360"/>
       </w:pPr>
     </w:lvl>
-    <w:lvl w:ilvl="7" w:tplc="E3668556" w:tentative="1">
+    <w:lvl w:ilvl="7" w:tplc="F3B059D6" w:tentative="1">
       <w:start w:val="1"/>
       <w:numFmt w:val="bullet"/>
       <w:lvlText w:val="●"/>
@@ -5833,7 +5774,7 @@
         <w:ind w:left="5760" w:hanging="360"/>
       </w:pPr>
     </w:lvl>
-    <w:lvl w:ilvl="8" w:tplc="BB8A440A" w:tentative="1">
+    <w:lvl w:ilvl="8" w:tplc="B9E8AEBC" w:tentative="1">
       <w:start w:val="1"/>
       <w:numFmt w:val="bullet"/>
       <w:lvlText w:val="●"/>
@@ -5843,14 +5784,138 @@
       </w:pPr>
     </w:lvl>
   </w:abstractNum>
+  <w:abstractNum w:abstractNumId="1" w15:restartNumberingAfterBreak="0">
+    <w:nsid w:val="4A5741F1"/>
+    <w:multiLevelType w:val="hybridMultilevel"/>
+    <w:tmpl w:val="08B2D0CE"/>
+    <w:lvl w:ilvl="0" w:tplc="FA8C624A" w:tentative="1">
+      <w:start w:val="1"/>
+      <w:numFmt w:val="decimal"/>
+      <w:lvlText w:val="%1."/>
+      <w:lvlJc w:val="left"/>
+      <w:pPr>
+        <w:ind w:left="540" w:hanging="300"/>
+      </w:pPr>
+    </w:lvl>
+    <w:lvl w:ilvl="1" w:tplc="04A6CBAE" w:tentative="1">
+      <w:start w:val="1"/>
+      <w:numFmt w:val="lowerLetter"/>
+      <w:lvlText w:val="%2."/>
+      <w:lvlJc w:val="left"/>
+      <w:pPr>
+        <w:ind w:left="940" w:hanging="300"/>
+      </w:pPr>
+    </w:lvl>
+    <w:lvl w:ilvl="2" w:tplc="7E783BE4" w:tentative="1">
+      <w:start w:val="1"/>
+      <w:numFmt w:val="lowerRoman"/>
+      <w:lvlText w:val="%3."/>
+      <w:lvlJc w:val="left"/>
+      <w:pPr>
+        <w:ind w:left="1340" w:hanging="300"/>
+      </w:pPr>
+    </w:lvl>
+    <w:lvl w:ilvl="3" w:tplc="19FE93A6">
+      <w:numFmt w:val="decimal"/>
+      <w:lvlText w:val=""/>
+      <w:lvlJc w:val="left"/>
+    </w:lvl>
+    <w:lvl w:ilvl="4" w:tplc="F342C9FA">
+      <w:numFmt w:val="decimal"/>
+      <w:lvlText w:val=""/>
+      <w:lvlJc w:val="left"/>
+    </w:lvl>
+    <w:lvl w:ilvl="5" w:tplc="FDC4EEE8">
+      <w:numFmt w:val="decimal"/>
+      <w:lvlText w:val=""/>
+      <w:lvlJc w:val="left"/>
+    </w:lvl>
+    <w:lvl w:ilvl="6" w:tplc="C616E63A">
+      <w:numFmt w:val="decimal"/>
+      <w:lvlText w:val=""/>
+      <w:lvlJc w:val="left"/>
+    </w:lvl>
+    <w:lvl w:ilvl="7" w:tplc="D7E644AE">
+      <w:numFmt w:val="decimal"/>
+      <w:lvlText w:val=""/>
+      <w:lvlJc w:val="left"/>
+    </w:lvl>
+    <w:lvl w:ilvl="8" w:tplc="4D869AB4">
+      <w:numFmt w:val="decimal"/>
+      <w:lvlText w:val=""/>
+      <w:lvlJc w:val="left"/>
+    </w:lvl>
+  </w:abstractNum>
+  <w:abstractNum w:abstractNumId="2" w15:restartNumberingAfterBreak="0">
+    <w:nsid w:val="7DE2274E"/>
+    <w:multiLevelType w:val="hybridMultilevel"/>
+    <w:tmpl w:val="18480242"/>
+    <w:lvl w:ilvl="0" w:tplc="F13E7D2C">
+      <w:start w:val="1"/>
+      <w:numFmt w:val="bullet"/>
+      <w:lvlText w:val="•"/>
+      <w:lvlJc w:val="left"/>
+      <w:pPr>
+        <w:ind w:left="540" w:hanging="300"/>
+      </w:pPr>
+    </w:lvl>
+    <w:lvl w:ilvl="1" w:tplc="9424933A" w:tentative="1">
+      <w:start w:val="1"/>
+      <w:numFmt w:val="bullet"/>
+      <w:lvlText w:val="–"/>
+      <w:lvlJc w:val="left"/>
+      <w:pPr>
+        <w:ind w:left="940" w:hanging="300"/>
+      </w:pPr>
+    </w:lvl>
+    <w:lvl w:ilvl="2" w:tplc="904896D2" w:tentative="1">
+      <w:start w:val="1"/>
+      <w:numFmt w:val="bullet"/>
+      <w:lvlText w:val="◦"/>
+      <w:lvlJc w:val="left"/>
+      <w:pPr>
+        <w:ind w:left="1340" w:hanging="300"/>
+      </w:pPr>
+    </w:lvl>
+    <w:lvl w:ilvl="3" w:tplc="84DA001E">
+      <w:numFmt w:val="decimal"/>
+      <w:lvlText w:val=""/>
+      <w:lvlJc w:val="left"/>
+    </w:lvl>
+    <w:lvl w:ilvl="4" w:tplc="D7DE0A98">
+      <w:numFmt w:val="decimal"/>
+      <w:lvlText w:val=""/>
+      <w:lvlJc w:val="left"/>
+    </w:lvl>
+    <w:lvl w:ilvl="5" w:tplc="E1D8DC5C">
+      <w:numFmt w:val="decimal"/>
+      <w:lvlText w:val=""/>
+      <w:lvlJc w:val="left"/>
+    </w:lvl>
+    <w:lvl w:ilvl="6" w:tplc="56325490">
+      <w:numFmt w:val="decimal"/>
+      <w:lvlText w:val=""/>
+      <w:lvlJc w:val="left"/>
+    </w:lvl>
+    <w:lvl w:ilvl="7" w:tplc="A78AE64A">
+      <w:numFmt w:val="decimal"/>
+      <w:lvlText w:val=""/>
+      <w:lvlJc w:val="left"/>
+    </w:lvl>
+    <w:lvl w:ilvl="8" w:tplc="3148FF8E">
+      <w:numFmt w:val="decimal"/>
+      <w:lvlText w:val=""/>
+      <w:lvlJc w:val="left"/>
+    </w:lvl>
+  </w:abstractNum>
   <w:num w:numId="1">
-    <w:abstractNumId w:val="2"/>
+    <w:abstractNumId w:val="0"/>
     <w:lvlOverride w:ilvl="0">
       <w:startOverride w:val="1"/>
     </w:lvlOverride>
   </w:num>
   <w:num w:numId="2">
-    <w:abstractNumId w:val="1"/>
+    <w:abstractNumId w:val="2"/>
     <w:lvlOverride w:ilvl="0">
       <w:startOverride w:val="1"/>
     </w:lvlOverride>
@@ -6479,7 +6544,7 @@
     <w:autoRedefine/>
     <w:uiPriority w:val="39"/>
     <w:unhideWhenUsed/>
-    <w:rsid w:val="00082705"/>
+    <w:rsid w:val="007078DF"/>
     <w:pPr>
       <w:spacing w:after="100"/>
     </w:pPr>

</xml_diff>